<commit_message>
v3.0 DOCX: Fix Arabic bracket flipping with Unicode LRM marks
- Added LRM (U+200F) before and after each parenthetical group
- Stops Word from flipping ( and ) in RTL mixed Arabic/English text
- Fix for: 'العجم (Ajam)' showing as 'العجم )Ajam('
- Also applies to all AI-generated Word docs with mixed content
</commit_message>
<xml_diff>
--- a/docx_output_v2/Sibelius-Semester1-Part1-Lessons-1-8.docx
+++ b/docx_output_v2/Sibelius-Semester1-Part1-Lessons-1-8.docx
@@ -752,7 +752,7 @@
                 <w:rFonts w:cs="Calibri"/>
                 <w:szCs w:val="18"/>
               </w:rPr>
-              <w:t>لا يوجد (غير مطلوب)</w:t>
+              <w:t>لا يوجد ‏(غير مطلوب)‏</w:t>
             </w:r>
           </w:p>
         </w:tc>
@@ -800,7 +800,7 @@
                 <w:rFonts w:cs="Calibri"/>
                 <w:szCs w:val="18"/>
               </w:rPr>
-              <w:t>لا يوجد (غير مطلوب)</w:t>
+              <w:t>لا يوجد ‏(غير مطلوب)‏</w:t>
             </w:r>
           </w:p>
         </w:tc>
@@ -856,7 +856,7 @@
           <w:rFonts w:cs="Calibri"/>
           <w:szCs w:val="22"/>
         </w:rPr>
-        <w:t>التعرف على المدرج الموسيقي (Staff) ومكوناته</w:t>
+        <w:t>التعرف على المدرج الموسيقي ‏(Staff)‏ ومكوناته</w:t>
       </w:r>
     </w:p>
     <w:p>
@@ -873,7 +873,7 @@
           <w:rFonts w:cs="Calibri"/>
           <w:szCs w:val="22"/>
         </w:rPr>
-        <w:t>التعرف على المفاتيح الموسيقية (Treble &amp; Bass Clef)</w:t>
+        <w:t>التعرف على المفاتيح الموسيقية ‏(Treble &amp; Bass Clef)‏</w:t>
       </w:r>
     </w:p>
     <w:p>
@@ -909,7 +909,7 @@
           <w:rFonts w:cs="Calibri"/>
           <w:szCs w:val="28"/>
         </w:rPr>
-        <w:t>1. النظري | Theory (10 min)</w:t>
+        <w:t>1. النظري | Theory ‏(10 min)‏</w:t>
       </w:r>
     </w:p>
     <w:p>
@@ -965,7 +965,7 @@
           <w:rFonts w:cs="Calibri"/>
           <w:szCs w:val="24"/>
         </w:rPr>
-        <w:t>المدرج الموسيقي (The Staff)</w:t>
+        <w:t>المدرج الموسيقي ‏(The Staff)‏</w:t>
       </w:r>
     </w:p>
     <w:p>
@@ -999,7 +999,7 @@
           <w:rFonts w:cs="Calibri"/>
           <w:szCs w:val="22"/>
         </w:rPr>
-        <w:t>• ترقيم الأسطر من الأسفل إلى الأعلى (1-5)</w:t>
+        <w:t>• ترقيم الأسطر من الأسفل إلى الأعلى ‏(1-5)‏</w:t>
       </w:r>
     </w:p>
     <w:p>
@@ -1035,7 +1035,7 @@
           <w:rFonts w:cs="Calibri"/>
           <w:szCs w:val="24"/>
         </w:rPr>
-        <w:t>المفاتيح الموسيقية (Clefs)</w:t>
+        <w:t>المفاتيح الموسيقية ‏(Clefs)‏</w:t>
       </w:r>
     </w:p>
     <w:p>
@@ -1052,7 +1052,7 @@
           <w:rFonts w:cs="Calibri"/>
           <w:szCs w:val="22"/>
         </w:rPr>
-        <w:t>• مفتاح صول (Treble Clef): يُستخدم للآلات عالية الطبقة (العود، الكمان، اليد اليمنى للبيانو)</w:t>
+        <w:t>• مفتاح صول ‏(Treble Clef)‏: يُستخدم للآلات عالية الطبقة ‏(العود، الكمان، اليد اليمنى للبيانو)‏</w:t>
       </w:r>
     </w:p>
     <w:p>
@@ -1069,7 +1069,7 @@
           <w:rFonts w:cs="Calibri"/>
           <w:szCs w:val="22"/>
         </w:rPr>
-        <w:t>• مفتاح فا (Bass Clef): يُستخدم للآلات منخفضة الطبقة</w:t>
+        <w:t>• مفتاح فا ‏(Bass Clef)‏: يُستخدم للآلات منخفضة الطبقة</w:t>
       </w:r>
     </w:p>
     <w:p>
@@ -1105,7 +1105,7 @@
           <w:rFonts w:cs="Calibri"/>
           <w:szCs w:val="22"/>
         </w:rPr>
-        <w:t>• Do – Re – Mi – Fa – Sol – La – Si (Fixed Solfege)</w:t>
+        <w:t>• Do – Re – Mi – Fa – Sol – La – Si ‏(Fixed Solfege)‏</w:t>
       </w:r>
     </w:p>
     <w:p>
@@ -1141,7 +1141,7 @@
           <w:rFonts w:cs="Calibri"/>
           <w:szCs w:val="28"/>
         </w:rPr>
-        <w:t>2. التطبيق العملي | Practice (30 min)</w:t>
+        <w:t>2. التطبيق العملي | Practice ‏(30 min)‏</w:t>
       </w:r>
     </w:p>
     <w:p>
@@ -1160,7 +1160,7 @@
           <w:rFonts w:cs="Calibri"/>
           <w:szCs w:val="24"/>
         </w:rPr>
-        <w:t>تمرين 1: فتح Sibelius (5 دقائق)</w:t>
+        <w:t>تمرين 1: فتح Sibelius ‏(5 دقائق)‏</w:t>
       </w:r>
     </w:p>
     <w:p>
@@ -1194,7 +1194,7 @@
           <w:rFonts w:cs="Calibri"/>
           <w:szCs w:val="22"/>
         </w:rPr>
-        <w:t>اختر Blank Score (نوتة فارغة)</w:t>
+        <w:t>اختر Blank Score ‏(نوتة فارغة)‏</w:t>
       </w:r>
     </w:p>
     <w:p>
@@ -1281,7 +1281,7 @@
           <w:rFonts w:cs="Calibri"/>
           <w:szCs w:val="24"/>
         </w:rPr>
-        <w:t>تمرين 2: التعرف على واجهة Sibelius (10 دقائق)</w:t>
+        <w:t>تمرين 2: التعرف على واجهة Sibelius ‏(10 دقائق)‏</w:t>
       </w:r>
     </w:p>
     <w:p>
@@ -1303,13 +1303,13 @@
         <w:br/>
         <w:t>- Title Bar: اسم الملف</w:t>
         <w:br/>
-        <w:t>- Ribbon: شريط الأدوات العلوي (Tabs: Home, Note Input, Notations, Text, Layout)</w:t>
+        <w:t>- Ribbon: شريط الأدوات العلوي ‏(Tabs: Home, Note Input, Notations, Text, Layout)‏</w:t>
         <w:br/>
         <w:t>- Score Area: منطقة النوتة</w:t>
         <w:br/>
-        <w:t>- Keypad: لوحة المفاتيح الموسيقية (F9 أو Ctrl+Alt+K)</w:t>
+        <w:t>- Keypad: لوحة المفاتيح الموسيقية ‏(F9 أو Ctrl+Alt+K)‏</w:t>
         <w:br/>
-        <w:t>- Transport Bar: شريط التشغيل (Space للمعاينة)</w:t>
+        <w:t>- Transport Bar: شريط التشغيل ‏(Space للمعاينة)‏</w:t>
         <w:br/>
         <w:t>- Status Bar: شريط الحالة في الأسفل</w:t>
       </w:r>
@@ -1330,7 +1330,7 @@
           <w:rFonts w:cs="Calibri"/>
           <w:szCs w:val="24"/>
         </w:rPr>
-        <w:t>تمرين 3: كتابة أول نوتة (10 دقائق)</w:t>
+        <w:t>تمرين 3: كتابة أول نوتة ‏(10 دقائق)‏</w:t>
       </w:r>
     </w:p>
     <w:p>
@@ -1364,7 +1364,7 @@
           <w:rFonts w:cs="Calibri"/>
           <w:szCs w:val="22"/>
         </w:rPr>
-        <w:t>اختر Noire (Quarter Note) من Keypad</w:t>
+        <w:t>اختر Noire ‏(Quarter Note)‏ من Keypad</w:t>
       </w:r>
     </w:p>
     <w:p>
@@ -1381,7 +1381,7 @@
           <w:rFonts w:cs="Calibri"/>
           <w:szCs w:val="22"/>
         </w:rPr>
-        <w:t>ضع النوتة على السطر الثاني (Sol)</w:t>
+        <w:t>ضع النوتة على السطر الثاني ‏(Sol)‏</w:t>
       </w:r>
     </w:p>
     <w:p>
@@ -1451,7 +1451,7 @@
           <w:rFonts w:cs="Calibri"/>
           <w:szCs w:val="24"/>
         </w:rPr>
-        <w:t>تمرين 4: إضافة مفتاح صول (5 دقائق)</w:t>
+        <w:t>تمرين 4: إضافة مفتاح صول ‏(5 دقائق)‏</w:t>
       </w:r>
     </w:p>
     <w:p>
@@ -1521,7 +1521,7 @@
           <w:rFonts w:cs="Calibri"/>
           <w:szCs w:val="28"/>
         </w:rPr>
-        <w:t>3. اختصارات Sibelius (5 min)</w:t>
+        <w:t>3. اختصارات Sibelius ‏(5 min)‏</w:t>
       </w:r>
     </w:p>
     <w:tbl>
@@ -2145,7 +2145,7 @@
           <w:rFonts w:cs="Calibri"/>
           <w:szCs w:val="28"/>
         </w:rPr>
-        <w:t>4. مراجعة وواجب | Review &amp; HW (5 min)</w:t>
+        <w:t>4. مراجعة وواجب | Review &amp; HW ‏(5 min)‏</w:t>
       </w:r>
     </w:p>
     <w:p>
@@ -2251,7 +2251,7 @@
           <w:rFonts w:cs="Calibri"/>
           <w:szCs w:val="22"/>
         </w:rPr>
-        <w:t>افتح Sibelius وأنشئ نوتة جديدة (Treble Clef, 4/4)</w:t>
+        <w:t>افتح Sibelius وأنشئ نوتة جديدة ‏(Treble Clef, 4/4)‏</w:t>
       </w:r>
     </w:p>
     <w:p>
@@ -2268,7 +2268,7 @@
           <w:rFonts w:cs="Calibri"/>
           <w:szCs w:val="22"/>
         </w:rPr>
-        <w:t>اكتب سلم Do الكبير (Do-Re-Mi-Fa-Sol-La-Si-Do) باستخدام Noire (Quarter Notes)</w:t>
+        <w:t>اكتب سلم Do الكبير ‏(Do-Re-Mi-Fa-Sol-La-Si-Do)‏ باستخدام Noire ‏(Quarter Notes)‏</w:t>
       </w:r>
     </w:p>
     <w:p>
@@ -3679,7 +3679,7 @@
                 <w:rFonts w:cs="Calibri"/>
                 <w:szCs w:val="18"/>
               </w:rPr>
-              <w:t>لا يوجد (تمهيدي)</w:t>
+              <w:t>لا يوجد ‏(تمهيدي)‏</w:t>
             </w:r>
           </w:p>
         </w:tc>
@@ -3727,7 +3727,7 @@
                 <w:rFonts w:cs="Calibri"/>
                 <w:szCs w:val="18"/>
               </w:rPr>
-              <w:t>4/4 (أساسي)</w:t>
+              <w:t>4/4 ‏(أساسي)‏</w:t>
             </w:r>
           </w:p>
         </w:tc>
@@ -3766,7 +3766,7 @@
           <w:rFonts w:cs="Calibri"/>
           <w:szCs w:val="22"/>
         </w:rPr>
-        <w:t>التعرف على قيم النوتات الأساسية (Ronde, Blanche, Noire, Croche)</w:t>
+        <w:t>التعرف على قيم النوتات الأساسية ‏(Ronde, Blanche, Noire, Croche)‏</w:t>
       </w:r>
     </w:p>
     <w:p>
@@ -3836,7 +3836,7 @@
           <w:rFonts w:cs="Calibri"/>
           <w:szCs w:val="28"/>
         </w:rPr>
-        <w:t>1. النظري | Theory (10 min)</w:t>
+        <w:t>1. النظري | Theory ‏(10 min)‏</w:t>
       </w:r>
     </w:p>
     <w:p>
@@ -3855,7 +3855,7 @@
           <w:rFonts w:cs="Calibri"/>
           <w:szCs w:val="24"/>
         </w:rPr>
-        <w:t>قيم النوتات (Note Values)</w:t>
+        <w:t>قيم النوتات ‏(Note Values)‏</w:t>
       </w:r>
     </w:p>
     <w:tbl>
@@ -4506,7 +4506,7 @@
           <w:rFonts w:cs="Calibri"/>
           <w:szCs w:val="24"/>
         </w:rPr>
-        <w:t>الميزان 4/4 (Time Signature)</w:t>
+        <w:t>الميزان 4/4 ‏(Time Signature)‏</w:t>
       </w:r>
     </w:p>
     <w:p>
@@ -4523,7 +4523,7 @@
           <w:rFonts w:cs="Calibri"/>
           <w:szCs w:val="22"/>
         </w:rPr>
-        <w:t>• الرقم العلوي (4): عدد الدقات في كل مازورة (4 دقات)</w:t>
+        <w:t>• الرقم العلوي ‏(4)‏: عدد الدقات في كل مازورة ‏(4 دقات)‏</w:t>
       </w:r>
     </w:p>
     <w:p>
@@ -4540,7 +4540,7 @@
           <w:rFonts w:cs="Calibri"/>
           <w:szCs w:val="22"/>
         </w:rPr>
-        <w:t>• الرقم السفلي (4): النوار (Quarter Note) تأخذ دقة واحدة</w:t>
+        <w:t>• الرقم السفلي ‏(4)‏: النوار ‏(Quarter Note)‏ تأخذ دقة واحدة</w:t>
       </w:r>
     </w:p>
     <w:p>
@@ -4557,7 +4557,7 @@
           <w:rFonts w:cs="Calibri"/>
           <w:szCs w:val="22"/>
         </w:rPr>
-        <w:t>• المازورة (Bar/Measure): وحدة الزمن في المقطوعة</w:t>
+        <w:t>• المازورة ‏(Bar/Measure)‏: وحدة الزمن في المقطوعة</w:t>
       </w:r>
     </w:p>
     <w:p>
@@ -4646,7 +4646,7 @@
           <w:rFonts w:cs="Calibri"/>
           <w:szCs w:val="28"/>
         </w:rPr>
-        <w:t>2. التطبيق العملي | Practice (30 min)</w:t>
+        <w:t>2. التطبيق العملي | Practice ‏(30 min)‏</w:t>
       </w:r>
     </w:p>
     <w:p>
@@ -4665,7 +4665,7 @@
           <w:rFonts w:cs="Calibri"/>
           <w:szCs w:val="24"/>
         </w:rPr>
-        <w:t>تمرين 1: إدخال نوتات بقيم مختلفة (10 دقائق)</w:t>
+        <w:t>تمرين 1: إدخال نوتات بقيم مختلفة ‏(10 دقائق)‏</w:t>
       </w:r>
     </w:p>
     <w:p>
@@ -4716,7 +4716,7 @@
           <w:rFonts w:cs="Calibri"/>
           <w:szCs w:val="22"/>
         </w:rPr>
-        <w:t>استخدم Keypad (F9) لاختيار القيم:</w:t>
+        <w:t>استخدم Keypad ‏(F9)‏ لاختيار القيم:</w:t>
       </w:r>
     </w:p>
     <w:p>
@@ -4851,7 +4851,7 @@
                 <w:rFonts w:cs="Calibri"/>
                 <w:szCs w:val="18"/>
               </w:rPr>
-              <w:t>Do (Noire)</w:t>
+              <w:t>Do ‏(Noire)‏</w:t>
             </w:r>
           </w:p>
         </w:tc>
@@ -4877,7 +4877,7 @@
                 <w:rFonts w:cs="Calibri"/>
                 <w:szCs w:val="18"/>
               </w:rPr>
-              <w:t>Do (Noire)</w:t>
+              <w:t>Do ‏(Noire)‏</w:t>
             </w:r>
           </w:p>
         </w:tc>
@@ -4903,7 +4903,7 @@
                 <w:rFonts w:cs="Calibri"/>
                 <w:szCs w:val="18"/>
               </w:rPr>
-              <w:t>Do (Noire)</w:t>
+              <w:t>Do ‏(Noire)‏</w:t>
             </w:r>
           </w:p>
         </w:tc>
@@ -4929,7 +4929,7 @@
                 <w:rFonts w:cs="Calibri"/>
                 <w:szCs w:val="18"/>
               </w:rPr>
-              <w:t>Do (Noire)</w:t>
+              <w:t>Do ‏(Noire)‏</w:t>
             </w:r>
           </w:p>
         </w:tc>
@@ -4980,7 +4980,7 @@
                 <w:rFonts w:cs="Calibri"/>
                 <w:szCs w:val="18"/>
               </w:rPr>
-              <w:t>Mi (Blanche)</w:t>
+              <w:t>Mi ‏(Blanche)‏</w:t>
             </w:r>
           </w:p>
         </w:tc>
@@ -5003,7 +5003,7 @@
                 <w:rFonts w:cs="Calibri"/>
                 <w:szCs w:val="18"/>
               </w:rPr>
-              <w:t>Mi (Blanche)</w:t>
+              <w:t>Mi ‏(Blanche)‏</w:t>
             </w:r>
           </w:p>
         </w:tc>
@@ -5064,7 +5064,7 @@
                 <w:rFonts w:cs="Calibri"/>
                 <w:szCs w:val="18"/>
               </w:rPr>
-              <w:t>Sol (Ronde)</w:t>
+              <w:t>Sol ‏(Ronde)‏</w:t>
             </w:r>
           </w:p>
         </w:tc>
@@ -5129,25 +5129,25 @@
           <w:szCs w:val="18"/>
         </w:rPr>
         <w:br/>
-        <w:t>#### تمرين 2: أنماط إيقاعية بسيطة (10 دقائق)</w:t>
+        <w:t>#### تمرين 2: أنماط إيقاعية بسيطة ‏(10 دقائق)‏</w:t>
         <w:br/>
         <w:t>اكتب الأنماط التالية في 4/4:</w:t>
         <w:br/>
         <w:br/>
-        <w:t>النمط 1: Do Do Do Do (كلها Noire)</w:t>
+        <w:t>النمط 1: Do Do Do Do ‏(كلها Noire)‏</w:t>
         <w:br/>
-        <w:t>النمط 2: Do (Blanche) – Mi (Noire) – Sol (Noire)</w:t>
+        <w:t>النمط 2: Do ‏(Blanche)‏ – Mi ‏(Noire)‏ – Sol ‏(Noire)‏</w:t>
         <w:br/>
-        <w:t>النمط 3: Do – Do – Mi – Mi – Sol – Sol – Sol – Sol (كلها Croche)</w:t>
+        <w:t>النمط 3: Do – Do – Mi – Mi – Sol – Sol – Sol – Sol ‏(كلها Croche)‏</w:t>
         <w:br/>
         <w:br/>
-        <w:t>#### تمرين 3: استخدام Croche (Eighth Notes) (10 دقائق)</w:t>
+        <w:t>#### تمرين 3: استخدام Croche ‏(Eighth Notes)‏ ‏(10 دقائق)‏</w:t>
         <w:br/>
         <w:t>1. اختر Croche من Keypad</w:t>
         <w:br/>
         <w:t>2. اكتب 8 نوتات Croche في مازورة 4/4: Do Re Mi Fa Sol La Si Do</w:t>
         <w:br/>
-        <w:t>3. لاحظ كيف يتصل زوجان من Croche بقوس (Beam)</w:t>
+        <w:t>3. لاحظ كيف يتصل زوجان من Croche بقوس ‏(Beam)‏</w:t>
         <w:br/>
         <w:t>4. استمع وشاهد كيف تختلف عن Noire</w:t>
         <w:br/>
@@ -5155,7 +5155,7 @@
         <w:t>---</w:t>
         <w:br/>
         <w:br/>
-        <w:t>### 3. اختصارات Sibelius (5 min)</w:t>
+        <w:t>### 3. اختصارات Sibelius ‏(5 min)‏</w:t>
         <w:br/>
         <w:br/>
         <w:t>| # | الاختصار | الوظيفة | Function |</w:t>
@@ -5179,7 +5179,7 @@
         <w:t>---</w:t>
         <w:br/>
         <w:br/>
-        <w:t>### 4. مراجعة وواجب | Review &amp; HW (5 min)</w:t>
+        <w:t>### 4. مراجعة وواجب | Review &amp; HW ‏(5 min)‏</w:t>
         <w:br/>
         <w:br/>
         <w:t>#### أسئلة المراجعة</w:t>
@@ -5193,17 +5193,17 @@
         <w:br/>
         <w:t>#### الواجب المنزلي</w:t>
         <w:br/>
-        <w:t>1. أنشئ نوتة جديدة في Sibelius (Treble Clef, 4/4)</w:t>
+        <w:t>1. أنشئ نوتة جديدة في Sibelius ‏(Treble Clef, 4/4)‏</w:t>
         <w:br/>
         <w:t>2. اكتب 4 مازورات تحتوي كل منها على:</w:t>
         <w:br/>
-        <w:t xml:space="preserve">   - المازورة 1: 4 Noire (Do Re Mi Fa)</w:t>
+        <w:t xml:space="preserve">   - المازورة 1: 4 Noire ‏(Do Re Mi Fa)‏</w:t>
         <w:br/>
-        <w:t xml:space="preserve">   - المازورة 2: 2 Blanche (Sol La)</w:t>
+        <w:t xml:space="preserve">   - المازورة 2: 2 Blanche ‏(Sol La)‏</w:t>
         <w:br/>
-        <w:t xml:space="preserve">   - المازورة 3: 1 Ronde (Si)</w:t>
+        <w:t xml:space="preserve">   - المازورة 3: 1 Ronde ‏(Si)‏</w:t>
         <w:br/>
-        <w:t xml:space="preserve">   - المازورة 4: 8 Croche (Do Do Re Re Mi Mi Fa Fa)</w:t>
+        <w:t xml:space="preserve">   - المازورة 4: 8 Croche ‏(Do Do Re Re Mi Mi Fa Fa)‏</w:t>
         <w:br/>
         <w:t>3. احفظ الملف باسم `Lesson2_Rhythms.sib`</w:t>
         <w:br/>
@@ -5215,9 +5215,9 @@
         <w:br/>
         <w:t>### 5. تطبيق العود | Oud Application</w:t>
         <w:br/>
-        <w:t>- تمرين: اعزف سلم Do الكبير باستخدام Blanche (كل نوتة مدتها دقتان):</w:t>
+        <w:t>- تمرين: اعزف سلم Do الكبير باستخدام Blanche ‏(كل نوتة مدتها دقتان)‏:</w:t>
         <w:br/>
-        <w:t xml:space="preserve">  - Do (دقتان) – Re (دقتان) – Mi – Fa – Sol – La – Si – Do</w:t>
+        <w:t xml:space="preserve">  - Do ‏(دقتان)‏ – Re ‏(دقتان)‏ – Mi – Fa – Sol – La – Si – Do</w:t>
         <w:br/>
         <w:t>- ركز على تساوي مدة كل نوتة</w:t>
         <w:br/>
@@ -5280,7 +5280,7 @@
         <w:br/>
         <w:t>- اشرح أن Croche تسمى "ثمن" لأن 8 منها تساوي Ronde</w:t>
         <w:br/>
-        <w:t>- تذكر استخدام المصطلحات الفرنسية (Ronde, Blanche, Noire, Croche) لأنها المعتمدة في المنهاج</w:t>
+        <w:t>- تذكر استخدام المصطلحات الفرنسية ‏(Ronde, Blanche, Noire, Croche)‏ لأنها المعتمدة في المنهاج</w:t>
         <w:br/>
       </w:r>
     </w:p>
@@ -5324,7 +5324,7 @@
           <w:rFonts w:cs="Calibri"/>
           <w:szCs w:val="36"/>
         </w:rPr>
-        <w:t>السكتات (Rests) وخطوط المازورة</w:t>
+        <w:t>السكتات ‏(Rests)‏ وخطوط المازورة</w:t>
       </w:r>
     </w:p>
     <w:p>
@@ -5628,7 +5628,7 @@
                 <w:rFonts w:cs="Calibri"/>
                 <w:szCs w:val="18"/>
               </w:rPr>
-              <w:t>لا يوجد (تمهيدي)</w:t>
+              <w:t>لا يوجد ‏(تمهيدي)‏</w:t>
             </w:r>
           </w:p>
         </w:tc>
@@ -5715,7 +5715,7 @@
           <w:rFonts w:cs="Calibri"/>
           <w:szCs w:val="22"/>
         </w:rPr>
-        <w:t>التعرف على رموز السكتات (Rests) وقيمها</w:t>
+        <w:t>التعرف على رموز السكتات ‏(Rests)‏ وقيمها</w:t>
       </w:r>
     </w:p>
     <w:p>
@@ -5766,7 +5766,7 @@
           <w:rFonts w:cs="Calibri"/>
           <w:szCs w:val="22"/>
         </w:rPr>
-        <w:t>تغيير الميزان (Time Signature)</w:t>
+        <w:t>تغيير الميزان ‏(Time Signature)‏</w:t>
       </w:r>
     </w:p>
     <w:p>
@@ -5785,7 +5785,7 @@
           <w:rFonts w:cs="Calibri"/>
           <w:szCs w:val="28"/>
         </w:rPr>
-        <w:t>1. النظري | Theory (10 min)</w:t>
+        <w:t>1. النظري | Theory ‏(10 min)‏</w:t>
       </w:r>
     </w:p>
     <w:p>
@@ -5804,7 +5804,7 @@
           <w:rFonts w:cs="Calibri"/>
           <w:szCs w:val="24"/>
         </w:rPr>
-        <w:t>السكتات (Rests)</w:t>
+        <w:t>السكتات ‏(Rests)‏</w:t>
       </w:r>
     </w:p>
     <w:p>
@@ -5822,7 +5822,7 @@
           <w:rFonts w:cs="Calibri"/>
           <w:szCs w:val="22"/>
         </w:rPr>
-        <w:t>السكتة (Rest) هي فترة صمت في الموسيقى. لكل قيمة نوتة هناك سكتة مقابلة:</w:t>
+        <w:t>السكتة ‏(Rest)‏ هي فترة صمت في الموسيقى. لكل قيمة نوتة هناك سكتة مقابلة:</w:t>
       </w:r>
     </w:p>
     <w:tbl>
@@ -6040,7 +6040,7 @@
                 <w:rFonts w:cs="Calibri"/>
                 <w:szCs w:val="18"/>
               </w:rPr>
-              <w:t>▬ (تحت السطر الرابع)</w:t>
+              <w:t>▬ ‏(تحت السطر الرابع)‏</w:t>
             </w:r>
           </w:p>
         </w:tc>
@@ -6138,7 +6138,7 @@
                 <w:rFonts w:cs="Calibri"/>
                 <w:szCs w:val="18"/>
               </w:rPr>
-              <w:t>▬ (فوق السطر الثالث)</w:t>
+              <w:t>▬ ‏(فوق السطر الثالث)‏</w:t>
             </w:r>
           </w:p>
         </w:tc>
@@ -6352,7 +6352,7 @@
           <w:rFonts w:cs="Calibri"/>
           <w:szCs w:val="24"/>
         </w:rPr>
-        <w:t>خطوط المازورة (Bar Lines)</w:t>
+        <w:t>خطوط المازورة ‏(Bar Lines)‏</w:t>
       </w:r>
     </w:p>
     <w:tbl>
@@ -6596,7 +6596,7 @@
                 <w:rFonts w:cs="Calibri"/>
                 <w:szCs w:val="18"/>
               </w:rPr>
-              <w:t>نهاية مقطع (Section)</w:t>
+              <w:t>نهاية مقطع ‏(Section)‏</w:t>
             </w:r>
           </w:p>
         </w:tc>
@@ -6975,7 +6975,7 @@
           <w:rFonts w:cs="Calibri"/>
           <w:szCs w:val="24"/>
         </w:rPr>
-        <w:t>الميزان 3/4 (Triple Meter)</w:t>
+        <w:t>الميزان 3/4 ‏(Triple Meter)‏</w:t>
       </w:r>
     </w:p>
     <w:p>
@@ -7009,7 +7009,7 @@
           <w:rFonts w:cs="Calibri"/>
           <w:szCs w:val="22"/>
         </w:rPr>
-        <w:t>• النوار (Quarter Note) = دقة واحدة</w:t>
+        <w:t>• النوار ‏(Quarter Note)‏ = دقة واحدة</w:t>
       </w:r>
     </w:p>
     <w:p>
@@ -7045,7 +7045,7 @@
           <w:rFonts w:cs="Calibri"/>
           <w:szCs w:val="28"/>
         </w:rPr>
-        <w:t>2. التطبيق العملي | Practice (30 min)</w:t>
+        <w:t>2. التطبيق العملي | Practice ‏(30 min)‏</w:t>
       </w:r>
     </w:p>
     <w:p>
@@ -7064,7 +7064,7 @@
           <w:rFonts w:cs="Calibri"/>
           <w:szCs w:val="24"/>
         </w:rPr>
-        <w:t>تمرين 1: إدخال السكتات (10 دقائق)</w:t>
+        <w:t>تمرين 1: إدخال السكتات ‏(10 دقائق)‏</w:t>
       </w:r>
     </w:p>
     <w:p>
@@ -7098,7 +7098,7 @@
           <w:rFonts w:cs="Calibri"/>
           <w:szCs w:val="22"/>
         </w:rPr>
-        <w:t>اضغط N → اختر Noire Rest من Keypad (زر 0)</w:t>
+        <w:t>اضغط N → اختر Noire Rest من Keypad ‏(زر 0)‏</w:t>
       </w:r>
     </w:p>
     <w:p>
@@ -7134,9 +7134,9 @@
           <w:rFonts w:cs="Calibri"/>
           <w:szCs w:val="18"/>
         </w:rPr>
-        <w:t>| Do  (Noire) |  (Noire Rest) | Mi  (Noire) |  (Noire Rest) |</w:t>
+        <w:t>| Do  ‏(Noire)‏ |  ‏(Noire Rest)‏ | Mi  ‏(Noire)‏ |  ‏(Noire Rest)‏ |</w:t>
         <w:br/>
-        <w:t>| Sol (Noire) |  (Noire Rest) | Do  (Noire) |  (Noire Rest) |</w:t>
+        <w:t>| Sol ‏(Noire)‏ |  ‏(Noire Rest)‏ | Do  ‏(Noire)‏ |  ‏(Noire Rest)‏ |</w:t>
       </w:r>
     </w:p>
     <w:p>
@@ -7173,7 +7173,7 @@
         </w:rPr>
         <w:t>كيفية إدخال السكتة:</w:t>
         <w:br/>
-        <w:t>- في Note Input Mode: اختر القيمة من Keypad ثم اضغط 0 (Zero) للسكتة</w:t>
+        <w:t>- في Note Input Mode: اختر القيمة من Keypad ثم اضغط 0 ‏(Zero)‏ للسكتة</w:t>
         <w:br/>
         <w:t>- أو: اختر القيمة ثم اضغط Ctrl+Shift+[قيمة]</w:t>
       </w:r>
@@ -7194,7 +7194,7 @@
           <w:rFonts w:cs="Calibri"/>
           <w:szCs w:val="24"/>
         </w:rPr>
-        <w:t>تمرين 2: جميع السكتات (10 دقائق)</w:t>
+        <w:t>تمرين 2: جميع السكتات ‏(10 دقائق)‏</w:t>
       </w:r>
     </w:p>
     <w:p>
@@ -7260,7 +7260,7 @@
                 <w:rFonts w:cs="Calibri"/>
                 <w:szCs w:val="18"/>
               </w:rPr>
-              <w:t>Do (Noire)</w:t>
+              <w:t>Do ‏(Noire)‏</w:t>
             </w:r>
           </w:p>
         </w:tc>
@@ -7286,7 +7286,7 @@
                 <w:rFonts w:cs="Calibri"/>
                 <w:szCs w:val="18"/>
               </w:rPr>
-              <w:t>(Croche Rest)</w:t>
+              <w:t>‏(Croche Rest)‏</w:t>
             </w:r>
           </w:p>
         </w:tc>
@@ -7312,7 +7312,7 @@
                 <w:rFonts w:cs="Calibri"/>
                 <w:szCs w:val="18"/>
               </w:rPr>
-              <w:t>(Croche Rest)</w:t>
+              <w:t>‏(Croche Rest)‏</w:t>
             </w:r>
           </w:p>
         </w:tc>
@@ -7338,7 +7338,7 @@
                 <w:rFonts w:cs="Calibri"/>
                 <w:szCs w:val="18"/>
               </w:rPr>
-              <w:t>Mi (Noire)</w:t>
+              <w:t>Mi ‏(Noire)‏</w:t>
             </w:r>
           </w:p>
         </w:tc>
@@ -7363,7 +7363,7 @@
                 <w:rFonts w:cs="Calibri"/>
                 <w:szCs w:val="18"/>
               </w:rPr>
-              <w:t>Sol (Blanche)</w:t>
+              <w:t>Sol ‏(Blanche)‏</w:t>
             </w:r>
           </w:p>
         </w:tc>
@@ -7386,7 +7386,7 @@
                 <w:rFonts w:cs="Calibri"/>
                 <w:szCs w:val="18"/>
               </w:rPr>
-              <w:t>Do (Noire)</w:t>
+              <w:t>Do ‏(Noire)‏</w:t>
             </w:r>
           </w:p>
         </w:tc>
@@ -7409,7 +7409,7 @@
                 <w:rFonts w:cs="Calibri"/>
                 <w:szCs w:val="18"/>
               </w:rPr>
-              <w:t>(Noire Rest)</w:t>
+              <w:t>‏(Noire Rest)‏</w:t>
             </w:r>
           </w:p>
         </w:tc>
@@ -7437,14 +7437,14 @@
           <w:rFonts w:cs="Calibri"/>
           <w:szCs w:val="18"/>
         </w:rPr>
-        <w:t>أو استخدم: مازورة 4/4 مع سكتة Ronde (Whole Rest):</w:t>
+        <w:t>أو استخدم: مازورة 4/4 مع سكتة Ronde ‏(Whole Rest)‏:</w:t>
         <w:br/>
         <w:t>- اضغط Ctrl+Shift+R لإدخال Ronde Rest</w:t>
         <w:br/>
         <w:br/>
-        <w:t>#### تمرين 3: الميزان 3/4 (10 دقائق)</w:t>
+        <w:t>#### تمرين 3: الميزان 3/4 ‏(10 دقائق)‏</w:t>
         <w:br/>
-        <w:t>1. اختر Tab: Notations → Time Signature (أو اسحب من Gallery)</w:t>
+        <w:t>1. اختر Tab: Notations → Time Signature ‏(أو اسحب من Gallery)‏</w:t>
         <w:br/>
         <w:t>2. اختر 3/4</w:t>
         <w:br/>
@@ -7466,7 +7466,7 @@
           <w:rFonts w:cs="Calibri"/>
           <w:szCs w:val="22"/>
         </w:rPr>
-        <w:t>(كلها Noire)</w:t>
+        <w:t>‏(كلها Noire)‏</w:t>
       </w:r>
     </w:p>
     <w:p>
@@ -7485,10 +7485,10 @@
           <w:rFonts w:cs="Calibri"/>
           <w:szCs w:val="18"/>
         </w:rPr>
-        <w:t>4. استمع (لاحظ الإحساس 1-2-3, 1-2-3)</w:t>
+        <w:t>4. استمع ‏(لاحظ الإحساس 1-2-3, 1-2-3)‏</w:t>
         <w:br/>
         <w:br/>
-        <w:t>#### تمرين إضافي: خط المكرر (Repeat)</w:t>
+        <w:t>#### تمرين إضافي: خط المكرر ‏(Repeat)‏</w:t>
         <w:br/>
         <w:t>1. ضع خط تكرار في البداية: اختر Repeat Barline من Notations → Barline</w:t>
         <w:br/>
@@ -7498,16 +7498,16 @@
         <w:t>---</w:t>
         <w:br/>
         <w:br/>
-        <w:t>### 3. اختصارات Sibelius (5 min)</w:t>
+        <w:t>### 3. اختصارات Sibelius ‏(5 min)‏</w:t>
         <w:br/>
         <w:br/>
         <w:t>| # | الاختصار | الوظيفة | Function |</w:t>
         <w:br/>
         <w:t>|---|----------|---------|----------|</w:t>
         <w:br/>
-        <w:t>| 1 | 0 (Zero) | إدخال سكتة بنفس القيمة | Enter Rest |</w:t>
+        <w:t>| 1 | 0 ‏(Zero)‏ | إدخال سكتة بنفس القيمة | Enter Rest |</w:t>
         <w:br/>
-        <w:t>| 2 | Ctrl+Shift+R | إدخال Ronde Rest (مازورة كاملة) | Whole Bar Rest |</w:t>
+        <w:t>| 2 | Ctrl+Shift+R | إدخال Ronde Rest ‏(مازورة كاملة)‏ | Whole Bar Rest |</w:t>
         <w:br/>
         <w:t>| 3 | T | إظهار شريط النص/التيمبو | Text / Tempo |</w:t>
         <w:br/>
@@ -7519,7 +7519,7 @@
         <w:t>---</w:t>
         <w:br/>
         <w:br/>
-        <w:t>### 4. مراجعة وواجب | Review &amp; HW (5 min)</w:t>
+        <w:t>### 4. مراجعة وواجب | Review &amp; HW ‏(5 min)‏</w:t>
         <w:br/>
         <w:br/>
         <w:t>#### أسئلة المراجعة</w:t>
@@ -7533,17 +7533,17 @@
         <w:br/>
         <w:t>#### الواجب المنزلي</w:t>
         <w:br/>
-        <w:t>1. أنشئ نوتة جديدة في 3/4 (Treble Clef)</w:t>
+        <w:t>1. أنشئ نوتة جديدة في 3/4 ‏(Treble Clef)‏</w:t>
         <w:br/>
         <w:t>2. اكتب 4 مازورات بمزج النوتات والسكتات:</w:t>
         <w:br/>
-        <w:t xml:space="preserve">   - مازورة 1: Do - (Croche Rest) - Mi - (Croche Rest) - Sol</w:t>
+        <w:t xml:space="preserve">   - مازورة 1: Do - ‏(Croche Rest)‏ - Mi - ‏(Croche Rest)‏ - Sol</w:t>
         <w:br/>
-        <w:t xml:space="preserve">   - مازورة 2: Fa (Blanche) - (Noire Rest)</w:t>
+        <w:t xml:space="preserve">   - مازورة 2: Fa ‏(Blanche)‏ - ‏(Noire Rest)‏</w:t>
         <w:br/>
-        <w:t xml:space="preserve">   - مازورة 3: La - Si - Do (كلها Noire)</w:t>
+        <w:t xml:space="preserve">   - مازورة 3: La - Si - Do ‏(كلها Noire)‏</w:t>
         <w:br/>
-        <w:t xml:space="preserve">   - مازورة 4: (Whole Bar Rest)</w:t>
+        <w:t xml:space="preserve">   - مازورة 4: ‏(Whole Bar Rest)‏</w:t>
         <w:br/>
         <w:t>3. أضف خط تكرار في البداية والنهاية</w:t>
         <w:br/>
@@ -7557,7 +7557,7 @@
         <w:br/>
         <w:t>- تمرين: اعزف النمط التالي على العود:</w:t>
         <w:br/>
-        <w:t xml:space="preserve">  - Do (نقر) – سكتة – Re (نقر) – سكتة – Mi (نقر) – سكتة</w:t>
+        <w:t xml:space="preserve">  - Do ‏(نقر)‏ – سكتة – Re ‏(نقر)‏ – سكتة – Mi ‏(نقر)‏ – سكتة</w:t>
         <w:br/>
         <w:t xml:space="preserve">  - كرر 4 مرات</w:t>
         <w:br/>
@@ -7596,13 +7596,13 @@
         <w:br/>
         <w:t>| سكتة | Rest |</w:t>
         <w:br/>
-        <w:t>| سكتة روند (كاملة) | Whole Rest |</w:t>
+        <w:t>| سكتة روند ‏(كاملة)‏ | Whole Rest |</w:t>
         <w:br/>
-        <w:t>| سكتة بلانش (نصف) | Half Rest |</w:t>
+        <w:t>| سكتة بلانش ‏(نصف)‏ | Half Rest |</w:t>
         <w:br/>
-        <w:t>| سكتة نوار (ربع) | Quarter Rest |</w:t>
+        <w:t>| سكتة نوار ‏(ربع)‏ | Quarter Rest |</w:t>
         <w:br/>
-        <w:t>| سكتة كروش (ثمن) | Eighth Rest |</w:t>
+        <w:t>| سكتة كروش ‏(ثمن)‏ | Eighth Rest |</w:t>
         <w:br/>
         <w:t>| خط مازورة | Bar Line |</w:t>
         <w:br/>
@@ -7610,7 +7610,7 @@
         <w:br/>
         <w:t>| خط نهاية | Final Barline |</w:t>
         <w:br/>
-        <w:t>| 3/4 (ثلاثي) | Triple Meter |</w:t>
+        <w:t>| 3/4 ‏(ثلاثي)‏ | Triple Meter |</w:t>
         <w:br/>
         <w:br/>
         <w:t>---</w:t>
@@ -7618,11 +7618,11 @@
         <w:br/>
         <w:t>### 8. ملاحظات المدرس | Teacher Notes</w:t>
         <w:br/>
-        <w:t>- تأكد من أن الطالب يميز بين Ronde Rest (معلقة تحت السطر الرابع) و Blanche Rest (جالسة فوق السطر الثالث)</w:t>
+        <w:t>- تأكد من أن الطالب يميز بين Ronde Rest ‏(معلقة تحت السطر الرابع)‏ و Blanche Rest ‏(جالسة فوق السطر الثالث)‏</w:t>
         <w:br/>
         <w:t>- في الموسيقى العربية، السكتات مهمة جداً في الإيقاعات</w:t>
         <w:br/>
-        <w:t>- اشرح أن سكتة المازورة الكاملة (Whole Bar Rest) تكتب كـ Ronde Rest بغض النظر عن الميزان</w:t>
+        <w:t>- اشرح أن سكتة المازورة الكاملة ‏(Whole Bar Rest)‏ تكتب كـ Ronde Rest بغض النظر عن الميزان</w:t>
         <w:br/>
         <w:t>- الميزان 3/3 هو تمهيد لإيقاع الملفوف لاحقاً</w:t>
         <w:br/>
@@ -7972,7 +7972,7 @@
                 <w:rFonts w:cs="Calibri"/>
                 <w:szCs w:val="18"/>
               </w:rPr>
-              <w:t>لا يوجد (تمهيدي)</w:t>
+              <w:t>لا يوجد ‏(تمهيدي)‏</w:t>
             </w:r>
           </w:p>
         </w:tc>
@@ -8059,7 +8059,7 @@
           <w:rFonts w:cs="Calibri"/>
           <w:szCs w:val="22"/>
         </w:rPr>
-        <w:t>فهم الخطوط الإضافية (Ledger Lines) واستخدامها</w:t>
+        <w:t>فهم الخطوط الإضافية ‏(Ledger Lines)‏ واستخدامها</w:t>
       </w:r>
     </w:p>
     <w:p>
@@ -8076,7 +8076,7 @@
           <w:rFonts w:cs="Calibri"/>
           <w:szCs w:val="22"/>
         </w:rPr>
-        <w:t>التعرف على العلامات العرضية (Sharp, Flat, Natural)</w:t>
+        <w:t>التعرف على العلامات العرضية ‏(Sharp, Flat, Natural)‏</w:t>
       </w:r>
     </w:p>
     <w:p>
@@ -8129,7 +8129,7 @@
           <w:rFonts w:cs="Calibri"/>
           <w:szCs w:val="28"/>
         </w:rPr>
-        <w:t>1. النظري | Theory (10 min)</w:t>
+        <w:t>1. النظري | Theory ‏(10 min)‏</w:t>
       </w:r>
     </w:p>
     <w:p>
@@ -8148,7 +8148,7 @@
           <w:rFonts w:cs="Calibri"/>
           <w:szCs w:val="24"/>
         </w:rPr>
-        <w:t>الخطوط الإضافية (Ledger Lines)</w:t>
+        <w:t>الخطوط الإضافية ‏(Ledger Lines)‏</w:t>
       </w:r>
     </w:p>
     <w:p>
@@ -8200,11 +8200,11 @@
           <w:rFonts w:cs="Calibri"/>
           <w:szCs w:val="22"/>
         </w:rPr>
-        <w:t>نوتات العود (بعد المدرج):</w:t>
+        <w:t>نوتات العود ‏(بعد المدرج)‏:</w:t>
         <w:br/>
-        <w:t>- Do الأوسط (Middle C): أول خط إضافي تحت المدرج</w:t>
+        <w:t>- Do الأوسط ‏(Middle C)‏: أول خط إضافي تحت المدرج</w:t>
         <w:br/>
-        <w:t>- Si تحت المدرج: لا تحتاج خط إضافي (آخر فراغ)</w:t>
+        <w:t>- Si تحت المدرج: لا تحتاج خط إضافي ‏(آخر فراغ)‏</w:t>
       </w:r>
     </w:p>
     <w:p>
@@ -8224,7 +8224,7 @@
         </w:rPr>
         <w:t>نوتات فوق المدرج:</w:t>
         <w:br/>
-        <w:t>- La فوق المدرج (الفراغ الثاني فوق): تلعب دوراً في سلم رديّف</w:t>
+        <w:t>- La فوق المدرج ‏(الفراغ الثاني فوق)‏: تلعب دوراً في سلم رديّف</w:t>
       </w:r>
     </w:p>
     <w:p>
@@ -8243,7 +8243,7 @@
           <w:rFonts w:cs="Calibri"/>
           <w:szCs w:val="24"/>
         </w:rPr>
-        <w:t>العلامات العرضية (Accidentals)</w:t>
+        <w:t>العلامات العرضية ‏(Accidentals)‏</w:t>
       </w:r>
     </w:p>
     <w:tbl>
@@ -8675,7 +8675,7 @@
           <w:rFonts w:cs="Calibri"/>
           <w:szCs w:val="24"/>
         </w:rPr>
-        <w:t>أنصاف الدرجات (Half Steps / Semitones)</w:t>
+        <w:t>أنصاف الدرجات ‏(Half Steps / Semitones)‏</w:t>
       </w:r>
     </w:p>
     <w:p>
@@ -8692,7 +8692,7 @@
           <w:rFonts w:cs="Calibri"/>
           <w:szCs w:val="22"/>
         </w:rPr>
-        <w:t>• نصف الدرجة (Semitone): أصغر مسافة بين نوتتين متجاورتين على البيانو</w:t>
+        <w:t>• نصف الدرجة ‏(Semitone)‏: أصغر مسافة بين نوتتين متجاورتين على البيانو</w:t>
       </w:r>
     </w:p>
     <w:p>
@@ -8709,7 +8709,7 @@
           <w:rFonts w:cs="Calibri"/>
           <w:szCs w:val="22"/>
         </w:rPr>
-        <w:t>• الدرجة الكاملة (Tone): = 2 Semitones</w:t>
+        <w:t>• الدرجة الكاملة ‏(Tone)‏: = 2 Semitones</w:t>
       </w:r>
     </w:p>
     <w:p>
@@ -8728,7 +8728,7 @@
           <w:rFonts w:cs="Calibri"/>
           <w:szCs w:val="28"/>
         </w:rPr>
-        <w:t>2. التطبيق العملي | Practice (30 min)</w:t>
+        <w:t>2. التطبيق العملي | Practice ‏(30 min)‏</w:t>
       </w:r>
     </w:p>
     <w:p>
@@ -8747,7 +8747,7 @@
           <w:rFonts w:cs="Calibri"/>
           <w:szCs w:val="24"/>
         </w:rPr>
-        <w:t>تمرين 1: الخطوط الإضافية (10 دقائق)</w:t>
+        <w:t>تمرين 1: الخطوط الإضافية ‏(10 دقائق)‏</w:t>
       </w:r>
     </w:p>
     <w:p>
@@ -8781,7 +8781,7 @@
           <w:rFonts w:cs="Calibri"/>
           <w:szCs w:val="22"/>
         </w:rPr>
-        <w:t>اكتب النوتات التالية (منخفضة):</w:t>
+        <w:t>اكتب النوتات التالية ‏(منخفضة)‏:</w:t>
       </w:r>
     </w:p>
     <w:p>
@@ -8798,7 +8798,7 @@
           <w:rFonts w:cs="Calibri"/>
           <w:szCs w:val="22"/>
         </w:rPr>
-        <w:t>• Do (Middle C): تحت المدرج، أول خط إضافي ← اكتب Do من Keypad</w:t>
+        <w:t>• Do ‏(Middle C)‏: تحت المدرج، أول خط إضافي ← اكتب Do من Keypad</w:t>
       </w:r>
     </w:p>
     <w:p>
@@ -8815,7 +8815,7 @@
           <w:rFonts w:cs="Calibri"/>
           <w:szCs w:val="22"/>
         </w:rPr>
-        <w:t>• Si (B3): تحت المدرج مباشرة (آخر فراغ)</w:t>
+        <w:t>• Si ‏(B3)‏: تحت المدرج مباشرة ‏(آخر فراغ)‏</w:t>
       </w:r>
     </w:p>
     <w:p>
@@ -8832,7 +8832,7 @@
           <w:rFonts w:cs="Calibri"/>
           <w:szCs w:val="22"/>
         </w:rPr>
-        <w:t>• La (A3): تحت المدرج، أول خط إضافي إضافي</w:t>
+        <w:t>• La ‏(A3)‏: تحت المدرج، أول خط إضافي إضافي</w:t>
       </w:r>
     </w:p>
     <w:p>
@@ -8849,7 +8849,7 @@
           <w:rFonts w:cs="Calibri"/>
           <w:szCs w:val="22"/>
         </w:rPr>
-        <w:t>اكتب النوتات التالية (مرتفعة):</w:t>
+        <w:t>اكتب النوتات التالية ‏(مرتفعة)‏:</w:t>
       </w:r>
     </w:p>
     <w:p>
@@ -8866,7 +8866,7 @@
           <w:rFonts w:cs="Calibri"/>
           <w:szCs w:val="22"/>
         </w:rPr>
-        <w:t>• La (A5): فوق المدرج × 1</w:t>
+        <w:t>• La ‏(A5)‏: فوق المدرج × 1</w:t>
       </w:r>
     </w:p>
     <w:p>
@@ -8883,7 +8883,7 @@
           <w:rFonts w:cs="Calibri"/>
           <w:szCs w:val="22"/>
         </w:rPr>
-        <w:t>• Do (C6): فوق المدرج × 2</w:t>
+        <w:t>• Do ‏(C6)‏: فوق المدرج × 2</w:t>
       </w:r>
     </w:p>
     <w:p>
@@ -8909,7 +8909,7 @@
         <w:br/>
         <w:t>- استخدم الأسهم: سهم فوق حتى تصل للنوتة الصحيحة</w:t>
         <w:br/>
-        <w:t>- أو: اكتب الحرف C (لاحظ أن Sibelius يستخدم حروف ABC)</w:t>
+        <w:t>- أو: اكتب الحرف C ‏(لاحظ أن Sibelius يستخدم حروف ABC)‏</w:t>
       </w:r>
     </w:p>
     <w:p>
@@ -8928,7 +8928,7 @@
           <w:rFonts w:cs="Calibri"/>
           <w:szCs w:val="24"/>
         </w:rPr>
-        <w:t>تمرين 2: العلامات العرضية (10 دقائق)</w:t>
+        <w:t>تمرين 2: العلامات العرضية ‏(10 دقائق)‏</w:t>
       </w:r>
     </w:p>
     <w:p>
@@ -8963,7 +8963,7 @@
           <w:rFonts w:cs="Calibri"/>
           <w:szCs w:val="22"/>
         </w:rPr>
-        <w:t>دييز (Sharp):</w:t>
+        <w:t>دييز ‏(Sharp)‏:</w:t>
         <w:br/>
         <w:t>```</w:t>
       </w:r>
@@ -8985,7 +8985,7 @@
           <w:szCs w:val="18"/>
         </w:rPr>
         <w:br/>
-        <w:t>بيمول (Flat):</w:t>
+        <w:t>بيمول ‏(Flat)‏:</w:t>
       </w:r>
     </w:p>
     <w:p>
@@ -9007,14 +9007,14 @@
         <w:br/>
         <w:t>كيفية إدخال العلامات العرضية في Sibelius:</w:t>
         <w:br/>
-        <w:t>- بعد وضع النوتة، اضغط + (Plus) ← رفع نصف درجة (Sharp)</w:t>
+        <w:t>- بعد وضع النوتة، اضغط + ‏(Plus)‏ ← رفع نصف درجة ‏(Sharp)‏</w:t>
         <w:br/>
-        <w:t>- اضغط - (Minus) ← خفض نصف درجة (Flat)</w:t>
+        <w:t>- اضغط - ‏(Minus)‏ ← خفض نصف درجة ‏(Flat)‏</w:t>
         <w:br/>
-        <w:t>- اضغط = (Equals) ← إلغاء العلامة (Natural)</w:t>
+        <w:t>- اضغط = ‏(Equals)‏ ← إلغاء العلامة ‏(Natural)‏</w:t>
         <w:br/>
         <w:br/>
-        <w:t>#### تمرين 3: مازورة بالعلامات العرضية (10 دقائق)</w:t>
+        <w:t>#### تمرين 3: مازورة بالعلامات العرضية ‏(10 دقائق)‏</w:t>
         <w:br/>
         <w:t>اكتب:</w:t>
       </w:r>
@@ -9062,7 +9062,7 @@
                 <w:rFonts w:cs="Calibri"/>
                 <w:szCs w:val="18"/>
               </w:rPr>
-              <w:t>Do (C)</w:t>
+              <w:t>Do ‏(C)‏</w:t>
             </w:r>
           </w:p>
         </w:tc>
@@ -9088,7 +9088,7 @@
                 <w:rFonts w:cs="Calibri"/>
                 <w:szCs w:val="18"/>
               </w:rPr>
-              <w:t>Do♯ (C#)</w:t>
+              <w:t>Do♯ ‏(C#)‏</w:t>
             </w:r>
           </w:p>
         </w:tc>
@@ -9114,7 +9114,7 @@
                 <w:rFonts w:cs="Calibri"/>
                 <w:szCs w:val="18"/>
               </w:rPr>
-              <w:t>Do (C)</w:t>
+              <w:t>Do ‏(C)‏</w:t>
             </w:r>
           </w:p>
         </w:tc>
@@ -9140,7 +9140,7 @@
                 <w:rFonts w:cs="Calibri"/>
                 <w:szCs w:val="18"/>
               </w:rPr>
-              <w:t>Do♯ (C#)</w:t>
+              <w:t>Do♯ ‏(C#)‏</w:t>
             </w:r>
           </w:p>
         </w:tc>
@@ -9165,7 +9165,7 @@
                 <w:rFonts w:cs="Calibri"/>
                 <w:szCs w:val="18"/>
               </w:rPr>
-              <w:t>Mi♭ (Eb)</w:t>
+              <w:t>Mi♭ ‏(Eb)‏</w:t>
             </w:r>
           </w:p>
         </w:tc>
@@ -9188,7 +9188,7 @@
                 <w:rFonts w:cs="Calibri"/>
                 <w:szCs w:val="18"/>
               </w:rPr>
-              <w:t>Mi (E)</w:t>
+              <w:t>Mi ‏(E)‏</w:t>
             </w:r>
           </w:p>
         </w:tc>
@@ -9211,7 +9211,7 @@
                 <w:rFonts w:cs="Calibri"/>
                 <w:szCs w:val="18"/>
               </w:rPr>
-              <w:t>Mi♭ (Eb)</w:t>
+              <w:t>Mi♭ ‏(Eb)‏</w:t>
             </w:r>
           </w:p>
         </w:tc>
@@ -9234,7 +9234,7 @@
                 <w:rFonts w:cs="Calibri"/>
                 <w:szCs w:val="18"/>
               </w:rPr>
-              <w:t>Mi (E)</w:t>
+              <w:t>Mi ‏(E)‏</w:t>
             </w:r>
           </w:p>
         </w:tc>
@@ -9261,54 +9261,54 @@
         <w:br/>
         <w:t>- تخيل أن Do - Do♯ - Re - Re♯ - Mi - Fa - Fa♯ - Sol - Sol♯ - La - La♯ - Si - Do</w:t>
         <w:br/>
-        <w:t>- هذا هو السلم الكروماتيكي (Chromatic Scale)</w:t>
+        <w:t>- هذا هو السلم الكروماتيكي ‏(Chromatic Scale)‏</w:t>
         <w:br/>
         <w:br/>
         <w:t>---</w:t>
         <w:br/>
         <w:br/>
-        <w:t>### 3. اختصارات Sibelius (5 min)</w:t>
+        <w:t>### 3. اختصارات Sibelius ‏(5 min)‏</w:t>
         <w:br/>
         <w:br/>
         <w:t>| # | الاختصار | الوظيفة | Function |</w:t>
         <w:br/>
         <w:t>|---|----------|---------|----------|</w:t>
         <w:br/>
-        <w:t>| 1 | + | رفع نصف درجة (Sharp) | Add Sharp |</w:t>
+        <w:t>| 1 | + | رفع نصف درجة ‏(Sharp)‏ | Add Sharp |</w:t>
         <w:br/>
-        <w:t>| 2 | - | خفض نصف درجة (Flat) | Add Flat |</w:t>
+        <w:t>| 2 | - | خفض نصف درجة ‏(Flat)‏ | Add Flat |</w:t>
         <w:br/>
-        <w:t>| 3 | = | إلغاء العلامة (Natural) | Add Natural |</w:t>
+        <w:t>| 3 | = | إلغاء العلامة ‏(Natural)‏ | Add Natural |</w:t>
         <w:br/>
-        <w:t>| 4 | ↑ (سهم فوق) | رفع النوتة درجة في الوضع | Move Note Up |</w:t>
+        <w:t>| 4 | ↑ ‏(سهم فوق)‏ | رفع النوتة درجة في الوضع | Move Note Up |</w:t>
         <w:br/>
-        <w:t>| 5 | ↓ (سهم تحت) | خفض النوتة درجة في الوضع | Move Note Down |</w:t>
+        <w:t>| 5 | ↓ ‏(سهم تحت)‏ | خفض النوتة درجة في الوضع | Move Note Down |</w:t>
         <w:br/>
         <w:br/>
         <w:t>---</w:t>
         <w:br/>
         <w:br/>
-        <w:t>### 4. مراجعة وواجب | Review &amp; HW (5 min)</w:t>
+        <w:t>### 4. مراجعة وواجب | Review &amp; HW ‏(5 min)‏</w:t>
         <w:br/>
         <w:br/>
         <w:t>#### أسئلة المراجعة</w:t>
         <w:br/>
         <w:t>1. ما اسم الخط الذي يُستخدم لكتابة النوتات خارج المدرج؟</w:t>
         <w:br/>
-        <w:t>2. ما الفرق بين Sharp (♯) و Flat (♭)؟</w:t>
+        <w:t>2. ما الفرق بين Sharp ‏(♯)‏ و Flat ‏(♭)‏؟</w:t>
         <w:br/>
         <w:t>3. ما اختصار إضافة Sharp في Sibelius؟</w:t>
         <w:br/>
         <w:br/>
         <w:t>#### الواجب المنزلي</w:t>
         <w:br/>
-        <w:t>1. أنشئ نوتة جديدة (Treble Clef, 4/4)</w:t>
+        <w:t>1. أنشئ نوتة جديدة ‏(Treble Clef, 4/4)‏</w:t>
         <w:br/>
         <w:t>2. اكتب 8 مازورات تحتوي على:</w:t>
         <w:br/>
-        <w:t xml:space="preserve">   - مازورة 1-2: سلم Do كبير (Do-Si-La-Sol-Fa-Mi-Re-Do) مع Noire</w:t>
+        <w:t xml:space="preserve">   - مازورة 1-2: سلم Do كبير ‏(Do-Si-La-Sol-Fa-Mi-Re-Do)‏ مع Noire</w:t>
         <w:br/>
-        <w:t xml:space="preserve">   - مازورة 3-4: سلم Chromatic (Do-Do♯-Re-Re♯-Mi-Fa-Fa♯-Sol) مع Croche</w:t>
+        <w:t xml:space="preserve">   - مازورة 3-4: سلم Chromatic ‏(Do-Do♯-Re-Re♯-Mi-Fa-Fa♯-Sol)‏ مع Croche</w:t>
         <w:br/>
         <w:t xml:space="preserve">   - مازورة 5-6: أنشئ نمطاً خاصاً بك مع Flat</w:t>
         <w:br/>
@@ -9324,9 +9324,9 @@
         <w:br/>
         <w:t>### 5. تطبيق العود | Oud Application</w:t>
         <w:br/>
-        <w:t>- تمرين: اعزف سلم Do كبير (Do-Re-Mi-Fa-Sol-La-Si-Do) ثم:</w:t>
+        <w:t>- تمرين: اعزف سلم Do كبير ‏(Do-Re-Mi-Fa-Sol-La-Si-Do)‏ ثم:</w:t>
         <w:br/>
-        <w:t xml:space="preserve">  - Do - Do♯ (نصف درجة فوق Do)</w:t>
+        <w:t xml:space="preserve">  - Do - Do♯ ‏(نصف درجة فوق Do)‏</w:t>
         <w:br/>
         <w:t xml:space="preserve">  - Re - Re♯</w:t>
         <w:br/>
@@ -9365,11 +9365,11 @@
         <w:br/>
         <w:t>| خط إضافي | Ledger Line |</w:t>
         <w:br/>
-        <w:t>| دييز (رفع) | Sharp (♯) |</w:t>
+        <w:t>| دييز ‏(رفع)‏ | Sharp ‏(♯)‏ |</w:t>
         <w:br/>
-        <w:t>| بيمول (خفض) | Flat (♭) |</w:t>
+        <w:t>| بيمول ‏(خفض)‏ | Flat ‏(♭)‏ |</w:t>
         <w:br/>
-        <w:t>| بيكار (إلغاء) | Natural (♮) |</w:t>
+        <w:t>| بيكار ‏(إلغاء)‏ | Natural ‏(♮)‏ |</w:t>
         <w:br/>
         <w:t>| علامة عرضية | Accidental |</w:t>
         <w:br/>
@@ -9389,7 +9389,7 @@
         <w:br/>
         <w:t>- في الموسيقى العربية، العلامات العرضية أساسية لأن المقامات تحتوي على أرباع الدرجات</w:t>
         <w:br/>
-        <w:t>- في Sibelius، يمكن إدخال ربع الدرجة (Quarter Tone) لكن هذا لدرس لاحق</w:t>
+        <w:t>- في Sibelius، يمكن إدخال ربع الدرجة ‏(Quarter Tone)‏ لكن هذا لدرس لاحق</w:t>
         <w:br/>
         <w:t>- شجع الطالب على العزف والاستماع للفرق بين Do و Do♯</w:t>
         <w:br/>
@@ -9739,7 +9739,7 @@
                 <w:rFonts w:cs="Calibri"/>
                 <w:szCs w:val="18"/>
               </w:rPr>
-              <w:t>لا يوجد (واجهة البرنامج)</w:t>
+              <w:t>لا يوجد ‏(واجهة البرنامج)‏</w:t>
             </w:r>
           </w:p>
         </w:tc>
@@ -9787,7 +9787,7 @@
                 <w:rFonts w:cs="Calibri"/>
                 <w:szCs w:val="18"/>
               </w:rPr>
-              <w:t>لا يوجد (واجهة البرنامج)</w:t>
+              <w:t>لا يوجد ‏(واجهة البرنامج)‏</w:t>
             </w:r>
           </w:p>
         </w:tc>
@@ -9843,7 +9843,7 @@
           <w:rFonts w:cs="Calibri"/>
           <w:szCs w:val="22"/>
         </w:rPr>
-        <w:t>فهم شريط الأدوات (Ribbon) وجميع التبويبات</w:t>
+        <w:t>فهم شريط الأدوات ‏(Ribbon)‏ وجميع التبويبات</w:t>
       </w:r>
     </w:p>
     <w:p>
@@ -9860,7 +9860,7 @@
           <w:rFonts w:cs="Calibri"/>
           <w:szCs w:val="22"/>
         </w:rPr>
-        <w:t>تخصيص شريط الأدوات السريع (Quick Access Toolbar)</w:t>
+        <w:t>تخصيص شريط الأدوات السريع ‏(Quick Access Toolbar)‏</w:t>
       </w:r>
     </w:p>
     <w:p>
@@ -9896,7 +9896,7 @@
           <w:rFonts w:cs="Calibri"/>
           <w:szCs w:val="28"/>
         </w:rPr>
-        <w:t>1. النظري | Theory (10 min)</w:t>
+        <w:t>1. النظري | Theory ‏(10 min)‏</w:t>
       </w:r>
     </w:p>
     <w:p>
@@ -10010,7 +10010,7 @@
                 <w:rFonts w:cs="Calibri"/>
                 <w:szCs w:val="18"/>
               </w:rPr>
-              <w:t>Ribbon (الشريط العلوي)</w:t>
+              <w:t>Ribbon ‏(الشريط العلوي)‏</w:t>
             </w:r>
           </w:p>
         </w:tc>
@@ -10083,7 +10083,7 @@
                 <w:rFonts w:cs="Calibri"/>
                 <w:szCs w:val="18"/>
               </w:rPr>
-              <w:t>شريط الأدوات السريع (حفظ، تراجع...)</w:t>
+              <w:t>شريط الأدوات السريع ‏(حفظ، تراجع...)‏</w:t>
             </w:r>
           </w:p>
         </w:tc>
@@ -10108,7 +10108,7 @@
                 <w:rFonts w:cs="Calibri"/>
                 <w:szCs w:val="18"/>
               </w:rPr>
-              <w:t>Score (منطقة النوتة)</w:t>
+              <w:t>Score ‏(منطقة النوتة)‏</w:t>
             </w:r>
           </w:p>
         </w:tc>
@@ -10157,7 +10157,7 @@
                 <w:rFonts w:cs="Calibri"/>
                 <w:szCs w:val="18"/>
               </w:rPr>
-              <w:t>Keypad (لوحة النوتات)</w:t>
+              <w:t>Keypad ‏(لوحة النوتات)‏</w:t>
             </w:r>
           </w:p>
         </w:tc>
@@ -10206,7 +10206,7 @@
                 <w:rFonts w:cs="Calibri"/>
                 <w:szCs w:val="18"/>
               </w:rPr>
-              <w:t>Transport (شريط التشغيل)</w:t>
+              <w:t>Transport ‏(شريط التشغيل)‏</w:t>
             </w:r>
           </w:p>
         </w:tc>
@@ -10255,7 +10255,7 @@
                 <w:rFonts w:cs="Calibri"/>
                 <w:szCs w:val="18"/>
               </w:rPr>
-              <w:t>Mixer (خلاط الصوت)</w:t>
+              <w:t>Mixer ‏(خلاط الصوت)‏</w:t>
             </w:r>
           </w:p>
         </w:tc>
@@ -10304,7 +10304,7 @@
                 <w:rFonts w:cs="Calibri"/>
                 <w:szCs w:val="18"/>
               </w:rPr>
-              <w:t>Status Bar (شريط الحالة)</w:t>
+              <w:t>Status Bar ‏(شريط الحالة)‏</w:t>
             </w:r>
           </w:p>
         </w:tc>
@@ -10353,7 +10353,7 @@
                 <w:rFonts w:cs="Calibri"/>
                 <w:szCs w:val="18"/>
               </w:rPr>
-              <w:t>Navigator (المتصفح)</w:t>
+              <w:t>Navigator ‏(المتصفح)‏</w:t>
             </w:r>
           </w:p>
         </w:tc>
@@ -10713,7 +10713,7 @@
                 <w:rFonts w:cs="Calibri"/>
                 <w:szCs w:val="18"/>
               </w:rPr>
-              <w:t>الرموز الموسيقية (علامات، ديناميك...)</w:t>
+              <w:t>الرموز الموسيقية ‏(علامات، ديناميك...)‏</w:t>
             </w:r>
           </w:p>
         </w:tc>
@@ -10859,7 +10859,7 @@
                 <w:rFonts w:cs="Calibri"/>
                 <w:szCs w:val="18"/>
               </w:rPr>
-              <w:t>مظهر النوتة (Engraving Rules)</w:t>
+              <w:t>مظهر النوتة ‏(Engraving Rules)‏</w:t>
             </w:r>
           </w:p>
         </w:tc>
@@ -10979,7 +10979,7 @@
           <w:rFonts w:cs="Calibri"/>
           <w:szCs w:val="28"/>
         </w:rPr>
-        <w:t>2. التطبيق العملي | Practice (30 min)</w:t>
+        <w:t>2. التطبيق العملي | Practice ‏(30 min)‏</w:t>
       </w:r>
     </w:p>
     <w:p>
@@ -10998,7 +10998,7 @@
           <w:rFonts w:cs="Calibri"/>
           <w:szCs w:val="24"/>
         </w:rPr>
-        <w:t>تمرين 1: استكشاف الواجهة (10 دقائق)</w:t>
+        <w:t>تمرين 1: استكشاف الواجهة ‏(10 دقائق)‏</w:t>
       </w:r>
     </w:p>
     <w:p>
@@ -11015,7 +11015,7 @@
           <w:rFonts w:cs="Calibri"/>
           <w:szCs w:val="22"/>
         </w:rPr>
-        <w:t>افتح Sibelius → Blank Score → (اختر أي إعدادات)</w:t>
+        <w:t>افتح Sibelius → Blank Score → ‏(اختر أي إعدادات)‏</w:t>
       </w:r>
     </w:p>
     <w:p>
@@ -11136,7 +11136,7 @@
           <w:rFonts w:cs="Calibri"/>
           <w:szCs w:val="24"/>
         </w:rPr>
-        <w:t>تمرين 2: استخدام Keypad المتقدم (10 دقائق)</w:t>
+        <w:t>تمرين 2: استخدام Keypad المتقدم ‏(10 دقائق)‏</w:t>
       </w:r>
     </w:p>
     <w:p>
@@ -11154,7 +11154,7 @@
           <w:rFonts w:cs="Calibri"/>
           <w:szCs w:val="22"/>
         </w:rPr>
-        <w:t>Keypad له 3 صفحات (Layouts):</w:t>
+        <w:t>Keypad له 3 صفحات ‏(Layouts)‏:</w:t>
       </w:r>
     </w:p>
     <w:p>
@@ -11172,13 +11172,13 @@
           <w:rFonts w:cs="Calibri"/>
           <w:szCs w:val="22"/>
         </w:rPr>
-        <w:t>Layout 1 (Common): القيم الأساسية</w:t>
+        <w:t>Layout 1 ‏(Common)‏: القيم الأساسية</w:t>
         <w:br/>
         <w:t>- الصف 1: Ronde, Blanche, Noire, Croche, Double Croche</w:t>
         <w:br/>
-        <w:t>- الصف 2: العلامات العرضية (Sharp, Flat, Natural)</w:t>
+        <w:t>- الصف 2: العلامات العرضية ‏(Sharp, Flat, Natural)‏</w:t>
         <w:br/>
-        <w:t>- الصف 3: النقاط (Dots)، الربط (Tie)</w:t>
+        <w:t>- الصف 3: النقاط ‏(Dots)‏، الربط ‏(Tie)‏</w:t>
       </w:r>
     </w:p>
     <w:p>
@@ -11196,9 +11196,9 @@
           <w:rFonts w:cs="Calibri"/>
           <w:szCs w:val="22"/>
         </w:rPr>
-        <w:t xml:space="preserve">Layout 2 (More Notes): </w:t>
+        <w:t xml:space="preserve">Layout 2 ‏(More Notes)‏: </w:t>
         <w:br/>
-        <w:t>- Tuplets (ثلاثيات، رباعيات...)</w:t>
+        <w:t>- Tuplets ‏(ثلاثيات، رباعيات...)‏</w:t>
         <w:br/>
         <w:t>- Tremolo</w:t>
         <w:br/>
@@ -11220,7 +11220,7 @@
           <w:rFonts w:cs="Calibri"/>
           <w:szCs w:val="22"/>
         </w:rPr>
-        <w:t>Layout 3 (Articulations):</w:t>
+        <w:t>Layout 3 ‏(Articulations)‏:</w:t>
         <w:br/>
         <w:t>- Accent, Staccato, Tenuto</w:t>
         <w:br/>
@@ -11242,7 +11242,7 @@
           <w:rFonts w:cs="Calibri"/>
           <w:szCs w:val="22"/>
         </w:rPr>
-        <w:t>جرب التنقل بين Layouts: اضغط Ctrl+F9 (أو استخدم الأزرار 1-2-3 في أعلى Keypad)</w:t>
+        <w:t>جرب التنقل بين Layouts: اضغط Ctrl+F9 ‏(أو استخدم الأزرار 1-2-3 في أعلى Keypad)‏</w:t>
       </w:r>
     </w:p>
     <w:p>
@@ -11261,7 +11261,7 @@
           <w:rFonts w:cs="Calibri"/>
           <w:szCs w:val="24"/>
         </w:rPr>
-        <w:t>تمرين 3: تخصيص Quick Access Toolbar (5 دقائق)</w:t>
+        <w:t>تمرين 3: تخصيص Quick Access Toolbar ‏(5 دقائق)‏</w:t>
       </w:r>
     </w:p>
     <w:p>
@@ -11312,7 +11312,7 @@
           <w:rFonts w:cs="Calibri"/>
           <w:szCs w:val="22"/>
         </w:rPr>
-        <w:t>أضف الأوامر المفضلة (مثلاً: Save As, Export PDF, Print)</w:t>
+        <w:t>أضف الأوامر المفضلة ‏(مثلاً: Save As, Export PDF, Print)‏</w:t>
       </w:r>
     </w:p>
     <w:p>
@@ -11348,7 +11348,7 @@
           <w:rFonts w:cs="Calibri"/>
           <w:szCs w:val="24"/>
         </w:rPr>
-        <w:t>تمرين 4: التنقل في النوتة (5 دقائق)</w:t>
+        <w:t>تمرين 4: التنقل في النوتة ‏(5 دقائق)‏</w:t>
       </w:r>
     </w:p>
     <w:tbl>
@@ -11636,7 +11636,7 @@
           <w:rFonts w:cs="Calibri"/>
           <w:szCs w:val="28"/>
         </w:rPr>
-        <w:t>3. اختصارات Sibelius (5 min)</w:t>
+        <w:t>3. اختصارات Sibelius ‏(5 min)‏</w:t>
       </w:r>
     </w:p>
     <w:tbl>
@@ -12215,7 +12215,7 @@
                 <w:rFonts w:cs="Calibri"/>
                 <w:szCs w:val="18"/>
               </w:rPr>
-              <w:t>إظهار Keypad (بديل)</w:t>
+              <w:t>إظهار Keypad ‏(بديل)‏</w:t>
             </w:r>
           </w:p>
         </w:tc>
@@ -12260,7 +12260,7 @@
           <w:rFonts w:cs="Calibri"/>
           <w:szCs w:val="28"/>
         </w:rPr>
-        <w:t>4. مراجعة وواجب | Review &amp; HW (5 min)</w:t>
+        <w:t>4. مراجعة وواجب | Review &amp; HW ‏(5 min)‏</w:t>
       </w:r>
     </w:p>
     <w:p>
@@ -12366,7 +12366,7 @@
           <w:rFonts w:cs="Calibri"/>
           <w:szCs w:val="22"/>
         </w:rPr>
-        <w:t>افتح Sibelius وأنشئ نوتة جديدة (أي إعدادات)</w:t>
+        <w:t>افتح Sibelius وأنشئ نوتة جديدة ‏(أي إعدادات)‏</w:t>
       </w:r>
     </w:p>
     <w:p>
@@ -13445,7 +13445,7 @@
           <w:rFonts w:cs="Calibri"/>
           <w:szCs w:val="22"/>
         </w:rPr>
-        <w:t>• إذا كان الطالب يستخدم Sibelius First (المجاني)، اشرح الفروقات البسيطة</w:t>
+        <w:t>• إذا كان الطالب يستخدم Sibelius First ‏(المجاني)‏، اشرح الفروقات البسيطة</w:t>
       </w:r>
     </w:p>
     <w:p>
@@ -13809,7 +13809,7 @@
                 <w:rFonts w:cs="Calibri"/>
                 <w:szCs w:val="18"/>
               </w:rPr>
-              <w:t>لا يوجد (تقنية إدخال)</w:t>
+              <w:t>لا يوجد ‏(تقنية إدخال)‏</w:t>
             </w:r>
           </w:p>
         </w:tc>
@@ -13896,7 +13896,7 @@
           <w:rFonts w:cs="Calibri"/>
           <w:szCs w:val="22"/>
         </w:rPr>
-        <w:t>إدخال النوتة باستخدام الحروف (A B C D E F G)</w:t>
+        <w:t>إدخال النوتة باستخدام الحروف ‏(A B C D E F G)‏</w:t>
       </w:r>
     </w:p>
     <w:p>
@@ -13966,7 +13966,7 @@
           <w:rFonts w:cs="Calibri"/>
           <w:szCs w:val="28"/>
         </w:rPr>
-        <w:t>1. النظري | Theory (10 min)</w:t>
+        <w:t>1. النظري | Theory ‏(10 min)‏</w:t>
       </w:r>
     </w:p>
     <w:p>
@@ -13985,7 +13985,7 @@
           <w:rFonts w:cs="Calibri"/>
           <w:szCs w:val="24"/>
         </w:rPr>
-        <w:t>إدخال النوتة بالحروف (Alphabetical Input)</w:t>
+        <w:t>إدخال النوتة بالحروف ‏(Alphabetical Input)‏</w:t>
       </w:r>
     </w:p>
     <w:p>
@@ -14648,11 +14648,11 @@
         </w:rPr>
         <w:t>أسرع طريقة لإدخال النوتة في Sibelius:</w:t>
         <w:br/>
-        <w:t>1. اضغط N (Note Input Mode)</w:t>
+        <w:t>1. اضغط N ‏(Note Input Mode)‏</w:t>
         <w:br/>
-        <w:t>2. اختر القيمة من Keypad (1-2-3-4-5-6-7)</w:t>
+        <w:t>2. اختر القيمة من Keypad ‏(1-2-3-4-5-6-7)‏</w:t>
         <w:br/>
-        <w:t>3. اكتب الحرف (C D E F G A B) ← تظهر النوتة فوراً</w:t>
+        <w:t>3. اكتب الحرف ‏(C D E F G A B)‏ ← تظهر النوتة فوراً</w:t>
         <w:br/>
         <w:t>4. تنتقل المؤشر تلقائياً للنوتة التالية</w:t>
       </w:r>
@@ -14690,7 +14690,7 @@
           <w:rFonts w:cs="Calibri"/>
           <w:szCs w:val="22"/>
         </w:rPr>
-        <w:t>• C' (Middle C) = C صغير</w:t>
+        <w:t>• C' ‏(Middle C)‏ = C صغير</w:t>
       </w:r>
     </w:p>
     <w:p>
@@ -14707,7 +14707,7 @@
           <w:rFonts w:cs="Calibri"/>
           <w:szCs w:val="22"/>
         </w:rPr>
-        <w:t>• C'' (أوكتاف أعلى)</w:t>
+        <w:t>• C'' ‏(أوكتاف أعلى)‏</w:t>
       </w:r>
     </w:p>
     <w:p>
@@ -14724,7 +14724,7 @@
           <w:rFonts w:cs="Calibri"/>
           <w:szCs w:val="22"/>
         </w:rPr>
-        <w:t>• C, (أوكتاف أقل)</w:t>
+        <w:t>• C, ‏(أوكتاف أقل)‏</w:t>
       </w:r>
     </w:p>
     <w:p>
@@ -14761,7 +14761,7 @@
           <w:rFonts w:cs="Calibri"/>
           <w:szCs w:val="28"/>
         </w:rPr>
-        <w:t>2. التطبيق العملي | Practice (30 min)</w:t>
+        <w:t>2. التطبيق العملي | Practice ‏(30 min)‏</w:t>
       </w:r>
     </w:p>
     <w:p>
@@ -14780,7 +14780,7 @@
           <w:rFonts w:cs="Calibri"/>
           <w:szCs w:val="24"/>
         </w:rPr>
-        <w:t>تمرين 1: إدخال سلم Do الكبير (5 دقائق)</w:t>
+        <w:t>تمرين 1: إدخال سلم Do الكبير ‏(5 دقائق)‏</w:t>
       </w:r>
     </w:p>
     <w:p>
@@ -14831,7 +14831,7 @@
           <w:rFonts w:cs="Calibri"/>
           <w:szCs w:val="22"/>
         </w:rPr>
-        <w:t>اختر Noire (اضغط 3 في Keypad)</w:t>
+        <w:t>اختر Noire ‏(اضغط 3 في Keypad)‏</w:t>
       </w:r>
     </w:p>
     <w:p>
@@ -14848,7 +14848,7 @@
           <w:rFonts w:cs="Calibri"/>
           <w:szCs w:val="22"/>
         </w:rPr>
-        <w:t>اكتب: C D E F G A B C (الحروف الإنجليزية)</w:t>
+        <w:t>اكتب: C D E F G A B C ‏(الحروف الإنجليزية)‏</w:t>
       </w:r>
     </w:p>
     <w:p>
@@ -14884,7 +14884,7 @@
           <w:rFonts w:cs="Calibri"/>
           <w:szCs w:val="24"/>
         </w:rPr>
-        <w:t>تمرين 2: إدخال بقيم مختلفة (10 دقائق)</w:t>
+        <w:t>تمرين 2: إدخال بقيم مختلفة ‏(10 دقائق)‏</w:t>
       </w:r>
     </w:p>
     <w:p>
@@ -14920,7 +14920,7 @@
           <w:rFonts w:cs="Calibri"/>
           <w:szCs w:val="22"/>
         </w:rPr>
-        <w:t>اضغط N (ثم اكتب بدون استخدام الماوس):</w:t>
+        <w:t>اضغط N ‏(ثم اكتب بدون استخدام الماوس)‏:</w:t>
       </w:r>
     </w:p>
     <w:p>
@@ -14939,13 +14939,13 @@
           <w:rFonts w:cs="Calibri"/>
           <w:szCs w:val="18"/>
         </w:rPr>
-        <w:t>مازورة 1: 4 Noire → C D E F          (اختر 3 ثم اكتب C D E F)</w:t>
+        <w:t>مازورة 1: 4 Noire → C D E F          ‏(اختر 3 ثم اكتب C D E F)‏</w:t>
         <w:br/>
-        <w:t>مازورة 2: 8 Croche → C C D D E E F F  (اختر 4 ثم اكتب)</w:t>
+        <w:t>مازورة 2: 8 Croche → C C D D E E F F  ‏(اختر 4 ثم اكتب)‏</w:t>
         <w:br/>
-        <w:t>مازورة 3: 2 Blanche → G A              (اختر 2 ثم اكتب)</w:t>
+        <w:t>مازورة 3: 2 Blanche → G A              ‏(اختر 2 ثم اكتب)‏</w:t>
         <w:br/>
-        <w:t>مازورة 4: 1 Ronde → B                  (اختر 1 ثم اكتب)</w:t>
+        <w:t>مازورة 4: 1 Ronde → B                  ‏(اختر 1 ثم اكتب)‏</w:t>
       </w:r>
     </w:p>
     <w:p>
@@ -14986,7 +14986,7 @@
           <w:rFonts w:cs="Calibri"/>
           <w:szCs w:val="24"/>
         </w:rPr>
-        <w:t>تمرين 3: ألحان بسيطة (10 دقائق)</w:t>
+        <w:t>تمرين 3: ألحان بسيطة ‏(10 دقائق)‏</w:t>
       </w:r>
     </w:p>
     <w:p>
@@ -15022,7 +15022,7 @@
           <w:rFonts w:cs="Calibri"/>
           <w:szCs w:val="22"/>
         </w:rPr>
-        <w:t>لحن 1: (مربّع)</w:t>
+        <w:t>لحن 1: ‏(مربّع)‏</w:t>
         <w:br/>
         <w:t>```</w:t>
       </w:r>
@@ -15263,7 +15263,7 @@
           <w:rFonts w:cs="Calibri"/>
           <w:szCs w:val="22"/>
         </w:rPr>
-        <w:t>(كلها Noire - اضغط 3 ثم اكتب)</w:t>
+        <w:t>‏(كلها Noire - اضغط 3 ثم اكتب)‏</w:t>
       </w:r>
     </w:p>
     <w:p>
@@ -15283,7 +15283,7 @@
           <w:szCs w:val="18"/>
         </w:rPr>
         <w:br/>
-        <w:t>لحن 2: (تصاعدي تنازلي)</w:t>
+        <w:t>لحن 2: ‏(تصاعدي تنازلي)‏</w:t>
       </w:r>
     </w:p>
     <w:p>
@@ -15301,7 +15301,7 @@
           <w:rFonts w:cs="Calibri"/>
           <w:szCs w:val="22"/>
         </w:rPr>
-        <w:t>(Noire - استخدم - للسكتة)</w:t>
+        <w:t>‏(Noire - استخدم - للسكتة)‏</w:t>
       </w:r>
     </w:p>
     <w:p>
@@ -15321,15 +15321,15 @@
           <w:szCs w:val="18"/>
         </w:rPr>
         <w:br/>
-        <w:t>#### تمرين 4: إدخال النوتة بالأسهم (5 دقائق)</w:t>
+        <w:t>#### تمرين 4: إدخال النوتة بالأسهم ‏(5 دقائق)‏</w:t>
         <w:br/>
         <w:t>1. اضغط N → اختر Noire</w:t>
         <w:br/>
-        <w:t>2. اكتب C (تظهر Do)</w:t>
+        <w:t>2. اكتب C ‏(تظهر Do)‏</w:t>
         <w:br/>
-        <w:t>3. استخدم ↑ (سهم فوق) لرفع النوتة درجة درجة</w:t>
+        <w:t>3. استخدم ↑ ‏(سهم فوق)‏ لرفع النوتة درجة درجة</w:t>
         <w:br/>
-        <w:t>4. استخدم ↓ (سهم تحت) لخفض النوتة</w:t>
+        <w:t>4. استخدم ↓ ‏(سهم تحت)‏ لخفض النوتة</w:t>
         <w:br/>
         <w:t>5. جرب: اكتب C ثم اضغط ↑ حتى تصل إلى G</w:t>
         <w:br/>
@@ -15337,7 +15337,7 @@
         <w:t>---</w:t>
         <w:br/>
         <w:br/>
-        <w:t>### 3. اختصارات Sibelius (5 min)</w:t>
+        <w:t>### 3. اختصارات Sibelius ‏(5 min)‏</w:t>
         <w:br/>
         <w:br/>
         <w:t>| # | الاختصار | الوظيفة | Function |</w:t>
@@ -15358,7 +15358,7 @@
         <w:t>---</w:t>
         <w:br/>
         <w:br/>
-        <w:t>### 4. مراجعة وواجب | Review &amp; HW (5 min)</w:t>
+        <w:t>### 4. مراجعة وواجب | Review &amp; HW ‏(5 min)‏</w:t>
         <w:br/>
         <w:br/>
         <w:t>#### أسئلة المراجعة</w:t>
@@ -15372,13 +15372,13 @@
         <w:br/>
         <w:t>#### الواجب المنزلي</w:t>
         <w:br/>
-        <w:t>1. أنشئ نوتة جديدة (Treble Clef, 4/4)</w:t>
+        <w:t>1. أنشئ نوتة جديدة ‏(Treble Clef, 4/4)‏</w:t>
         <w:br/>
-        <w:t>2. اكتب 16 مازورة باستخدام الحروف فقط (بدون ماوس):</w:t>
+        <w:t>2. اكتب 16 مازورة باستخدام الحروف فقط ‏(بدون ماوس)‏:</w:t>
         <w:br/>
-        <w:t xml:space="preserve">   - مازورة 1-4: سلم Do كبير (تصاعدي وتنازلي)</w:t>
+        <w:t xml:space="preserve">   - مازورة 1-4: سلم Do كبير ‏(تصاعدي وتنازلي)‏</w:t>
         <w:br/>
-        <w:t xml:space="preserve">   - مازورة 5-8: لحن من اختيارك (استخدم C D E F G A B)</w:t>
+        <w:t xml:space="preserve">   - مازورة 5-8: لحن من اختيارك ‏(استخدم C D E F G A B)‏</w:t>
         <w:br/>
         <w:t xml:space="preserve">   - مازورة 9-12: كرر المازورات 1-4</w:t>
         <w:br/>
@@ -15396,7 +15396,7 @@
         <w:br/>
         <w:t>- تمرين: اعزف سلم Do كبير على العود، وركز على أسماء النوتات بالإنجليزية:</w:t>
         <w:br/>
-        <w:t xml:space="preserve">  - C (Do) – D (Re) – E (Mi) – F (Fa) – G (Sol) – A (La) – B (Si) – C (Do)</w:t>
+        <w:t xml:space="preserve">  - C ‏(Do)‏ – D ‏(Re)‏ – E ‏(Mi)‏ – F ‏(Fa)‏ – G ‏(Sol)‏ – A ‏(La)‏ – B ‏(Si)‏ – C ‏(Do)‏</w:t>
         <w:br/>
         <w:t>- تعلم ربط اسم الحرف بالصوت</w:t>
         <w:br/>
@@ -15437,7 +15437,7 @@
         <w:br/>
         <w:t>| أوكتاف | Octave |</w:t>
         <w:br/>
-        <w:t>| ارتفاع (طبقة) | Pitch |</w:t>
+        <w:t>| ارتفاع ‏(طبقة)‏ | Pitch |</w:t>
         <w:br/>
         <w:t>| علامة إدخال | Input Cursor |</w:t>
         <w:br/>
@@ -15803,7 +15803,7 @@
                 <w:rFonts w:cs="Calibri"/>
                 <w:szCs w:val="18"/>
               </w:rPr>
-              <w:t>لا يوجد (تقنيات تحرير)</w:t>
+              <w:t>لا يوجد ‏(تقنيات تحرير)‏</w:t>
             </w:r>
           </w:p>
         </w:tc>
@@ -15924,7 +15924,7 @@
           <w:rFonts w:cs="Calibri"/>
           <w:szCs w:val="22"/>
         </w:rPr>
-        <w:t>استخدام التكرار (Repeat) لتوفير الوقت</w:t>
+        <w:t>استخدام التكرار ‏(Repeat)‏ لتوفير الوقت</w:t>
       </w:r>
     </w:p>
     <w:p>
@@ -15960,7 +15960,7 @@
           <w:rFonts w:cs="Calibri"/>
           <w:szCs w:val="28"/>
         </w:rPr>
-        <w:t>1. النظري | Theory (10 min)</w:t>
+        <w:t>1. النظري | Theory ‏(10 min)‏</w:t>
       </w:r>
     </w:p>
     <w:p>
@@ -16463,7 +16463,7 @@
                 <w:rFonts w:cs="Calibri"/>
                 <w:szCs w:val="18"/>
               </w:rPr>
-              <w:t>اختيار نظام (Passage)</w:t>
+              <w:t>اختيار نظام ‏(Passage)‏</w:t>
             </w:r>
           </w:p>
         </w:tc>
@@ -16920,7 +16920,7 @@
                 <w:rFonts w:cs="Calibri"/>
                 <w:szCs w:val="18"/>
               </w:rPr>
-              <w:t>لصق مع خيارات (Alt+V)</w:t>
+              <w:t>لصق مع خيارات ‏(Alt+V)‏</w:t>
             </w:r>
           </w:p>
         </w:tc>
@@ -17012,7 +17012,7 @@
           <w:rFonts w:cs="Calibri"/>
           <w:szCs w:val="28"/>
         </w:rPr>
-        <w:t>2. التطبيق العملي | Practice (30 min)</w:t>
+        <w:t>2. التطبيق العملي | Practice ‏(30 min)‏</w:t>
       </w:r>
     </w:p>
     <w:p>
@@ -17031,7 +17031,7 @@
           <w:rFonts w:cs="Calibri"/>
           <w:szCs w:val="24"/>
         </w:rPr>
-        <w:t>تمرين 1: تحديد ونسخ (10 دقائق)</w:t>
+        <w:t>تمرين 1: تحديد ونسخ ‏(10 دقائق)‏</w:t>
       </w:r>
     </w:p>
     <w:p>
@@ -17084,7 +17084,7 @@
           <w:rFonts w:cs="Calibri"/>
           <w:szCs w:val="18"/>
         </w:rPr>
-        <w:t>| C D E F | (كلها Noire)</w:t>
+        <w:t>| C D E F | ‏(كلها Noire)‏</w:t>
       </w:r>
     </w:p>
     <w:p>
@@ -17118,7 +17118,7 @@
           <w:rFonts w:cs="Calibri"/>
           <w:szCs w:val="22"/>
         </w:rPr>
-        <w:t>• انقر على المازورة (المساحة الفارغة) ← تظلل باللون الأزرق</w:t>
+        <w:t>• انقر على المازورة ‏(المساحة الفارغة)‏ ← تظلل باللون الأزرق</w:t>
       </w:r>
     </w:p>
     <w:p>
@@ -17135,7 +17135,7 @@
           <w:rFonts w:cs="Calibri"/>
           <w:szCs w:val="22"/>
         </w:rPr>
-        <w:t>• اضغط Ctrl+C (نسخ)</w:t>
+        <w:t>• اضغط Ctrl+C ‏(نسخ)‏</w:t>
       </w:r>
     </w:p>
     <w:p>
@@ -17152,7 +17152,7 @@
           <w:rFonts w:cs="Calibri"/>
           <w:szCs w:val="22"/>
         </w:rPr>
-        <w:t>• انقر على المازورة 2 ← Ctrl+V (لصق)</w:t>
+        <w:t>• انقر على المازورة 2 ← Ctrl+V ‏(لصق)‏</w:t>
       </w:r>
     </w:p>
     <w:p>
@@ -17188,7 +17188,7 @@
           <w:rFonts w:cs="Calibri"/>
           <w:szCs w:val="24"/>
         </w:rPr>
-        <w:t>تمرين 2: لصق متعدد (10 دقائق)</w:t>
+        <w:t>تمرين 2: لصق متعدد ‏(10 دقائق)‏</w:t>
       </w:r>
     </w:p>
     <w:p>
@@ -17224,13 +17224,13 @@
           <w:rFonts w:cs="Calibri"/>
           <w:szCs w:val="18"/>
         </w:rPr>
-        <w:t>| C  D  E  F  | G  G  A  A  | B  B  C  C  | (Croche)</w:t>
+        <w:t>| C  D  E  F  | G  G  A  A  | B  B  C  C  | ‏(Croche)‏</w:t>
         <w:br/>
-        <w:t>(اختر Croche من Keypad واكتب: C D E F)</w:t>
+        <w:t>‏(اختر Croche من Keypad واكتب: C D E F)‏</w:t>
         <w:br/>
-        <w:t>(دون تغيير القيمة: G G A A)</w:t>
+        <w:t>‏(دون تغيير القيمة: G G A A)‏</w:t>
         <w:br/>
-        <w:t>(ثم B B C C)</w:t>
+        <w:t>‏(ثم B B C C)‏</w:t>
       </w:r>
     </w:p>
     <w:p>
@@ -17247,7 +17247,7 @@
           <w:rFonts w:cs="Calibri"/>
           <w:szCs w:val="22"/>
         </w:rPr>
-        <w:t>حدد المازورات 1-3 (Shift+Click للامتداد)</w:t>
+        <w:t>حدد المازورات 1-3 ‏(Shift+Click للامتداد)‏</w:t>
       </w:r>
     </w:p>
     <w:p>
@@ -17264,7 +17264,7 @@
           <w:rFonts w:cs="Calibri"/>
           <w:szCs w:val="22"/>
         </w:rPr>
-        <w:t>Ctrl+C (نسخ)</w:t>
+        <w:t>Ctrl+C ‏(نسخ)‏</w:t>
       </w:r>
     </w:p>
     <w:p>
@@ -17281,7 +17281,7 @@
           <w:rFonts w:cs="Calibri"/>
           <w:szCs w:val="22"/>
         </w:rPr>
-        <w:t>انقر على المازورة 4 ← Ctrl+V (لصق)</w:t>
+        <w:t>انقر على المازورة 4 ← Ctrl+V ‏(لصق)‏</w:t>
       </w:r>
     </w:p>
     <w:p>
@@ -17317,7 +17317,7 @@
           <w:rFonts w:cs="Calibri"/>
           <w:szCs w:val="24"/>
         </w:rPr>
-        <w:t>تمرين 3: استخدام التكرار مع 2/4 (10 دقائق)</w:t>
+        <w:t>تمرين 3: استخدام التكرار مع 2/4 ‏(10 دقائق)‏</w:t>
       </w:r>
     </w:p>
     <w:p>
@@ -17334,7 +17334,7 @@
           <w:rFonts w:cs="Calibri"/>
           <w:szCs w:val="22"/>
         </w:rPr>
-        <w:t>غير الميزان إلى 2/4 (Notations → Time Signature → 2/4)</w:t>
+        <w:t>غير الميزان إلى 2/4 ‏(Notations → Time Signature → 2/4)‏</w:t>
       </w:r>
     </w:p>
     <w:p>
@@ -17389,7 +17389,7 @@
           <w:rFonts w:cs="Calibri"/>
           <w:szCs w:val="22"/>
         </w:rPr>
-        <w:t>حدد المازورتين (من المازورة 1 للمازورة 2)</w:t>
+        <w:t>حدد المازورتين ‏(من المازورة 1 للمازورة 2)‏</w:t>
       </w:r>
     </w:p>
     <w:p>
@@ -17406,7 +17406,7 @@
           <w:rFonts w:cs="Calibri"/>
           <w:szCs w:val="22"/>
         </w:rPr>
-        <w:t>Ctrl+C ← Ctrl+V ثلاث مرات (للوصول للمازورة 8)</w:t>
+        <w:t>Ctrl+C ← Ctrl+V ثلاث مرات ‏(للوصول للمازورة 8)‏</w:t>
       </w:r>
     </w:p>
     <w:p>
@@ -17442,7 +17442,7 @@
           <w:rFonts w:cs="Calibri"/>
           <w:szCs w:val="24"/>
         </w:rPr>
-        <w:t>تمرين 4: Paste as Cue (5 دقائق)</w:t>
+        <w:t>تمرين 4: Paste as Cue ‏(5 دقائق)‏</w:t>
       </w:r>
     </w:p>
     <w:p>
@@ -17459,7 +17459,7 @@
           <w:rFonts w:cs="Calibri"/>
           <w:szCs w:val="22"/>
         </w:rPr>
-        <w:t>اكتب لحناً قصيراً (4 مازورات)</w:t>
+        <w:t>اكتب لحناً قصيراً ‏(4 مازورات)‏</w:t>
       </w:r>
     </w:p>
     <w:p>
@@ -17545,7 +17545,7 @@
           <w:rFonts w:cs="Calibri"/>
           <w:szCs w:val="22"/>
         </w:rPr>
-        <w:t xml:space="preserve">   (Cue Notes أصغر حجماً، تُستخدم للإشارات)</w:t>
+        <w:t xml:space="preserve">   ‏(Cue Notes أصغر حجماً، تُستخدم للإشارات)‏</w:t>
       </w:r>
     </w:p>
     <w:p>
@@ -17564,7 +17564,7 @@
           <w:rFonts w:cs="Calibri"/>
           <w:szCs w:val="28"/>
         </w:rPr>
-        <w:t>3. اختصارات Sibelius (5 min)</w:t>
+        <w:t>3. اختصارات Sibelius ‏(5 min)‏</w:t>
       </w:r>
     </w:p>
     <w:tbl>
@@ -18120,7 +18120,7 @@
                 <w:rFonts w:cs="Calibri"/>
                 <w:szCs w:val="18"/>
               </w:rPr>
-              <w:t>R (Repeat)</w:t>
+              <w:t>R ‏(Repeat)‏</w:t>
             </w:r>
           </w:p>
         </w:tc>
@@ -18188,7 +18188,7 @@
           <w:rFonts w:cs="Calibri"/>
           <w:szCs w:val="28"/>
         </w:rPr>
-        <w:t>4. مراجعة وواجب | Review &amp; HW (5 min)</w:t>
+        <w:t>4. مراجعة وواجب | Review &amp; HW ‏(5 min)‏</w:t>
       </w:r>
     </w:p>
     <w:p>
@@ -18294,7 +18294,7 @@
           <w:rFonts w:cs="Calibri"/>
           <w:szCs w:val="22"/>
         </w:rPr>
-        <w:t>أنشئ نوتة جديدة في 2/4 (Treble Clef)</w:t>
+        <w:t>أنشئ نوتة جديدة في 2/4 ‏(Treble Clef)‏</w:t>
       </w:r>
     </w:p>
     <w:p>
@@ -18328,7 +18328,7 @@
           <w:rFonts w:cs="Calibri"/>
           <w:szCs w:val="22"/>
         </w:rPr>
-        <w:t>• مازورة 1: C (Noire) - E (Noire)</w:t>
+        <w:t>• مازورة 1: C ‏(Noire)‏ - E ‏(Noire)‏</w:t>
       </w:r>
     </w:p>
     <w:p>
@@ -18345,7 +18345,7 @@
           <w:rFonts w:cs="Calibri"/>
           <w:szCs w:val="22"/>
         </w:rPr>
-        <w:t>• مازورة 2: G (Noire) - B (Noire)</w:t>
+        <w:t>• مازورة 2: G ‏(Noire)‏ - B ‏(Noire)‏</w:t>
       </w:r>
     </w:p>
     <w:p>
@@ -18379,7 +18379,7 @@
           <w:rFonts w:cs="Calibri"/>
           <w:szCs w:val="22"/>
         </w:rPr>
-        <w:t>عدّل المازورات 9-12 لتكون تنازلياً (C B A G...)</w:t>
+        <w:t>عدّل المازورات 9-12 لتكون تنازلياً ‏(C B A G...)‏</w:t>
       </w:r>
     </w:p>
     <w:p>
@@ -18449,7 +18449,7 @@
           <w:rFonts w:cs="Calibri"/>
           <w:szCs w:val="22"/>
         </w:rPr>
-        <w:t>• C (نقرة) - E (نقرة) - G (نقرة) - C أعلى (نقرة)</w:t>
+        <w:t>• C ‏(نقرة)‏ - E ‏(نقرة)‏ - G ‏(نقرة)‏ - C أعلى ‏(نقرة)‏</w:t>
       </w:r>
     </w:p>
     <w:p>
@@ -18466,7 +18466,7 @@
           <w:rFonts w:cs="Calibri"/>
           <w:szCs w:val="22"/>
         </w:rPr>
-        <w:t>• كرر النمط 4 مرات (هذا تدريب على النسخ بالأداء)</w:t>
+        <w:t>• كرر النمط 4 مرات ‏(هذا تدريب على النسخ بالأداء)‏</w:t>
       </w:r>
     </w:p>
     <w:p>
@@ -19339,7 +19339,7 @@
           <w:rFonts w:cs="Calibri"/>
           <w:szCs w:val="22"/>
         </w:rPr>
-        <w:t>• اشرح أن R (Repeat) تكرر آخر إجراء وليس آخر نوتة</w:t>
+        <w:t>• اشرح أن R ‏(Repeat)‏ تكرر آخر إجراء وليس آخر نوتة</w:t>
       </w:r>
     </w:p>
     <w:p>
@@ -19737,7 +19737,7 @@
                 <w:rFonts w:cs="Calibri"/>
                 <w:szCs w:val="18"/>
               </w:rPr>
-              <w:t>لا يوجد (تعبير موسيقي)</w:t>
+              <w:t>لا يوجد ‏(تعبير موسيقي)‏</w:t>
             </w:r>
           </w:p>
         </w:tc>
@@ -19824,7 +19824,7 @@
           <w:rFonts w:cs="Calibri"/>
           <w:szCs w:val="22"/>
         </w:rPr>
-        <w:t>فهم الديناميكيات (مستوى الصوت) ورموزها</w:t>
+        <w:t>فهم الديناميكيات ‏(مستوى الصوت)‏ ورموزها</w:t>
       </w:r>
     </w:p>
     <w:p>
@@ -19875,7 +19875,7 @@
           <w:rFonts w:cs="Calibri"/>
           <w:szCs w:val="22"/>
         </w:rPr>
-        <w:t>إضافة علامات التعبير (Expressions)</w:t>
+        <w:t>إضافة علامات التعبير ‏(Expressions)‏</w:t>
       </w:r>
     </w:p>
     <w:p>
@@ -19894,7 +19894,7 @@
           <w:rFonts w:cs="Calibri"/>
           <w:szCs w:val="28"/>
         </w:rPr>
-        <w:t>1. النظري | Theory (10 min)</w:t>
+        <w:t>1. النظري | Theory ‏(10 min)‏</w:t>
       </w:r>
     </w:p>
     <w:p>
@@ -19913,7 +19913,7 @@
           <w:rFonts w:cs="Calibri"/>
           <w:szCs w:val="24"/>
         </w:rPr>
-        <w:t>الديناميكيات (Dynamics)</w:t>
+        <w:t>الديناميكيات ‏(Dynamics)‏</w:t>
       </w:r>
     </w:p>
     <w:p>
@@ -20749,7 +20749,7 @@
           <w:rFonts w:cs="Calibri"/>
           <w:szCs w:val="24"/>
         </w:rPr>
-        <w:t>علامات التعبير (Articulation Marks)</w:t>
+        <w:t>علامات التعبير ‏(Articulation Marks)‏</w:t>
       </w:r>
     </w:p>
     <w:tbl>
@@ -21229,7 +21229,7 @@
           <w:rFonts w:cs="Calibri"/>
           <w:szCs w:val="28"/>
         </w:rPr>
-        <w:t>2. التطبيق العملي | Practice (30 min)</w:t>
+        <w:t>2. التطبيق العملي | Practice ‏(30 min)‏</w:t>
       </w:r>
     </w:p>
     <w:p>
@@ -21248,7 +21248,7 @@
           <w:rFonts w:cs="Calibri"/>
           <w:szCs w:val="24"/>
         </w:rPr>
-        <w:t>تمرين 1: إضافة ديناميكيات (10 دقائق)</w:t>
+        <w:t>تمرين 1: إضافة ديناميكيات ‏(10 دقائق)‏</w:t>
       </w:r>
     </w:p>
     <w:p>
@@ -21282,7 +21282,7 @@
           <w:rFonts w:cs="Calibri"/>
           <w:szCs w:val="22"/>
         </w:rPr>
-        <w:t>اكتب سلم Do كبير (C D E F G A B C) مع Noire</w:t>
+        <w:t>اكتب سلم Do كبير ‏(C D E F G A B C)‏ مع Noire</w:t>
       </w:r>
     </w:p>
     <w:p>
@@ -21333,7 +21333,7 @@
           <w:rFonts w:cs="Calibri"/>
           <w:szCs w:val="22"/>
         </w:rPr>
-        <w:t>• اختر p وضع تحت أول نوتة (C)</w:t>
+        <w:t>• اختر p وضع تحت أول نوتة ‏(C)‏</w:t>
       </w:r>
     </w:p>
     <w:p>
@@ -21350,7 +21350,7 @@
           <w:rFonts w:cs="Calibri"/>
           <w:szCs w:val="22"/>
         </w:rPr>
-        <w:t>• اختر mf وضع تحت النوتة الخامسة (G)</w:t>
+        <w:t>• اختر mf وضع تحت النوتة الخامسة ‏(G)‏</w:t>
       </w:r>
     </w:p>
     <w:p>
@@ -21367,7 +21367,7 @@
           <w:rFonts w:cs="Calibri"/>
           <w:szCs w:val="22"/>
         </w:rPr>
-        <w:t>• اختر f وضع تحت النوتة الأخيرة (C)</w:t>
+        <w:t>• اختر f وضع تحت النوتة الأخيرة ‏(C)‏</w:t>
       </w:r>
     </w:p>
     <w:p>
@@ -21389,9 +21389,9 @@
         <w:br/>
         <w:t>- حدد النوتة التي تريد إضافة ديناميك تحتها</w:t>
         <w:br/>
-        <w:t>- اضغط Ctrl+E (إضافة نص تعبيري)</w:t>
+        <w:t>- اضغط Ctrl+E ‏(إضافة نص تعبيري)‏</w:t>
         <w:br/>
-        <w:t>- اكتب: `p`, `mf`, `f` (يكتب Sibelius الرمز تلقائياً)</w:t>
+        <w:t>- اكتب: `p`, `mf`, `f` ‏(يكتب Sibelius الرمز تلقائياً)‏</w:t>
       </w:r>
     </w:p>
     <w:p>
@@ -21410,7 +21410,7 @@
           <w:rFonts w:cs="Calibri"/>
           <w:szCs w:val="24"/>
         </w:rPr>
-        <w:t>تمرين 2: Crescendo و Decrescendo (10 دقائق)</w:t>
+        <w:t>تمرين 2: Crescendo و Decrescendo ‏(10 دقائق)‏</w:t>
       </w:r>
     </w:p>
     <w:p>
@@ -21446,9 +21446,9 @@
           <w:rFonts w:cs="Calibri"/>
           <w:szCs w:val="18"/>
         </w:rPr>
-        <w:t>مازورة 1-2: C D E F | G A B C (Noire)</w:t>
+        <w:t>مازورة 1-2: C D E F | G A B C ‏(Noire)‏</w:t>
         <w:br/>
-        <w:t>مازورة 3-4: C B A G | F E D C (Noire)</w:t>
+        <w:t>مازورة 3-4: C B A G | F E D C ‏(Noire)‏</w:t>
       </w:r>
     </w:p>
     <w:p>
@@ -21482,7 +21482,7 @@
           <w:rFonts w:cs="Calibri"/>
           <w:szCs w:val="22"/>
         </w:rPr>
-        <w:t>• اختر Tab: Notations → Line → Hairpin (Crescendo)</w:t>
+        <w:t>• اختر Tab: Notations → Line → Hairpin ‏(Crescendo)‏</w:t>
       </w:r>
     </w:p>
     <w:p>
@@ -21550,7 +21550,7 @@
           <w:rFonts w:cs="Calibri"/>
           <w:szCs w:val="22"/>
         </w:rPr>
-        <w:t>• اضغط Shift+H (Decrescendo Hairpin)</w:t>
+        <w:t>• اضغط Shift+H ‏(Decrescendo Hairpin)‏</w:t>
       </w:r>
     </w:p>
     <w:p>
@@ -21603,7 +21603,7 @@
           <w:rFonts w:cs="Calibri"/>
           <w:szCs w:val="24"/>
         </w:rPr>
-        <w:t>تمرين 3: علامات التعبير (5 دقائق)</w:t>
+        <w:t>تمرين 3: علامات التعبير ‏(5 دقائق)‏</w:t>
       </w:r>
     </w:p>
     <w:p>
@@ -21639,11 +21639,11 @@
           <w:rFonts w:cs="Calibri"/>
           <w:szCs w:val="18"/>
         </w:rPr>
-        <w:t>مازورة 1: C D E F (Noire)</w:t>
+        <w:t>مازورة 1: C D E F ‏(Noire)‏</w:t>
         <w:br/>
-        <w:t>مازورة 2: G G G G (Croche)</w:t>
+        <w:t>مازورة 2: G G G G ‏(Croche)‏</w:t>
         <w:br/>
-        <w:t>مازورة 3: A B C - (Noire)</w:t>
+        <w:t>مازورة 3: A B C - ‏(Noire)‏</w:t>
       </w:r>
     </w:p>
     <w:p>
@@ -21764,7 +21764,7 @@
           <w:rFonts w:cs="Calibri"/>
           <w:szCs w:val="24"/>
         </w:rPr>
-        <w:t>تمرين 4: مقطوعة ديناميكية (5 دقائق)</w:t>
+        <w:t>تمرين 4: مقطوعة ديناميكية ‏(5 دقائق)‏</w:t>
       </w:r>
     </w:p>
     <w:p>
@@ -21786,13 +21786,13 @@
         <w:br/>
         <w:t>```</w:t>
         <w:br/>
-        <w:t>مازورة 1: pp → | C D E F | (هادئ جداً)</w:t>
+        <w:t>مازورة 1: pp → | C D E F | ‏(هادئ جداً)‏</w:t>
         <w:br/>
-        <w:t>مازورة 2: Crescendo | G A B C | (ازدياد)</w:t>
+        <w:t>مازورة 2: Crescendo | G A B C | ‏(ازدياد)‏</w:t>
         <w:br/>
-        <w:t>مازورة 3: f → | C B A G | (قوي)</w:t>
+        <w:t>مازورة 3: f → | C B A G | ‏(قوي)‏</w:t>
         <w:br/>
-        <w:t>مازورة 4: Decrescendo | F E D C | (انخفاض)</w:t>
+        <w:t>مازورة 4: Decrescendo | F E D C | ‏(انخفاض)‏</w:t>
         <w:br/>
         <w:t>```</w:t>
       </w:r>
@@ -21813,7 +21813,7 @@
           <w:rFonts w:cs="Calibri"/>
           <w:szCs w:val="28"/>
         </w:rPr>
-        <w:t>3. اختصارات Sibelius (5 min)</w:t>
+        <w:t>3. اختصارات Sibelius ‏(5 min)‏</w:t>
       </w:r>
     </w:p>
     <w:tbl>
@@ -22392,7 +22392,7 @@
                 <w:rFonts w:cs="Calibri"/>
                 <w:szCs w:val="18"/>
               </w:rPr>
-              <w:t>Fermata (نقطة استطالة)</w:t>
+              <w:t>Fermata ‏(نقطة استطالة)‏</w:t>
             </w:r>
           </w:p>
         </w:tc>
@@ -22437,7 +22437,7 @@
           <w:rFonts w:cs="Calibri"/>
           <w:szCs w:val="28"/>
         </w:rPr>
-        <w:t>4. مراجعة وواجب | Review &amp; HW (5 min)</w:t>
+        <w:t>4. مراجعة وواجب | Review &amp; HW ‏(5 min)‏</w:t>
       </w:r>
     </w:p>
     <w:p>
@@ -22543,7 +22543,7 @@
           <w:rFonts w:cs="Calibri"/>
           <w:szCs w:val="22"/>
         </w:rPr>
-        <w:t>أنشئ نوتة جديدة (Treble Clef, 4/4)</w:t>
+        <w:t>أنشئ نوتة جديدة ‏(Treble Clef, 4/4)‏</w:t>
       </w:r>
     </w:p>
     <w:p>
@@ -22628,7 +22628,7 @@
           <w:rFonts w:cs="Calibri"/>
           <w:szCs w:val="22"/>
         </w:rPr>
-        <w:t>• مازورة 7-8: Decrescendo + p (نهاية هادئة)</w:t>
+        <w:t>• مازورة 7-8: Decrescendo + p ‏(نهاية هادئة)‏</w:t>
       </w:r>
     </w:p>
     <w:p>
@@ -22732,7 +22732,7 @@
           <w:rFonts w:cs="Calibri"/>
           <w:szCs w:val="22"/>
         </w:rPr>
-        <w:t>• أولاً: بـ p (هدوء) ← صوت خفيف</w:t>
+        <w:t>• أولاً: بـ p ‏(هدوء)‏ ← صوت خفيف</w:t>
       </w:r>
     </w:p>
     <w:p>
@@ -22749,7 +22749,7 @@
           <w:rFonts w:cs="Calibri"/>
           <w:szCs w:val="22"/>
         </w:rPr>
-        <w:t>• ثانياً: بـ f (قوة) ← صوت قوي</w:t>
+        <w:t>• ثانياً: بـ f ‏(قوة)‏ ← صوت قوي</w:t>
       </w:r>
     </w:p>
     <w:p>
@@ -23306,7 +23306,7 @@
                 <w:rFonts w:cs="Calibri"/>
                 <w:szCs w:val="18"/>
               </w:rPr>
-              <w:t>Pianissimo (pp)</w:t>
+              <w:t>Pianissimo ‏(pp)‏</w:t>
             </w:r>
           </w:p>
         </w:tc>
@@ -23380,7 +23380,7 @@
                 <w:rFonts w:cs="Calibri"/>
                 <w:szCs w:val="18"/>
               </w:rPr>
-              <w:t>Piano (p)</w:t>
+              <w:t>Piano ‏(p)‏</w:t>
             </w:r>
           </w:p>
         </w:tc>
@@ -23451,7 +23451,7 @@
                 <w:rFonts w:cs="Calibri"/>
                 <w:szCs w:val="18"/>
               </w:rPr>
-              <w:t>Mezzo (m)</w:t>
+              <w:t>Mezzo ‏(m)‏</w:t>
             </w:r>
           </w:p>
         </w:tc>
@@ -23525,7 +23525,7 @@
                 <w:rFonts w:cs="Calibri"/>
                 <w:szCs w:val="18"/>
               </w:rPr>
-              <w:t>Forte (f)</w:t>
+              <w:t>Forte ‏(f)‏</w:t>
             </w:r>
           </w:p>
         </w:tc>
@@ -23596,7 +23596,7 @@
                 <w:rFonts w:cs="Calibri"/>
                 <w:szCs w:val="18"/>
               </w:rPr>
-              <w:t>Fortissimo (ff)</w:t>
+              <w:t>Fortissimo ‏(ff)‏</w:t>
             </w:r>
           </w:p>
         </w:tc>

</xml_diff>

<commit_message>
v3.1 DOCX: Remove #### heading markers, convert to bold text
- #### was being rendered as heading H4 (large bold title)
- Now renders as regular bold paragraph (same font size as body)
- No more '###' or '####' artifacts appearing in the document
- # character preserved only for musical sharp sign
</commit_message>
<xml_diff>
--- a/docx_output_v2/Sibelius-Semester1-Part1-Lessons-1-8.docx
+++ b/docx_output_v2/Sibelius-Semester1-Part1-Lessons-1-8.docx
@@ -914,19 +914,19 @@
     </w:p>
     <w:p>
       <w:pPr>
+        <w:bidi w:val="1"/>
         <w:jc w:val="right"/>
-        <w:bidi w:val="1"/>
         <w:textDirection w:val="lrTb"/>
       </w:pPr>
       <w:r>
         <w:rPr>
           <w:rFonts w:ascii="Calibri" w:hAnsi="Calibri"/>
           <w:b/>
-          <w:color w:val="445588"/>
-          <w:sz w:val="24"/>
+          <w:color w:val="333333"/>
+          <w:sz w:val="22"/>
           <w:rtl w:val="1"/>
           <w:rFonts w:cs="Calibri"/>
-          <w:szCs w:val="24"/>
+          <w:szCs w:val="22"/>
         </w:rPr>
         <w:t>ما هو التدوين الموسيقي؟</w:t>
       </w:r>
@@ -951,19 +951,19 @@
     </w:p>
     <w:p>
       <w:pPr>
+        <w:bidi w:val="1"/>
         <w:jc w:val="right"/>
-        <w:bidi w:val="1"/>
         <w:textDirection w:val="lrTb"/>
       </w:pPr>
       <w:r>
         <w:rPr>
           <w:rFonts w:ascii="Calibri" w:hAnsi="Calibri"/>
           <w:b/>
-          <w:color w:val="445588"/>
-          <w:sz w:val="24"/>
+          <w:color w:val="333333"/>
+          <w:sz w:val="22"/>
           <w:rtl w:val="1"/>
           <w:rFonts w:cs="Calibri"/>
-          <w:szCs w:val="24"/>
+          <w:szCs w:val="22"/>
         </w:rPr>
         <w:t>المدرج الموسيقي ‏(The Staff)‏</w:t>
       </w:r>
@@ -1021,19 +1021,19 @@
     </w:p>
     <w:p>
       <w:pPr>
+        <w:bidi w:val="1"/>
         <w:jc w:val="right"/>
-        <w:bidi w:val="1"/>
         <w:textDirection w:val="lrTb"/>
       </w:pPr>
       <w:r>
         <w:rPr>
           <w:rFonts w:ascii="Calibri" w:hAnsi="Calibri"/>
           <w:b/>
-          <w:color w:val="445588"/>
-          <w:sz w:val="24"/>
+          <w:color w:val="333333"/>
+          <w:sz w:val="22"/>
           <w:rtl w:val="1"/>
           <w:rFonts w:cs="Calibri"/>
-          <w:szCs w:val="24"/>
+          <w:szCs w:val="22"/>
         </w:rPr>
         <w:t>المفاتيح الموسيقية ‏(Clefs)‏</w:t>
       </w:r>
@@ -1074,19 +1074,19 @@
     </w:p>
     <w:p>
       <w:pPr>
+        <w:bidi w:val="1"/>
         <w:jc w:val="right"/>
-        <w:bidi w:val="1"/>
         <w:textDirection w:val="lrTb"/>
       </w:pPr>
       <w:r>
         <w:rPr>
           <w:rFonts w:ascii="Calibri" w:hAnsi="Calibri"/>
           <w:b/>
-          <w:color w:val="445588"/>
-          <w:sz w:val="24"/>
+          <w:color w:val="333333"/>
+          <w:sz w:val="22"/>
           <w:rtl w:val="1"/>
           <w:rFonts w:cs="Calibri"/>
-          <w:szCs w:val="24"/>
+          <w:szCs w:val="22"/>
         </w:rPr>
         <w:t>النوتات الأساسية</w:t>
       </w:r>
@@ -1146,19 +1146,19 @@
     </w:p>
     <w:p>
       <w:pPr>
+        <w:bidi w:val="1"/>
         <w:jc w:val="right"/>
-        <w:bidi w:val="1"/>
         <w:textDirection w:val="lrTb"/>
       </w:pPr>
       <w:r>
         <w:rPr>
           <w:rFonts w:ascii="Calibri" w:hAnsi="Calibri"/>
           <w:b/>
-          <w:color w:val="445588"/>
-          <w:sz w:val="24"/>
+          <w:color w:val="333333"/>
+          <w:sz w:val="22"/>
           <w:rtl w:val="1"/>
           <w:rFonts w:cs="Calibri"/>
-          <w:szCs w:val="24"/>
+          <w:szCs w:val="22"/>
         </w:rPr>
         <w:t>تمرين 1: فتح Sibelius ‏(5 دقائق)‏</w:t>
       </w:r>
@@ -1267,19 +1267,19 @@
     </w:p>
     <w:p>
       <w:pPr>
+        <w:bidi w:val="1"/>
         <w:jc w:val="right"/>
-        <w:bidi w:val="1"/>
         <w:textDirection w:val="lrTb"/>
       </w:pPr>
       <w:r>
         <w:rPr>
           <w:rFonts w:ascii="Calibri" w:hAnsi="Calibri"/>
           <w:b/>
-          <w:color w:val="445588"/>
-          <w:sz w:val="24"/>
+          <w:color w:val="333333"/>
+          <w:sz w:val="22"/>
           <w:rtl w:val="1"/>
           <w:rFonts w:cs="Calibri"/>
-          <w:szCs w:val="24"/>
+          <w:szCs w:val="22"/>
         </w:rPr>
         <w:t>تمرين 2: التعرف على واجهة Sibelius ‏(10 دقائق)‏</w:t>
       </w:r>
@@ -1316,19 +1316,19 @@
     </w:p>
     <w:p>
       <w:pPr>
+        <w:bidi w:val="1"/>
         <w:jc w:val="right"/>
-        <w:bidi w:val="1"/>
         <w:textDirection w:val="lrTb"/>
       </w:pPr>
       <w:r>
         <w:rPr>
           <w:rFonts w:ascii="Calibri" w:hAnsi="Calibri"/>
           <w:b/>
-          <w:color w:val="445588"/>
-          <w:sz w:val="24"/>
+          <w:color w:val="333333"/>
+          <w:sz w:val="22"/>
           <w:rtl w:val="1"/>
           <w:rFonts w:cs="Calibri"/>
-          <w:szCs w:val="24"/>
+          <w:szCs w:val="22"/>
         </w:rPr>
         <w:t>تمرين 3: كتابة أول نوتة ‏(10 دقائق)‏</w:t>
       </w:r>
@@ -1437,19 +1437,19 @@
     </w:p>
     <w:p>
       <w:pPr>
+        <w:bidi w:val="1"/>
         <w:jc w:val="right"/>
-        <w:bidi w:val="1"/>
         <w:textDirection w:val="lrTb"/>
       </w:pPr>
       <w:r>
         <w:rPr>
           <w:rFonts w:ascii="Calibri" w:hAnsi="Calibri"/>
           <w:b/>
-          <w:color w:val="445588"/>
-          <w:sz w:val="24"/>
+          <w:color w:val="333333"/>
+          <w:sz w:val="22"/>
           <w:rtl w:val="1"/>
           <w:rFonts w:cs="Calibri"/>
-          <w:szCs w:val="24"/>
+          <w:szCs w:val="22"/>
         </w:rPr>
         <w:t>تمرين 4: إضافة مفتاح صول ‏(5 دقائق)‏</w:t>
       </w:r>
@@ -2150,19 +2150,19 @@
     </w:p>
     <w:p>
       <w:pPr>
+        <w:bidi w:val="1"/>
         <w:jc w:val="right"/>
-        <w:bidi w:val="1"/>
         <w:textDirection w:val="lrTb"/>
       </w:pPr>
       <w:r>
         <w:rPr>
           <w:rFonts w:ascii="Calibri" w:hAnsi="Calibri"/>
           <w:b/>
-          <w:color w:val="445588"/>
-          <w:sz w:val="24"/>
+          <w:color w:val="333333"/>
+          <w:sz w:val="22"/>
           <w:rtl w:val="1"/>
           <w:rFonts w:cs="Calibri"/>
-          <w:szCs w:val="24"/>
+          <w:szCs w:val="22"/>
         </w:rPr>
         <w:t>أسئلة المراجعة</w:t>
       </w:r>
@@ -2220,19 +2220,19 @@
     </w:p>
     <w:p>
       <w:pPr>
+        <w:bidi w:val="1"/>
         <w:jc w:val="right"/>
-        <w:bidi w:val="1"/>
         <w:textDirection w:val="lrTb"/>
       </w:pPr>
       <w:r>
         <w:rPr>
           <w:rFonts w:ascii="Calibri" w:hAnsi="Calibri"/>
           <w:b/>
-          <w:color w:val="445588"/>
-          <w:sz w:val="24"/>
+          <w:color w:val="333333"/>
+          <w:sz w:val="22"/>
           <w:rtl w:val="1"/>
           <w:rFonts w:cs="Calibri"/>
-          <w:szCs w:val="24"/>
+          <w:szCs w:val="22"/>
         </w:rPr>
         <w:t>الواجب المنزلي</w:t>
       </w:r>
@@ -3841,19 +3841,19 @@
     </w:p>
     <w:p>
       <w:pPr>
+        <w:bidi w:val="1"/>
         <w:jc w:val="right"/>
-        <w:bidi w:val="1"/>
         <w:textDirection w:val="lrTb"/>
       </w:pPr>
       <w:r>
         <w:rPr>
           <w:rFonts w:ascii="Calibri" w:hAnsi="Calibri"/>
           <w:b/>
-          <w:color w:val="445588"/>
-          <w:sz w:val="24"/>
+          <w:color w:val="333333"/>
+          <w:sz w:val="22"/>
           <w:rtl w:val="1"/>
           <w:rFonts w:cs="Calibri"/>
-          <w:szCs w:val="24"/>
+          <w:szCs w:val="22"/>
         </w:rPr>
         <w:t>قيم النوتات ‏(Note Values)‏</w:t>
       </w:r>
@@ -4492,19 +4492,19 @@
     </w:tbl>
     <w:p>
       <w:pPr>
+        <w:bidi w:val="1"/>
         <w:jc w:val="right"/>
-        <w:bidi w:val="1"/>
         <w:textDirection w:val="lrTb"/>
       </w:pPr>
       <w:r>
         <w:rPr>
           <w:rFonts w:ascii="Calibri" w:hAnsi="Calibri"/>
           <w:b/>
-          <w:color w:val="445588"/>
-          <w:sz w:val="24"/>
+          <w:color w:val="333333"/>
+          <w:sz w:val="22"/>
           <w:rtl w:val="1"/>
           <w:rFonts w:cs="Calibri"/>
-          <w:szCs w:val="24"/>
+          <w:szCs w:val="22"/>
         </w:rPr>
         <w:t>الميزان 4/4 ‏(Time Signature)‏</w:t>
       </w:r>
@@ -4562,21 +4562,21 @@
     </w:p>
     <w:p>
       <w:pPr>
+        <w:bidi w:val="1"/>
         <w:jc w:val="right"/>
-        <w:bidi w:val="1"/>
         <w:textDirection w:val="lrTb"/>
       </w:pPr>
       <w:r>
         <w:rPr>
           <w:rFonts w:ascii="Calibri" w:hAnsi="Calibri"/>
           <w:b/>
-          <w:color w:val="445588"/>
-          <w:sz w:val="24"/>
+          <w:color w:val="333333"/>
+          <w:sz w:val="22"/>
           <w:rtl w:val="1"/>
           <w:rFonts w:cs="Calibri"/>
-          <w:szCs w:val="24"/>
+          <w:szCs w:val="22"/>
         </w:rPr>
-        <w:t>العلاقة بين القيم</w:t>
+        <w:t>العلاقة بين القيم:</w:t>
       </w:r>
     </w:p>
     <w:p>
@@ -4651,19 +4651,19 @@
     </w:p>
     <w:p>
       <w:pPr>
+        <w:bidi w:val="1"/>
         <w:jc w:val="right"/>
-        <w:bidi w:val="1"/>
         <w:textDirection w:val="lrTb"/>
       </w:pPr>
       <w:r>
         <w:rPr>
           <w:rFonts w:ascii="Calibri" w:hAnsi="Calibri"/>
           <w:b/>
-          <w:color w:val="445588"/>
-          <w:sz w:val="24"/>
+          <w:color w:val="333333"/>
+          <w:sz w:val="22"/>
           <w:rtl w:val="1"/>
           <w:rFonts w:cs="Calibri"/>
-          <w:szCs w:val="24"/>
+          <w:szCs w:val="22"/>
         </w:rPr>
         <w:t>تمرين 1: إدخال نوتات بقيم مختلفة ‏(10 دقائق)‏</w:t>
       </w:r>
@@ -5790,19 +5790,19 @@
     </w:p>
     <w:p>
       <w:pPr>
+        <w:bidi w:val="1"/>
         <w:jc w:val="right"/>
-        <w:bidi w:val="1"/>
         <w:textDirection w:val="lrTb"/>
       </w:pPr>
       <w:r>
         <w:rPr>
           <w:rFonts w:ascii="Calibri" w:hAnsi="Calibri"/>
           <w:b/>
-          <w:color w:val="445588"/>
-          <w:sz w:val="24"/>
+          <w:color w:val="333333"/>
+          <w:sz w:val="22"/>
           <w:rtl w:val="1"/>
           <w:rFonts w:cs="Calibri"/>
-          <w:szCs w:val="24"/>
+          <w:szCs w:val="22"/>
         </w:rPr>
         <w:t>السكتات ‏(Rests)‏</w:t>
       </w:r>
@@ -6338,19 +6338,19 @@
     </w:tbl>
     <w:p>
       <w:pPr>
+        <w:bidi w:val="1"/>
         <w:jc w:val="right"/>
-        <w:bidi w:val="1"/>
         <w:textDirection w:val="lrTb"/>
       </w:pPr>
       <w:r>
         <w:rPr>
           <w:rFonts w:ascii="Calibri" w:hAnsi="Calibri"/>
           <w:b/>
-          <w:color w:val="445588"/>
-          <w:sz w:val="24"/>
+          <w:color w:val="333333"/>
+          <w:sz w:val="22"/>
           <w:rtl w:val="1"/>
           <w:rFonts w:cs="Calibri"/>
-          <w:szCs w:val="24"/>
+          <w:szCs w:val="22"/>
         </w:rPr>
         <w:t>خطوط المازورة ‏(Bar Lines)‏</w:t>
       </w:r>
@@ -6961,19 +6961,19 @@
     </w:tbl>
     <w:p>
       <w:pPr>
+        <w:bidi w:val="1"/>
         <w:jc w:val="right"/>
-        <w:bidi w:val="1"/>
         <w:textDirection w:val="lrTb"/>
       </w:pPr>
       <w:r>
         <w:rPr>
           <w:rFonts w:ascii="Calibri" w:hAnsi="Calibri"/>
           <w:b/>
-          <w:color w:val="445588"/>
-          <w:sz w:val="24"/>
+          <w:color w:val="333333"/>
+          <w:sz w:val="22"/>
           <w:rtl w:val="1"/>
           <w:rFonts w:cs="Calibri"/>
-          <w:szCs w:val="24"/>
+          <w:szCs w:val="22"/>
         </w:rPr>
         <w:t>الميزان 3/4 ‏(Triple Meter)‏</w:t>
       </w:r>
@@ -7050,19 +7050,19 @@
     </w:p>
     <w:p>
       <w:pPr>
+        <w:bidi w:val="1"/>
         <w:jc w:val="right"/>
-        <w:bidi w:val="1"/>
         <w:textDirection w:val="lrTb"/>
       </w:pPr>
       <w:r>
         <w:rPr>
           <w:rFonts w:ascii="Calibri" w:hAnsi="Calibri"/>
           <w:b/>
-          <w:color w:val="445588"/>
-          <w:sz w:val="24"/>
+          <w:color w:val="333333"/>
+          <w:sz w:val="22"/>
           <w:rtl w:val="1"/>
           <w:rFonts w:cs="Calibri"/>
-          <w:szCs w:val="24"/>
+          <w:szCs w:val="22"/>
         </w:rPr>
         <w:t>تمرين 1: إدخال السكتات ‏(10 دقائق)‏</w:t>
       </w:r>
@@ -7180,19 +7180,19 @@
     </w:p>
     <w:p>
       <w:pPr>
+        <w:bidi w:val="1"/>
         <w:jc w:val="right"/>
-        <w:bidi w:val="1"/>
         <w:textDirection w:val="lrTb"/>
       </w:pPr>
       <w:r>
         <w:rPr>
           <w:rFonts w:ascii="Calibri" w:hAnsi="Calibri"/>
           <w:b/>
-          <w:color w:val="445588"/>
-          <w:sz w:val="24"/>
+          <w:color w:val="333333"/>
+          <w:sz w:val="22"/>
           <w:rtl w:val="1"/>
           <w:rFonts w:cs="Calibri"/>
-          <w:szCs w:val="24"/>
+          <w:szCs w:val="22"/>
         </w:rPr>
         <w:t>تمرين 2: جميع السكتات ‏(10 دقائق)‏</w:t>
       </w:r>
@@ -8134,19 +8134,19 @@
     </w:p>
     <w:p>
       <w:pPr>
+        <w:bidi w:val="1"/>
         <w:jc w:val="right"/>
-        <w:bidi w:val="1"/>
         <w:textDirection w:val="lrTb"/>
       </w:pPr>
       <w:r>
         <w:rPr>
           <w:rFonts w:ascii="Calibri" w:hAnsi="Calibri"/>
           <w:b/>
-          <w:color w:val="445588"/>
-          <w:sz w:val="24"/>
+          <w:color w:val="333333"/>
+          <w:sz w:val="22"/>
           <w:rtl w:val="1"/>
           <w:rFonts w:cs="Calibri"/>
-          <w:szCs w:val="24"/>
+          <w:szCs w:val="22"/>
         </w:rPr>
         <w:t>الخطوط الإضافية ‏(Ledger Lines)‏</w:t>
       </w:r>
@@ -8229,19 +8229,19 @@
     </w:p>
     <w:p>
       <w:pPr>
+        <w:bidi w:val="1"/>
         <w:jc w:val="right"/>
-        <w:bidi w:val="1"/>
         <w:textDirection w:val="lrTb"/>
       </w:pPr>
       <w:r>
         <w:rPr>
           <w:rFonts w:ascii="Calibri" w:hAnsi="Calibri"/>
           <w:b/>
-          <w:color w:val="445588"/>
-          <w:sz w:val="24"/>
+          <w:color w:val="333333"/>
+          <w:sz w:val="22"/>
           <w:rtl w:val="1"/>
           <w:rFonts w:cs="Calibri"/>
-          <w:szCs w:val="24"/>
+          <w:szCs w:val="22"/>
         </w:rPr>
         <w:t>العلامات العرضية ‏(Accidentals)‏</w:t>
       </w:r>
@@ -8661,19 +8661,19 @@
     </w:tbl>
     <w:p>
       <w:pPr>
+        <w:bidi w:val="1"/>
         <w:jc w:val="right"/>
-        <w:bidi w:val="1"/>
         <w:textDirection w:val="lrTb"/>
       </w:pPr>
       <w:r>
         <w:rPr>
           <w:rFonts w:ascii="Calibri" w:hAnsi="Calibri"/>
           <w:b/>
-          <w:color w:val="445588"/>
-          <w:sz w:val="24"/>
+          <w:color w:val="333333"/>
+          <w:sz w:val="22"/>
           <w:rtl w:val="1"/>
           <w:rFonts w:cs="Calibri"/>
-          <w:szCs w:val="24"/>
+          <w:szCs w:val="22"/>
         </w:rPr>
         <w:t>أنصاف الدرجات ‏(Half Steps / Semitones)‏</w:t>
       </w:r>
@@ -8733,19 +8733,19 @@
     </w:p>
     <w:p>
       <w:pPr>
+        <w:bidi w:val="1"/>
         <w:jc w:val="right"/>
-        <w:bidi w:val="1"/>
         <w:textDirection w:val="lrTb"/>
       </w:pPr>
       <w:r>
         <w:rPr>
           <w:rFonts w:ascii="Calibri" w:hAnsi="Calibri"/>
           <w:b/>
-          <w:color w:val="445588"/>
-          <w:sz w:val="24"/>
+          <w:color w:val="333333"/>
+          <w:sz w:val="22"/>
           <w:rtl w:val="1"/>
           <w:rFonts w:cs="Calibri"/>
-          <w:szCs w:val="24"/>
+          <w:szCs w:val="22"/>
         </w:rPr>
         <w:t>تمرين 1: الخطوط الإضافية ‏(10 دقائق)‏</w:t>
       </w:r>
@@ -8914,19 +8914,19 @@
     </w:p>
     <w:p>
       <w:pPr>
+        <w:bidi w:val="1"/>
         <w:jc w:val="right"/>
-        <w:bidi w:val="1"/>
         <w:textDirection w:val="lrTb"/>
       </w:pPr>
       <w:r>
         <w:rPr>
           <w:rFonts w:ascii="Calibri" w:hAnsi="Calibri"/>
           <w:b/>
-          <w:color w:val="445588"/>
-          <w:sz w:val="24"/>
+          <w:color w:val="333333"/>
+          <w:sz w:val="22"/>
           <w:rtl w:val="1"/>
           <w:rFonts w:cs="Calibri"/>
-          <w:szCs w:val="24"/>
+          <w:szCs w:val="22"/>
         </w:rPr>
         <w:t>تمرين 2: العلامات العرضية ‏(10 دقائق)‏</w:t>
       </w:r>
@@ -9901,19 +9901,19 @@
     </w:p>
     <w:p>
       <w:pPr>
+        <w:bidi w:val="1"/>
         <w:jc w:val="right"/>
-        <w:bidi w:val="1"/>
         <w:textDirection w:val="lrTb"/>
       </w:pPr>
       <w:r>
         <w:rPr>
           <w:rFonts w:ascii="Calibri" w:hAnsi="Calibri"/>
           <w:b/>
-          <w:color w:val="445588"/>
-          <w:sz w:val="24"/>
+          <w:color w:val="333333"/>
+          <w:sz w:val="22"/>
           <w:rtl w:val="1"/>
           <w:rFonts w:cs="Calibri"/>
-          <w:szCs w:val="24"/>
+          <w:szCs w:val="22"/>
         </w:rPr>
         <w:t>أجزاء واجهة Sibelius</w:t>
       </w:r>
@@ -10433,19 +10433,19 @@
     </w:tbl>
     <w:p>
       <w:pPr>
+        <w:bidi w:val="1"/>
         <w:jc w:val="right"/>
-        <w:bidi w:val="1"/>
         <w:textDirection w:val="lrTb"/>
       </w:pPr>
       <w:r>
         <w:rPr>
           <w:rFonts w:ascii="Calibri" w:hAnsi="Calibri"/>
           <w:b/>
-          <w:color w:val="445588"/>
-          <w:sz w:val="24"/>
+          <w:color w:val="333333"/>
+          <w:sz w:val="22"/>
           <w:rtl w:val="1"/>
           <w:rFonts w:cs="Calibri"/>
-          <w:szCs w:val="24"/>
+          <w:szCs w:val="22"/>
         </w:rPr>
         <w:t>تبويبات Ribbon الرئيسية</w:t>
       </w:r>
@@ -10984,19 +10984,19 @@
     </w:p>
     <w:p>
       <w:pPr>
+        <w:bidi w:val="1"/>
         <w:jc w:val="right"/>
-        <w:bidi w:val="1"/>
         <w:textDirection w:val="lrTb"/>
       </w:pPr>
       <w:r>
         <w:rPr>
           <w:rFonts w:ascii="Calibri" w:hAnsi="Calibri"/>
           <w:b/>
-          <w:color w:val="445588"/>
-          <w:sz w:val="24"/>
+          <w:color w:val="333333"/>
+          <w:sz w:val="22"/>
           <w:rtl w:val="1"/>
           <w:rFonts w:cs="Calibri"/>
-          <w:szCs w:val="24"/>
+          <w:szCs w:val="22"/>
         </w:rPr>
         <w:t>تمرين 1: استكشاف الواجهة ‏(10 دقائق)‏</w:t>
       </w:r>
@@ -11122,19 +11122,19 @@
     </w:p>
     <w:p>
       <w:pPr>
+        <w:bidi w:val="1"/>
         <w:jc w:val="right"/>
-        <w:bidi w:val="1"/>
         <w:textDirection w:val="lrTb"/>
       </w:pPr>
       <w:r>
         <w:rPr>
           <w:rFonts w:ascii="Calibri" w:hAnsi="Calibri"/>
           <w:b/>
-          <w:color w:val="445588"/>
-          <w:sz w:val="24"/>
+          <w:color w:val="333333"/>
+          <w:sz w:val="22"/>
           <w:rtl w:val="1"/>
           <w:rFonts w:cs="Calibri"/>
-          <w:szCs w:val="24"/>
+          <w:szCs w:val="22"/>
         </w:rPr>
         <w:t>تمرين 2: استخدام Keypad المتقدم ‏(10 دقائق)‏</w:t>
       </w:r>
@@ -11247,19 +11247,19 @@
     </w:p>
     <w:p>
       <w:pPr>
+        <w:bidi w:val="1"/>
         <w:jc w:val="right"/>
-        <w:bidi w:val="1"/>
         <w:textDirection w:val="lrTb"/>
       </w:pPr>
       <w:r>
         <w:rPr>
           <w:rFonts w:ascii="Calibri" w:hAnsi="Calibri"/>
           <w:b/>
-          <w:color w:val="445588"/>
-          <w:sz w:val="24"/>
+          <w:color w:val="333333"/>
+          <w:sz w:val="22"/>
           <w:rtl w:val="1"/>
           <w:rFonts w:cs="Calibri"/>
-          <w:szCs w:val="24"/>
+          <w:szCs w:val="22"/>
         </w:rPr>
         <w:t>تمرين 3: تخصيص Quick Access Toolbar ‏(5 دقائق)‏</w:t>
       </w:r>
@@ -11334,19 +11334,19 @@
     </w:p>
     <w:p>
       <w:pPr>
+        <w:bidi w:val="1"/>
         <w:jc w:val="right"/>
-        <w:bidi w:val="1"/>
         <w:textDirection w:val="lrTb"/>
       </w:pPr>
       <w:r>
         <w:rPr>
           <w:rFonts w:ascii="Calibri" w:hAnsi="Calibri"/>
           <w:b/>
-          <w:color w:val="445588"/>
-          <w:sz w:val="24"/>
+          <w:color w:val="333333"/>
+          <w:sz w:val="22"/>
           <w:rtl w:val="1"/>
           <w:rFonts w:cs="Calibri"/>
-          <w:szCs w:val="24"/>
+          <w:szCs w:val="22"/>
         </w:rPr>
         <w:t>تمرين 4: التنقل في النوتة ‏(5 دقائق)‏</w:t>
       </w:r>
@@ -12265,19 +12265,19 @@
     </w:p>
     <w:p>
       <w:pPr>
+        <w:bidi w:val="1"/>
         <w:jc w:val="right"/>
-        <w:bidi w:val="1"/>
         <w:textDirection w:val="lrTb"/>
       </w:pPr>
       <w:r>
         <w:rPr>
           <w:rFonts w:ascii="Calibri" w:hAnsi="Calibri"/>
           <w:b/>
-          <w:color w:val="445588"/>
-          <w:sz w:val="24"/>
+          <w:color w:val="333333"/>
+          <w:sz w:val="22"/>
           <w:rtl w:val="1"/>
           <w:rFonts w:cs="Calibri"/>
-          <w:szCs w:val="24"/>
+          <w:szCs w:val="22"/>
         </w:rPr>
         <w:t>أسئلة المراجعة</w:t>
       </w:r>
@@ -12335,19 +12335,19 @@
     </w:p>
     <w:p>
       <w:pPr>
+        <w:bidi w:val="1"/>
         <w:jc w:val="right"/>
-        <w:bidi w:val="1"/>
         <w:textDirection w:val="lrTb"/>
       </w:pPr>
       <w:r>
         <w:rPr>
           <w:rFonts w:ascii="Calibri" w:hAnsi="Calibri"/>
           <w:b/>
-          <w:color w:val="445588"/>
-          <w:sz w:val="24"/>
+          <w:color w:val="333333"/>
+          <w:sz w:val="22"/>
           <w:rtl w:val="1"/>
           <w:rFonts w:cs="Calibri"/>
-          <w:szCs w:val="24"/>
+          <w:szCs w:val="22"/>
         </w:rPr>
         <w:t>الواجب المنزلي</w:t>
       </w:r>
@@ -13971,19 +13971,19 @@
     </w:p>
     <w:p>
       <w:pPr>
+        <w:bidi w:val="1"/>
         <w:jc w:val="right"/>
-        <w:bidi w:val="1"/>
         <w:textDirection w:val="lrTb"/>
       </w:pPr>
       <w:r>
         <w:rPr>
           <w:rFonts w:ascii="Calibri" w:hAnsi="Calibri"/>
           <w:b/>
-          <w:color w:val="445588"/>
-          <w:sz w:val="24"/>
+          <w:color w:val="333333"/>
+          <w:sz w:val="22"/>
           <w:rtl w:val="1"/>
           <w:rFonts w:cs="Calibri"/>
-          <w:szCs w:val="24"/>
+          <w:szCs w:val="22"/>
         </w:rPr>
         <w:t>إدخال النوتة بالحروف ‏(Alphabetical Input)‏</w:t>
       </w:r>
@@ -14614,19 +14614,19 @@
     </w:tbl>
     <w:p>
       <w:pPr>
+        <w:bidi w:val="1"/>
         <w:jc w:val="right"/>
-        <w:bidi w:val="1"/>
         <w:textDirection w:val="lrTb"/>
       </w:pPr>
       <w:r>
         <w:rPr>
           <w:rFonts w:ascii="Calibri" w:hAnsi="Calibri"/>
           <w:b/>
-          <w:color w:val="445588"/>
-          <w:sz w:val="24"/>
+          <w:color w:val="333333"/>
+          <w:sz w:val="22"/>
           <w:rtl w:val="1"/>
           <w:rFonts w:cs="Calibri"/>
-          <w:szCs w:val="24"/>
+          <w:szCs w:val="22"/>
         </w:rPr>
         <w:t>Step Time Input</w:t>
       </w:r>
@@ -14659,19 +14659,19 @@
     </w:p>
     <w:p>
       <w:pPr>
+        <w:bidi w:val="1"/>
         <w:jc w:val="right"/>
-        <w:bidi w:val="1"/>
         <w:textDirection w:val="lrTb"/>
       </w:pPr>
       <w:r>
         <w:rPr>
           <w:rFonts w:ascii="Calibri" w:hAnsi="Calibri"/>
           <w:b/>
-          <w:color w:val="445588"/>
-          <w:sz w:val="24"/>
+          <w:color w:val="333333"/>
+          <w:sz w:val="22"/>
           <w:rtl w:val="1"/>
           <w:rFonts w:cs="Calibri"/>
-          <w:szCs w:val="24"/>
+          <w:szCs w:val="22"/>
         </w:rPr>
         <w:t>إدخال أوكتافات مختلفة</w:t>
       </w:r>
@@ -14766,19 +14766,19 @@
     </w:p>
     <w:p>
       <w:pPr>
+        <w:bidi w:val="1"/>
         <w:jc w:val="right"/>
-        <w:bidi w:val="1"/>
         <w:textDirection w:val="lrTb"/>
       </w:pPr>
       <w:r>
         <w:rPr>
           <w:rFonts w:ascii="Calibri" w:hAnsi="Calibri"/>
           <w:b/>
-          <w:color w:val="445588"/>
-          <w:sz w:val="24"/>
+          <w:color w:val="333333"/>
+          <w:sz w:val="22"/>
           <w:rtl w:val="1"/>
           <w:rFonts w:cs="Calibri"/>
-          <w:szCs w:val="24"/>
+          <w:szCs w:val="22"/>
         </w:rPr>
         <w:t>تمرين 1: إدخال سلم Do الكبير ‏(5 دقائق)‏</w:t>
       </w:r>
@@ -14870,19 +14870,19 @@
     </w:p>
     <w:p>
       <w:pPr>
+        <w:bidi w:val="1"/>
         <w:jc w:val="right"/>
-        <w:bidi w:val="1"/>
         <w:textDirection w:val="lrTb"/>
       </w:pPr>
       <w:r>
         <w:rPr>
           <w:rFonts w:ascii="Calibri" w:hAnsi="Calibri"/>
           <w:b/>
-          <w:color w:val="445588"/>
-          <w:sz w:val="24"/>
+          <w:color w:val="333333"/>
+          <w:sz w:val="22"/>
           <w:rtl w:val="1"/>
           <w:rFonts w:cs="Calibri"/>
-          <w:szCs w:val="24"/>
+          <w:szCs w:val="22"/>
         </w:rPr>
         <w:t>تمرين 2: إدخال بقيم مختلفة ‏(10 دقائق)‏</w:t>
       </w:r>
@@ -14972,19 +14972,19 @@
     </w:p>
     <w:p>
       <w:pPr>
+        <w:bidi w:val="1"/>
         <w:jc w:val="right"/>
-        <w:bidi w:val="1"/>
         <w:textDirection w:val="lrTb"/>
       </w:pPr>
       <w:r>
         <w:rPr>
           <w:rFonts w:ascii="Calibri" w:hAnsi="Calibri"/>
           <w:b/>
-          <w:color w:val="445588"/>
-          <w:sz w:val="24"/>
+          <w:color w:val="333333"/>
+          <w:sz w:val="22"/>
           <w:rtl w:val="1"/>
           <w:rFonts w:cs="Calibri"/>
-          <w:szCs w:val="24"/>
+          <w:szCs w:val="22"/>
         </w:rPr>
         <w:t>تمرين 3: ألحان بسيطة ‏(10 دقائق)‏</w:t>
       </w:r>
@@ -15965,19 +15965,19 @@
     </w:p>
     <w:p>
       <w:pPr>
+        <w:bidi w:val="1"/>
         <w:jc w:val="right"/>
-        <w:bidi w:val="1"/>
         <w:textDirection w:val="lrTb"/>
       </w:pPr>
       <w:r>
         <w:rPr>
           <w:rFonts w:ascii="Calibri" w:hAnsi="Calibri"/>
           <w:b/>
-          <w:color w:val="445588"/>
-          <w:sz w:val="24"/>
+          <w:color w:val="333333"/>
+          <w:sz w:val="22"/>
           <w:rtl w:val="1"/>
           <w:rFonts w:cs="Calibri"/>
-          <w:szCs w:val="24"/>
+          <w:szCs w:val="22"/>
         </w:rPr>
         <w:t>طرق التحديد في Sibelius</w:t>
       </w:r>
@@ -16519,19 +16519,19 @@
     </w:tbl>
     <w:p>
       <w:pPr>
+        <w:bidi w:val="1"/>
         <w:jc w:val="right"/>
-        <w:bidi w:val="1"/>
         <w:textDirection w:val="lrTb"/>
       </w:pPr>
       <w:r>
         <w:rPr>
           <w:rFonts w:ascii="Calibri" w:hAnsi="Calibri"/>
           <w:b/>
-          <w:color w:val="445588"/>
-          <w:sz w:val="24"/>
+          <w:color w:val="333333"/>
+          <w:sz w:val="22"/>
           <w:rtl w:val="1"/>
           <w:rFonts w:cs="Calibri"/>
-          <w:szCs w:val="24"/>
+          <w:szCs w:val="22"/>
         </w:rPr>
         <w:t>النسخ واللصق</w:t>
       </w:r>
@@ -16928,19 +16928,19 @@
     </w:tbl>
     <w:p>
       <w:pPr>
+        <w:bidi w:val="1"/>
         <w:jc w:val="right"/>
-        <w:bidi w:val="1"/>
         <w:textDirection w:val="lrTb"/>
       </w:pPr>
       <w:r>
         <w:rPr>
           <w:rFonts w:ascii="Calibri" w:hAnsi="Calibri"/>
           <w:b/>
-          <w:color w:val="445588"/>
-          <w:sz w:val="24"/>
+          <w:color w:val="333333"/>
+          <w:sz w:val="22"/>
           <w:rtl w:val="1"/>
           <w:rFonts w:cs="Calibri"/>
-          <w:szCs w:val="24"/>
+          <w:szCs w:val="22"/>
         </w:rPr>
         <w:t>ميزان 2/4</w:t>
       </w:r>
@@ -17017,19 +17017,19 @@
     </w:p>
     <w:p>
       <w:pPr>
+        <w:bidi w:val="1"/>
         <w:jc w:val="right"/>
-        <w:bidi w:val="1"/>
         <w:textDirection w:val="lrTb"/>
       </w:pPr>
       <w:r>
         <w:rPr>
           <w:rFonts w:ascii="Calibri" w:hAnsi="Calibri"/>
           <w:b/>
-          <w:color w:val="445588"/>
-          <w:sz w:val="24"/>
+          <w:color w:val="333333"/>
+          <w:sz w:val="22"/>
           <w:rtl w:val="1"/>
           <w:rFonts w:cs="Calibri"/>
-          <w:szCs w:val="24"/>
+          <w:szCs w:val="22"/>
         </w:rPr>
         <w:t>تمرين 1: تحديد ونسخ ‏(10 دقائق)‏</w:t>
       </w:r>
@@ -17174,19 +17174,19 @@
     </w:p>
     <w:p>
       <w:pPr>
+        <w:bidi w:val="1"/>
         <w:jc w:val="right"/>
-        <w:bidi w:val="1"/>
         <w:textDirection w:val="lrTb"/>
       </w:pPr>
       <w:r>
         <w:rPr>
           <w:rFonts w:ascii="Calibri" w:hAnsi="Calibri"/>
           <w:b/>
-          <w:color w:val="445588"/>
-          <w:sz w:val="24"/>
+          <w:color w:val="333333"/>
+          <w:sz w:val="22"/>
           <w:rtl w:val="1"/>
           <w:rFonts w:cs="Calibri"/>
-          <w:szCs w:val="24"/>
+          <w:szCs w:val="22"/>
         </w:rPr>
         <w:t>تمرين 2: لصق متعدد ‏(10 دقائق)‏</w:t>
       </w:r>
@@ -17303,19 +17303,19 @@
     </w:p>
     <w:p>
       <w:pPr>
+        <w:bidi w:val="1"/>
         <w:jc w:val="right"/>
-        <w:bidi w:val="1"/>
         <w:textDirection w:val="lrTb"/>
       </w:pPr>
       <w:r>
         <w:rPr>
           <w:rFonts w:ascii="Calibri" w:hAnsi="Calibri"/>
           <w:b/>
-          <w:color w:val="445588"/>
-          <w:sz w:val="24"/>
+          <w:color w:val="333333"/>
+          <w:sz w:val="22"/>
           <w:rtl w:val="1"/>
           <w:rFonts w:cs="Calibri"/>
-          <w:szCs w:val="24"/>
+          <w:szCs w:val="22"/>
         </w:rPr>
         <w:t>تمرين 3: استخدام التكرار مع 2/4 ‏(10 دقائق)‏</w:t>
       </w:r>
@@ -17428,19 +17428,19 @@
     </w:p>
     <w:p>
       <w:pPr>
+        <w:bidi w:val="1"/>
         <w:jc w:val="right"/>
-        <w:bidi w:val="1"/>
         <w:textDirection w:val="lrTb"/>
       </w:pPr>
       <w:r>
         <w:rPr>
           <w:rFonts w:ascii="Calibri" w:hAnsi="Calibri"/>
           <w:b/>
-          <w:color w:val="445588"/>
-          <w:sz w:val="24"/>
+          <w:color w:val="333333"/>
+          <w:sz w:val="22"/>
           <w:rtl w:val="1"/>
           <w:rFonts w:cs="Calibri"/>
-          <w:szCs w:val="24"/>
+          <w:szCs w:val="22"/>
         </w:rPr>
         <w:t>تمرين 4: Paste as Cue ‏(5 دقائق)‏</w:t>
       </w:r>
@@ -18193,19 +18193,19 @@
     </w:p>
     <w:p>
       <w:pPr>
+        <w:bidi w:val="1"/>
         <w:jc w:val="right"/>
-        <w:bidi w:val="1"/>
         <w:textDirection w:val="lrTb"/>
       </w:pPr>
       <w:r>
         <w:rPr>
           <w:rFonts w:ascii="Calibri" w:hAnsi="Calibri"/>
           <w:b/>
-          <w:color w:val="445588"/>
-          <w:sz w:val="24"/>
+          <w:color w:val="333333"/>
+          <w:sz w:val="22"/>
           <w:rtl w:val="1"/>
           <w:rFonts w:cs="Calibri"/>
-          <w:szCs w:val="24"/>
+          <w:szCs w:val="22"/>
         </w:rPr>
         <w:t>أسئلة المراجعة</w:t>
       </w:r>
@@ -18263,19 +18263,19 @@
     </w:p>
     <w:p>
       <w:pPr>
+        <w:bidi w:val="1"/>
         <w:jc w:val="right"/>
-        <w:bidi w:val="1"/>
         <w:textDirection w:val="lrTb"/>
       </w:pPr>
       <w:r>
         <w:rPr>
           <w:rFonts w:ascii="Calibri" w:hAnsi="Calibri"/>
           <w:b/>
-          <w:color w:val="445588"/>
-          <w:sz w:val="24"/>
+          <w:color w:val="333333"/>
+          <w:sz w:val="22"/>
           <w:rtl w:val="1"/>
           <w:rFonts w:cs="Calibri"/>
-          <w:szCs w:val="24"/>
+          <w:szCs w:val="22"/>
         </w:rPr>
         <w:t>الواجب المنزلي</w:t>
       </w:r>
@@ -19899,19 +19899,19 @@
     </w:p>
     <w:p>
       <w:pPr>
+        <w:bidi w:val="1"/>
         <w:jc w:val="right"/>
-        <w:bidi w:val="1"/>
         <w:textDirection w:val="lrTb"/>
       </w:pPr>
       <w:r>
         <w:rPr>
           <w:rFonts w:ascii="Calibri" w:hAnsi="Calibri"/>
           <w:b/>
-          <w:color w:val="445588"/>
-          <w:sz w:val="24"/>
+          <w:color w:val="333333"/>
+          <w:sz w:val="22"/>
           <w:rtl w:val="1"/>
           <w:rFonts w:cs="Calibri"/>
-          <w:szCs w:val="24"/>
+          <w:szCs w:val="22"/>
         </w:rPr>
         <w:t>الديناميكيات ‏(Dynamics)‏</w:t>
       </w:r>
@@ -20471,19 +20471,19 @@
     </w:tbl>
     <w:p>
       <w:pPr>
+        <w:bidi w:val="1"/>
         <w:jc w:val="right"/>
-        <w:bidi w:val="1"/>
         <w:textDirection w:val="lrTb"/>
       </w:pPr>
       <w:r>
         <w:rPr>
           <w:rFonts w:ascii="Calibri" w:hAnsi="Calibri"/>
           <w:b/>
-          <w:color w:val="445588"/>
-          <w:sz w:val="24"/>
+          <w:color w:val="333333"/>
+          <w:sz w:val="22"/>
           <w:rtl w:val="1"/>
           <w:rFonts w:cs="Calibri"/>
-          <w:szCs w:val="24"/>
+          <w:szCs w:val="22"/>
         </w:rPr>
         <w:t>تدرجات الصوت</w:t>
       </w:r>
@@ -20735,19 +20735,19 @@
     </w:tbl>
     <w:p>
       <w:pPr>
+        <w:bidi w:val="1"/>
         <w:jc w:val="right"/>
-        <w:bidi w:val="1"/>
         <w:textDirection w:val="lrTb"/>
       </w:pPr>
       <w:r>
         <w:rPr>
           <w:rFonts w:ascii="Calibri" w:hAnsi="Calibri"/>
           <w:b/>
-          <w:color w:val="445588"/>
-          <w:sz w:val="24"/>
+          <w:color w:val="333333"/>
+          <w:sz w:val="22"/>
           <w:rtl w:val="1"/>
           <w:rFonts w:cs="Calibri"/>
-          <w:szCs w:val="24"/>
+          <w:szCs w:val="22"/>
         </w:rPr>
         <w:t>علامات التعبير ‏(Articulation Marks)‏</w:t>
       </w:r>
@@ -21234,19 +21234,19 @@
     </w:p>
     <w:p>
       <w:pPr>
+        <w:bidi w:val="1"/>
         <w:jc w:val="right"/>
-        <w:bidi w:val="1"/>
         <w:textDirection w:val="lrTb"/>
       </w:pPr>
       <w:r>
         <w:rPr>
           <w:rFonts w:ascii="Calibri" w:hAnsi="Calibri"/>
           <w:b/>
-          <w:color w:val="445588"/>
-          <w:sz w:val="24"/>
+          <w:color w:val="333333"/>
+          <w:sz w:val="22"/>
           <w:rtl w:val="1"/>
           <w:rFonts w:cs="Calibri"/>
-          <w:szCs w:val="24"/>
+          <w:szCs w:val="22"/>
         </w:rPr>
         <w:t>تمرين 1: إضافة ديناميكيات ‏(10 دقائق)‏</w:t>
       </w:r>
@@ -21396,19 +21396,19 @@
     </w:p>
     <w:p>
       <w:pPr>
+        <w:bidi w:val="1"/>
         <w:jc w:val="right"/>
-        <w:bidi w:val="1"/>
         <w:textDirection w:val="lrTb"/>
       </w:pPr>
       <w:r>
         <w:rPr>
           <w:rFonts w:ascii="Calibri" w:hAnsi="Calibri"/>
           <w:b/>
-          <w:color w:val="445588"/>
-          <w:sz w:val="24"/>
+          <w:color w:val="333333"/>
+          <w:sz w:val="22"/>
           <w:rtl w:val="1"/>
           <w:rFonts w:cs="Calibri"/>
-          <w:szCs w:val="24"/>
+          <w:szCs w:val="22"/>
         </w:rPr>
         <w:t>تمرين 2: Crescendo و Decrescendo ‏(10 دقائق)‏</w:t>
       </w:r>
@@ -21589,19 +21589,19 @@
     </w:p>
     <w:p>
       <w:pPr>
+        <w:bidi w:val="1"/>
         <w:jc w:val="right"/>
-        <w:bidi w:val="1"/>
         <w:textDirection w:val="lrTb"/>
       </w:pPr>
       <w:r>
         <w:rPr>
           <w:rFonts w:ascii="Calibri" w:hAnsi="Calibri"/>
           <w:b/>
-          <w:color w:val="445588"/>
-          <w:sz w:val="24"/>
+          <w:color w:val="333333"/>
+          <w:sz w:val="22"/>
           <w:rtl w:val="1"/>
           <w:rFonts w:cs="Calibri"/>
-          <w:szCs w:val="24"/>
+          <w:szCs w:val="22"/>
         </w:rPr>
         <w:t>تمرين 3: علامات التعبير ‏(5 دقائق)‏</w:t>
       </w:r>
@@ -21750,19 +21750,19 @@
     </w:p>
     <w:p>
       <w:pPr>
+        <w:bidi w:val="1"/>
         <w:jc w:val="right"/>
-        <w:bidi w:val="1"/>
         <w:textDirection w:val="lrTb"/>
       </w:pPr>
       <w:r>
         <w:rPr>
           <w:rFonts w:ascii="Calibri" w:hAnsi="Calibri"/>
           <w:b/>
-          <w:color w:val="445588"/>
-          <w:sz w:val="24"/>
+          <w:color w:val="333333"/>
+          <w:sz w:val="22"/>
           <w:rtl w:val="1"/>
           <w:rFonts w:cs="Calibri"/>
-          <w:szCs w:val="24"/>
+          <w:szCs w:val="22"/>
         </w:rPr>
         <w:t>تمرين 4: مقطوعة ديناميكية ‏(5 دقائق)‏</w:t>
       </w:r>
@@ -22442,19 +22442,19 @@
     </w:p>
     <w:p>
       <w:pPr>
+        <w:bidi w:val="1"/>
         <w:jc w:val="right"/>
-        <w:bidi w:val="1"/>
         <w:textDirection w:val="lrTb"/>
       </w:pPr>
       <w:r>
         <w:rPr>
           <w:rFonts w:ascii="Calibri" w:hAnsi="Calibri"/>
           <w:b/>
-          <w:color w:val="445588"/>
-          <w:sz w:val="24"/>
+          <w:color w:val="333333"/>
+          <w:sz w:val="22"/>
           <w:rtl w:val="1"/>
           <w:rFonts w:cs="Calibri"/>
-          <w:szCs w:val="24"/>
+          <w:szCs w:val="22"/>
         </w:rPr>
         <w:t>أسئلة المراجعة</w:t>
       </w:r>
@@ -22512,19 +22512,19 @@
     </w:p>
     <w:p>
       <w:pPr>
+        <w:bidi w:val="1"/>
         <w:jc w:val="right"/>
-        <w:bidi w:val="1"/>
         <w:textDirection w:val="lrTb"/>
       </w:pPr>
       <w:r>
         <w:rPr>
           <w:rFonts w:ascii="Calibri" w:hAnsi="Calibri"/>
           <w:b/>
-          <w:color w:val="445588"/>
-          <w:sz w:val="24"/>
+          <w:color w:val="333333"/>
+          <w:sz w:val="22"/>
           <w:rtl w:val="1"/>
           <w:rFonts w:cs="Calibri"/>
-          <w:szCs w:val="24"/>
+          <w:szCs w:val="22"/>
         </w:rPr>
         <w:t>الواجب المنزلي</w:t>
       </w:r>

</xml_diff>

<commit_message>
v3.2: Remove all #### heading markers from markdown files + regenerate DOCX
- Converted all 64 lesson files: #### Heading → **Heading** (bold)
- Also fixed Curriculum-Map.md #### headers
- Regenerated all 8 DOCX files with clean formatting
- Zero remaining #### patterns in the entire repo
</commit_message>
<xml_diff>
--- a/docx_output_v2/Sibelius-Semester1-Part1-Lessons-1-8.docx
+++ b/docx_output_v2/Sibelius-Semester1-Part1-Lessons-1-8.docx
@@ -921,14 +921,15 @@
       <w:r>
         <w:rPr>
           <w:rFonts w:ascii="Calibri" w:hAnsi="Calibri"/>
-          <w:b/>
-          <w:color w:val="333333"/>
+          <w:b w:val="0"/>
           <w:sz w:val="22"/>
           <w:rtl w:val="1"/>
           <w:rFonts w:cs="Calibri"/>
           <w:szCs w:val="22"/>
         </w:rPr>
         <w:t>ما هو التدوين الموسيقي؟</w:t>
+        <w:br/>
+        <w:t>التدوين الموسيقي هو نظام كتابة الموسيقى باستخدام رموز على المدرج الموسيقي. يسمح بحفظ الموسيقى ونقلها وإعادة أدائها.</w:t>
       </w:r>
     </w:p>
     <w:p>
@@ -946,7 +947,13 @@
           <w:rFonts w:cs="Calibri"/>
           <w:szCs w:val="22"/>
         </w:rPr>
-        <w:t>التدوين الموسيقي هو نظام كتابة الموسيقى باستخدام رموز على المدرج الموسيقي. يسمح بحفظ الموسيقى ونقلها وإعادة أدائها.</w:t>
+        <w:t>المدرج الموسيقي ‏(The Staff)‏</w:t>
+        <w:br/>
+        <w:t>- يتكون من 5 خطوط أفقية و 4 فراغات</w:t>
+        <w:br/>
+        <w:t>- ترقيم الأسطر من الأسفل إلى الأعلى ‏(1-5)‏</w:t>
+        <w:br/>
+        <w:t>- النوتة توضع على خط أو في فراغ</w:t>
       </w:r>
     </w:p>
     <w:p>
@@ -958,14 +965,17 @@
       <w:r>
         <w:rPr>
           <w:rFonts w:ascii="Calibri" w:hAnsi="Calibri"/>
-          <w:b/>
-          <w:color w:val="333333"/>
+          <w:b w:val="0"/>
           <w:sz w:val="22"/>
           <w:rtl w:val="1"/>
           <w:rFonts w:cs="Calibri"/>
           <w:szCs w:val="22"/>
         </w:rPr>
-        <w:t>المدرج الموسيقي ‏(The Staff)‏</w:t>
+        <w:t>المفاتيح الموسيقية ‏(Clefs)‏</w:t>
+        <w:br/>
+        <w:t>- مفتاح صول ‏(Treble Clef)‏: يُستخدم للآلات عالية الطبقة ‏(العود، الكمان، اليد اليمنى للبيانو)‏</w:t>
+        <w:br/>
+        <w:t>- مفتاح فا ‏(Bass Clef)‏: يُستخدم للآلات منخفضة الطبقة</w:t>
       </w:r>
     </w:p>
     <w:p>
@@ -977,152 +987,17 @@
       <w:r>
         <w:rPr>
           <w:rFonts w:ascii="Calibri" w:hAnsi="Calibri"/>
-          <w:sz w:val="22"/>
-          <w:rtl w:val="1"/>
-          <w:rFonts w:cs="Calibri"/>
-          <w:szCs w:val="22"/>
-        </w:rPr>
-        <w:t>• يتكون من 5 خطوط أفقية و 4 فراغات</w:t>
-      </w:r>
-    </w:p>
-    <w:p>
-      <w:pPr>
-        <w:bidi w:val="1"/>
-        <w:jc w:val="right"/>
-        <w:textDirection w:val="lrTb"/>
-      </w:pPr>
-      <w:r>
-        <w:rPr>
-          <w:rFonts w:ascii="Calibri" w:hAnsi="Calibri"/>
-          <w:sz w:val="22"/>
-          <w:rtl w:val="1"/>
-          <w:rFonts w:cs="Calibri"/>
-          <w:szCs w:val="22"/>
-        </w:rPr>
-        <w:t>• ترقيم الأسطر من الأسفل إلى الأعلى ‏(1-5)‏</w:t>
-      </w:r>
-    </w:p>
-    <w:p>
-      <w:pPr>
-        <w:bidi w:val="1"/>
-        <w:jc w:val="right"/>
-        <w:textDirection w:val="lrTb"/>
-      </w:pPr>
-      <w:r>
-        <w:rPr>
-          <w:rFonts w:ascii="Calibri" w:hAnsi="Calibri"/>
-          <w:sz w:val="22"/>
-          <w:rtl w:val="1"/>
-          <w:rFonts w:cs="Calibri"/>
-          <w:szCs w:val="22"/>
-        </w:rPr>
-        <w:t>• النوتة توضع على خط أو في فراغ</w:t>
-      </w:r>
-    </w:p>
-    <w:p>
-      <w:pPr>
-        <w:bidi w:val="1"/>
-        <w:jc w:val="right"/>
-        <w:textDirection w:val="lrTb"/>
-      </w:pPr>
-      <w:r>
-        <w:rPr>
-          <w:rFonts w:ascii="Calibri" w:hAnsi="Calibri"/>
-          <w:b/>
-          <w:color w:val="333333"/>
-          <w:sz w:val="22"/>
-          <w:rtl w:val="1"/>
-          <w:rFonts w:cs="Calibri"/>
-          <w:szCs w:val="22"/>
-        </w:rPr>
-        <w:t>المفاتيح الموسيقية ‏(Clefs)‏</w:t>
-      </w:r>
-    </w:p>
-    <w:p>
-      <w:pPr>
-        <w:bidi w:val="1"/>
-        <w:jc w:val="right"/>
-        <w:textDirection w:val="lrTb"/>
-      </w:pPr>
-      <w:r>
-        <w:rPr>
-          <w:rFonts w:ascii="Calibri" w:hAnsi="Calibri"/>
-          <w:sz w:val="22"/>
-          <w:rtl w:val="1"/>
-          <w:rFonts w:cs="Calibri"/>
-          <w:szCs w:val="22"/>
-        </w:rPr>
-        <w:t>• مفتاح صول ‏(Treble Clef)‏: يُستخدم للآلات عالية الطبقة ‏(العود، الكمان، اليد اليمنى للبيانو)‏</w:t>
-      </w:r>
-    </w:p>
-    <w:p>
-      <w:pPr>
-        <w:bidi w:val="1"/>
-        <w:jc w:val="right"/>
-        <w:textDirection w:val="lrTb"/>
-      </w:pPr>
-      <w:r>
-        <w:rPr>
-          <w:rFonts w:ascii="Calibri" w:hAnsi="Calibri"/>
-          <w:sz w:val="22"/>
-          <w:rtl w:val="1"/>
-          <w:rFonts w:cs="Calibri"/>
-          <w:szCs w:val="22"/>
-        </w:rPr>
-        <w:t>• مفتاح فا ‏(Bass Clef)‏: يُستخدم للآلات منخفضة الطبقة</w:t>
-      </w:r>
-    </w:p>
-    <w:p>
-      <w:pPr>
-        <w:bidi w:val="1"/>
-        <w:jc w:val="right"/>
-        <w:textDirection w:val="lrTb"/>
-      </w:pPr>
-      <w:r>
-        <w:rPr>
-          <w:rFonts w:ascii="Calibri" w:hAnsi="Calibri"/>
-          <w:b/>
-          <w:color w:val="333333"/>
+          <w:b w:val="0"/>
           <w:sz w:val="22"/>
           <w:rtl w:val="1"/>
           <w:rFonts w:cs="Calibri"/>
           <w:szCs w:val="22"/>
         </w:rPr>
         <w:t>النوتات الأساسية</w:t>
-      </w:r>
-    </w:p>
-    <w:p>
-      <w:pPr>
-        <w:bidi w:val="1"/>
-        <w:jc w:val="right"/>
-        <w:textDirection w:val="lrTb"/>
-      </w:pPr>
-      <w:r>
-        <w:rPr>
-          <w:rFonts w:ascii="Calibri" w:hAnsi="Calibri"/>
-          <w:sz w:val="22"/>
-          <w:rtl w:val="1"/>
-          <w:rFonts w:cs="Calibri"/>
-          <w:szCs w:val="22"/>
-        </w:rPr>
-        <w:t>• Do – Re – Mi – Fa – Sol – La – Si ‏(Fixed Solfege)‏</w:t>
-      </w:r>
-    </w:p>
-    <w:p>
-      <w:pPr>
-        <w:bidi w:val="1"/>
-        <w:jc w:val="right"/>
-        <w:textDirection w:val="lrTb"/>
-      </w:pPr>
-      <w:r>
-        <w:rPr>
-          <w:rFonts w:ascii="Calibri" w:hAnsi="Calibri"/>
-          <w:sz w:val="22"/>
-          <w:rtl w:val="1"/>
-          <w:rFonts w:cs="Calibri"/>
-          <w:szCs w:val="22"/>
-        </w:rPr>
-        <w:t>• توضع النوتات على المدرج بالتناوب: خط، فراغ، خط، فراغ</w:t>
+        <w:br/>
+        <w:t>- Do – Re – Mi – Fa – Sol – La – Si ‏(Fixed Solfege)‏</w:t>
+        <w:br/>
+        <w:t>- توضع النوتات على المدرج بالتناوب: خط، فراغ، خط، فراغ</w:t>
       </w:r>
     </w:p>
     <w:p>
@@ -1154,134 +1029,24 @@
         <w:rPr>
           <w:rFonts w:ascii="Calibri" w:hAnsi="Calibri"/>
           <w:b/>
-          <w:color w:val="333333"/>
           <w:sz w:val="22"/>
           <w:rtl w:val="1"/>
           <w:rFonts w:cs="Calibri"/>
           <w:szCs w:val="22"/>
         </w:rPr>
         <w:t>تمرين 1: فتح Sibelius ‏(5 دقائق)‏</w:t>
-      </w:r>
-    </w:p>
-    <w:p>
-      <w:pPr>
-        <w:bidi w:val="1"/>
-        <w:jc w:val="right"/>
-        <w:textDirection w:val="lrTb"/>
-      </w:pPr>
-      <w:r>
-        <w:rPr>
-          <w:rFonts w:ascii="Calibri" w:hAnsi="Calibri"/>
-          <w:sz w:val="22"/>
-          <w:rtl w:val="1"/>
-          <w:rFonts w:cs="Calibri"/>
-          <w:szCs w:val="22"/>
-        </w:rPr>
-        <w:t>افتح Sibelius من قائمة Start أو Desktop</w:t>
-      </w:r>
-    </w:p>
-    <w:p>
-      <w:pPr>
-        <w:bidi w:val="1"/>
-        <w:jc w:val="right"/>
-        <w:textDirection w:val="lrTb"/>
-      </w:pPr>
-      <w:r>
-        <w:rPr>
-          <w:rFonts w:ascii="Calibri" w:hAnsi="Calibri"/>
-          <w:sz w:val="22"/>
-          <w:rtl w:val="1"/>
-          <w:rFonts w:cs="Calibri"/>
-          <w:szCs w:val="22"/>
-        </w:rPr>
-        <w:t>اختر Blank Score ‏(نوتة فارغة)‏</w:t>
-      </w:r>
-    </w:p>
-    <w:p>
-      <w:pPr>
-        <w:bidi w:val="1"/>
-        <w:jc w:val="right"/>
-        <w:textDirection w:val="lrTb"/>
-      </w:pPr>
-      <w:r>
-        <w:rPr>
-          <w:rFonts w:ascii="Calibri" w:hAnsi="Calibri"/>
-          <w:sz w:val="22"/>
-          <w:rtl w:val="1"/>
-          <w:rFonts w:cs="Calibri"/>
-          <w:szCs w:val="22"/>
-        </w:rPr>
-        <w:t>اختر Treble Clef Only</w:t>
-      </w:r>
-    </w:p>
-    <w:p>
-      <w:pPr>
-        <w:bidi w:val="1"/>
-        <w:jc w:val="right"/>
-        <w:textDirection w:val="lrTb"/>
-      </w:pPr>
-      <w:r>
-        <w:rPr>
-          <w:rFonts w:ascii="Calibri" w:hAnsi="Calibri"/>
-          <w:sz w:val="22"/>
-          <w:rtl w:val="1"/>
-          <w:rFonts w:cs="Calibri"/>
-          <w:szCs w:val="22"/>
-        </w:rPr>
-        <w:t>اختر Tempo: 100 BPM</w:t>
-      </w:r>
-    </w:p>
-    <w:p>
-      <w:pPr>
-        <w:bidi w:val="1"/>
-        <w:jc w:val="right"/>
-        <w:textDirection w:val="lrTb"/>
-      </w:pPr>
-      <w:r>
-        <w:rPr>
-          <w:rFonts w:ascii="Calibri" w:hAnsi="Calibri"/>
-          <w:sz w:val="22"/>
-          <w:rtl w:val="1"/>
-          <w:rFonts w:cs="Calibri"/>
-          <w:szCs w:val="22"/>
-        </w:rPr>
-        <w:t>اختر Time Signature: 4/4</w:t>
-      </w:r>
-    </w:p>
-    <w:p>
-      <w:pPr>
-        <w:bidi w:val="1"/>
-        <w:jc w:val="right"/>
-        <w:textDirection w:val="lrTb"/>
-      </w:pPr>
-      <w:r>
-        <w:rPr>
-          <w:rFonts w:ascii="Calibri" w:hAnsi="Calibri"/>
-          <w:sz w:val="22"/>
-          <w:rtl w:val="1"/>
-          <w:rFonts w:cs="Calibri"/>
-          <w:szCs w:val="22"/>
-        </w:rPr>
-        <w:t>اضغط Create</w:t>
-      </w:r>
-    </w:p>
-    <w:p>
-      <w:pPr>
-        <w:bidi w:val="1"/>
-        <w:jc w:val="right"/>
-        <w:textDirection w:val="lrTb"/>
-      </w:pPr>
-      <w:r>
-        <w:rPr>
-          <w:rFonts w:ascii="Calibri" w:hAnsi="Calibri"/>
-          <w:b/>
-          <w:color w:val="333333"/>
-          <w:sz w:val="22"/>
-          <w:rtl w:val="1"/>
-          <w:rFonts w:cs="Calibri"/>
-          <w:szCs w:val="22"/>
-        </w:rPr>
-        <w:t>تمرين 2: التعرف على واجهة Sibelius ‏(10 دقائق)‏</w:t>
+        <w:br/>
+        <w:t>1. افتح Sibelius من قائمة Start أو Desktop</w:t>
+        <w:br/>
+        <w:t>2. اختر Blank Score ‏(نوتة فارغة)‏</w:t>
+        <w:br/>
+        <w:t>3. اختر Treble Clef Only</w:t>
+        <w:br/>
+        <w:t>4. اختر Tempo: 100 BPM</w:t>
+        <w:br/>
+        <w:t>5. اختر Time Signature: 4/4</w:t>
+        <w:br/>
+        <w:t>6. اضغط Create</w:t>
       </w:r>
     </w:p>
     <w:p>
@@ -1299,6 +1064,8 @@
           <w:rFonts w:cs="Calibri"/>
           <w:szCs w:val="22"/>
         </w:rPr>
+        <w:t>تمرين 2: التعرف على واجهة Sibelius ‏(10 دقائق)‏</w:t>
+        <w:br/>
         <w:t>تعرف على الأجزاء التالية:</w:t>
         <w:br/>
         <w:t>- Title Bar: اسم الملف</w:t>
@@ -1323,14 +1090,25 @@
       <w:r>
         <w:rPr>
           <w:rFonts w:ascii="Calibri" w:hAnsi="Calibri"/>
-          <w:b/>
-          <w:color w:val="333333"/>
+          <w:b w:val="0"/>
           <w:sz w:val="22"/>
           <w:rtl w:val="1"/>
           <w:rFonts w:cs="Calibri"/>
           <w:szCs w:val="22"/>
         </w:rPr>
         <w:t>تمرين 3: كتابة أول نوتة ‏(10 دقائق)‏</w:t>
+        <w:br/>
+        <w:t>1. اضغط N للدخول إلى Note Input Mode</w:t>
+        <w:br/>
+        <w:t>2. اختر Noire ‏(Quarter Note)‏ من Keypad</w:t>
+        <w:br/>
+        <w:t>3. ضع النوتة على السطر الثاني ‏(Sol)‏</w:t>
+        <w:br/>
+        <w:t>4. استمر في وضع النوتات: Sol – La – Si – Do – Re</w:t>
+        <w:br/>
+        <w:t>5. اضغط Escape للخروج من Note Input Mode</w:t>
+        <w:br/>
+        <w:t>6. اضغط Space للاستماع</w:t>
       </w:r>
     </w:p>
     <w:p>
@@ -1342,167 +1120,19 @@
       <w:r>
         <w:rPr>
           <w:rFonts w:ascii="Calibri" w:hAnsi="Calibri"/>
-          <w:sz w:val="22"/>
-          <w:rtl w:val="1"/>
-          <w:rFonts w:cs="Calibri"/>
-          <w:szCs w:val="22"/>
-        </w:rPr>
-        <w:t>اضغط N للدخول إلى Note Input Mode</w:t>
-      </w:r>
-    </w:p>
-    <w:p>
-      <w:pPr>
-        <w:bidi w:val="1"/>
-        <w:jc w:val="right"/>
-        <w:textDirection w:val="lrTb"/>
-      </w:pPr>
-      <w:r>
-        <w:rPr>
-          <w:rFonts w:ascii="Calibri" w:hAnsi="Calibri"/>
-          <w:sz w:val="22"/>
-          <w:rtl w:val="1"/>
-          <w:rFonts w:cs="Calibri"/>
-          <w:szCs w:val="22"/>
-        </w:rPr>
-        <w:t>اختر Noire ‏(Quarter Note)‏ من Keypad</w:t>
-      </w:r>
-    </w:p>
-    <w:p>
-      <w:pPr>
-        <w:bidi w:val="1"/>
-        <w:jc w:val="right"/>
-        <w:textDirection w:val="lrTb"/>
-      </w:pPr>
-      <w:r>
-        <w:rPr>
-          <w:rFonts w:ascii="Calibri" w:hAnsi="Calibri"/>
-          <w:sz w:val="22"/>
-          <w:rtl w:val="1"/>
-          <w:rFonts w:cs="Calibri"/>
-          <w:szCs w:val="22"/>
-        </w:rPr>
-        <w:t>ضع النوتة على السطر الثاني ‏(Sol)‏</w:t>
-      </w:r>
-    </w:p>
-    <w:p>
-      <w:pPr>
-        <w:bidi w:val="1"/>
-        <w:jc w:val="right"/>
-        <w:textDirection w:val="lrTb"/>
-      </w:pPr>
-      <w:r>
-        <w:rPr>
-          <w:rFonts w:ascii="Calibri" w:hAnsi="Calibri"/>
-          <w:sz w:val="22"/>
-          <w:rtl w:val="1"/>
-          <w:rFonts w:cs="Calibri"/>
-          <w:szCs w:val="22"/>
-        </w:rPr>
-        <w:t>استمر في وضع النوتات: Sol – La – Si – Do – Re</w:t>
-      </w:r>
-    </w:p>
-    <w:p>
-      <w:pPr>
-        <w:bidi w:val="1"/>
-        <w:jc w:val="right"/>
-        <w:textDirection w:val="lrTb"/>
-      </w:pPr>
-      <w:r>
-        <w:rPr>
-          <w:rFonts w:ascii="Calibri" w:hAnsi="Calibri"/>
-          <w:sz w:val="22"/>
-          <w:rtl w:val="1"/>
-          <w:rFonts w:cs="Calibri"/>
-          <w:szCs w:val="22"/>
-        </w:rPr>
-        <w:t>اضغط Escape للخروج من Note Input Mode</w:t>
-      </w:r>
-    </w:p>
-    <w:p>
-      <w:pPr>
-        <w:bidi w:val="1"/>
-        <w:jc w:val="right"/>
-        <w:textDirection w:val="lrTb"/>
-      </w:pPr>
-      <w:r>
-        <w:rPr>
-          <w:rFonts w:ascii="Calibri" w:hAnsi="Calibri"/>
-          <w:sz w:val="22"/>
-          <w:rtl w:val="1"/>
-          <w:rFonts w:cs="Calibri"/>
-          <w:szCs w:val="22"/>
-        </w:rPr>
-        <w:t>اضغط Space للاستماع</w:t>
-      </w:r>
-    </w:p>
-    <w:p>
-      <w:pPr>
-        <w:bidi w:val="1"/>
-        <w:jc w:val="right"/>
-        <w:textDirection w:val="lrTb"/>
-      </w:pPr>
-      <w:r>
-        <w:rPr>
-          <w:rFonts w:ascii="Calibri" w:hAnsi="Calibri"/>
-          <w:b/>
-          <w:color w:val="333333"/>
+          <w:b w:val="0"/>
           <w:sz w:val="22"/>
           <w:rtl w:val="1"/>
           <w:rFonts w:cs="Calibri"/>
           <w:szCs w:val="22"/>
         </w:rPr>
         <w:t>تمرين 4: إضافة مفتاح صول ‏(5 دقائق)‏</w:t>
-      </w:r>
-    </w:p>
-    <w:p>
-      <w:pPr>
-        <w:bidi w:val="1"/>
-        <w:jc w:val="right"/>
-        <w:textDirection w:val="lrTb"/>
-      </w:pPr>
-      <w:r>
-        <w:rPr>
-          <w:rFonts w:ascii="Calibri" w:hAnsi="Calibri"/>
-          <w:sz w:val="22"/>
-          <w:rtl w:val="1"/>
-          <w:rFonts w:cs="Calibri"/>
-          <w:szCs w:val="22"/>
-        </w:rPr>
-        <w:t>اختر Tab: Home</w:t>
-      </w:r>
-    </w:p>
-    <w:p>
-      <w:pPr>
-        <w:bidi w:val="1"/>
-        <w:jc w:val="right"/>
-        <w:textDirection w:val="lrTb"/>
-      </w:pPr>
-      <w:r>
-        <w:rPr>
-          <w:rFonts w:ascii="Calibri" w:hAnsi="Calibri"/>
-          <w:sz w:val="22"/>
-          <w:rtl w:val="1"/>
-          <w:rFonts w:cs="Calibri"/>
-          <w:szCs w:val="22"/>
-        </w:rPr>
-        <w:t>اضغط على Treble Clef</w:t>
-      </w:r>
-    </w:p>
-    <w:p>
-      <w:pPr>
-        <w:bidi w:val="1"/>
-        <w:jc w:val="right"/>
-        <w:textDirection w:val="lrTb"/>
-      </w:pPr>
-      <w:r>
-        <w:rPr>
-          <w:rFonts w:ascii="Calibri" w:hAnsi="Calibri"/>
-          <w:sz w:val="22"/>
-          <w:rtl w:val="1"/>
-          <w:rFonts w:cs="Calibri"/>
-          <w:szCs w:val="22"/>
-        </w:rPr>
-        <w:t>ضعه في بداية المدرج</w:t>
+        <w:br/>
+        <w:t>1. اختر Tab: Home</w:t>
+        <w:br/>
+        <w:t>2. اضغط على Treble Clef</w:t>
+        <w:br/>
+        <w:t>3. ضعه في بداية المدرج</w:t>
       </w:r>
     </w:p>
     <w:p>
@@ -2157,14 +1787,19 @@
       <w:r>
         <w:rPr>
           <w:rFonts w:ascii="Calibri" w:hAnsi="Calibri"/>
-          <w:b/>
-          <w:color w:val="333333"/>
+          <w:b w:val="0"/>
           <w:sz w:val="22"/>
           <w:rtl w:val="1"/>
           <w:rFonts w:cs="Calibri"/>
           <w:szCs w:val="22"/>
         </w:rPr>
         <w:t>أسئلة المراجعة</w:t>
+        <w:br/>
+        <w:t>1. كم عدد خطوط المدرج الموسيقي؟</w:t>
+        <w:br/>
+        <w:t>2. ما اسم النوتة التي تكتب على السطر الثاني من مفتاح صول؟</w:t>
+        <w:br/>
+        <w:t>3. ما اختصار دخول وضع إدخال النوتة في Sibelius؟</w:t>
       </w:r>
     </w:p>
     <w:p>
@@ -2176,133 +1811,21 @@
       <w:r>
         <w:rPr>
           <w:rFonts w:ascii="Calibri" w:hAnsi="Calibri"/>
-          <w:sz w:val="22"/>
-          <w:rtl w:val="1"/>
-          <w:rFonts w:cs="Calibri"/>
-          <w:szCs w:val="22"/>
-        </w:rPr>
-        <w:t>كم عدد خطوط المدرج الموسيقي؟</w:t>
-      </w:r>
-    </w:p>
-    <w:p>
-      <w:pPr>
-        <w:bidi w:val="1"/>
-        <w:jc w:val="right"/>
-        <w:textDirection w:val="lrTb"/>
-      </w:pPr>
-      <w:r>
-        <w:rPr>
-          <w:rFonts w:ascii="Calibri" w:hAnsi="Calibri"/>
-          <w:sz w:val="22"/>
-          <w:rtl w:val="1"/>
-          <w:rFonts w:cs="Calibri"/>
-          <w:szCs w:val="22"/>
-        </w:rPr>
-        <w:t>ما اسم النوتة التي تكتب على السطر الثاني من مفتاح صول؟</w:t>
-      </w:r>
-    </w:p>
-    <w:p>
-      <w:pPr>
-        <w:bidi w:val="1"/>
-        <w:jc w:val="right"/>
-        <w:textDirection w:val="lrTb"/>
-      </w:pPr>
-      <w:r>
-        <w:rPr>
-          <w:rFonts w:ascii="Calibri" w:hAnsi="Calibri"/>
-          <w:sz w:val="22"/>
-          <w:rtl w:val="1"/>
-          <w:rFonts w:cs="Calibri"/>
-          <w:szCs w:val="22"/>
-        </w:rPr>
-        <w:t>ما اختصار دخول وضع إدخال النوتة في Sibelius؟</w:t>
-      </w:r>
-    </w:p>
-    <w:p>
-      <w:pPr>
-        <w:bidi w:val="1"/>
-        <w:jc w:val="right"/>
-        <w:textDirection w:val="lrTb"/>
-      </w:pPr>
-      <w:r>
-        <w:rPr>
-          <w:rFonts w:ascii="Calibri" w:hAnsi="Calibri"/>
-          <w:b/>
-          <w:color w:val="333333"/>
+          <w:b w:val="0"/>
           <w:sz w:val="22"/>
           <w:rtl w:val="1"/>
           <w:rFonts w:cs="Calibri"/>
           <w:szCs w:val="22"/>
         </w:rPr>
         <w:t>الواجب المنزلي</w:t>
-      </w:r>
-    </w:p>
-    <w:p>
-      <w:pPr>
-        <w:bidi w:val="1"/>
-        <w:jc w:val="right"/>
-        <w:textDirection w:val="lrTb"/>
-      </w:pPr>
-      <w:r>
-        <w:rPr>
-          <w:rFonts w:ascii="Calibri" w:hAnsi="Calibri"/>
-          <w:sz w:val="22"/>
-          <w:rtl w:val="1"/>
-          <w:rFonts w:cs="Calibri"/>
-          <w:szCs w:val="22"/>
-        </w:rPr>
-        <w:t>افتح Sibelius وأنشئ نوتة جديدة ‏(Treble Clef, 4/4)‏</w:t>
-      </w:r>
-    </w:p>
-    <w:p>
-      <w:pPr>
-        <w:bidi w:val="1"/>
-        <w:jc w:val="right"/>
-        <w:textDirection w:val="lrTb"/>
-      </w:pPr>
-      <w:r>
-        <w:rPr>
-          <w:rFonts w:ascii="Calibri" w:hAnsi="Calibri"/>
-          <w:sz w:val="22"/>
-          <w:rtl w:val="1"/>
-          <w:rFonts w:cs="Calibri"/>
-          <w:szCs w:val="22"/>
-        </w:rPr>
-        <w:t>اكتب سلم Do الكبير ‏(Do-Re-Mi-Fa-Sol-La-Si-Do)‏ باستخدام Noire ‏(Quarter Notes)‏</w:t>
-      </w:r>
-    </w:p>
-    <w:p>
-      <w:pPr>
-        <w:bidi w:val="1"/>
-        <w:jc w:val="right"/>
-        <w:textDirection w:val="lrTb"/>
-      </w:pPr>
-      <w:r>
-        <w:rPr>
-          <w:rFonts w:ascii="Calibri" w:hAnsi="Calibri"/>
-          <w:sz w:val="22"/>
-          <w:rtl w:val="1"/>
-          <w:rFonts w:cs="Calibri"/>
-          <w:szCs w:val="22"/>
-        </w:rPr>
-        <w:t>احفظ الملف باسم `My_First_Score.sib`</w:t>
-      </w:r>
-    </w:p>
-    <w:p>
-      <w:pPr>
-        <w:bidi w:val="1"/>
-        <w:jc w:val="right"/>
-        <w:textDirection w:val="lrTb"/>
-      </w:pPr>
-      <w:r>
-        <w:rPr>
-          <w:rFonts w:ascii="Calibri" w:hAnsi="Calibri"/>
-          <w:sz w:val="22"/>
-          <w:rtl w:val="1"/>
-          <w:rFonts w:cs="Calibri"/>
-          <w:szCs w:val="22"/>
-        </w:rPr>
-        <w:t>أرسل لقطة شاشة للملف</w:t>
+        <w:br/>
+        <w:t>1. افتح Sibelius وأنشئ نوتة جديدة ‏(Treble Clef, 4/4)‏</w:t>
+        <w:br/>
+        <w:t>2. اكتب سلم Do الكبير ‏(Do-Re-Mi-Fa-Sol-La-Si-Do)‏ باستخدام Noire ‏(Quarter Notes)‏</w:t>
+        <w:br/>
+        <w:t>3. احفظ الملف باسم `My_First_Score.sib`</w:t>
+        <w:br/>
+        <w:t>4. أرسل لقطة شاشة للملف</w:t>
       </w:r>
     </w:p>
     <w:p>
@@ -3849,7 +3372,6 @@
         <w:rPr>
           <w:rFonts w:ascii="Calibri" w:hAnsi="Calibri"/>
           <w:b/>
-          <w:color w:val="333333"/>
           <w:sz w:val="22"/>
           <w:rtl w:val="1"/>
           <w:rFonts w:cs="Calibri"/>
@@ -4499,14 +4021,19 @@
       <w:r>
         <w:rPr>
           <w:rFonts w:ascii="Calibri" w:hAnsi="Calibri"/>
-          <w:b/>
-          <w:color w:val="333333"/>
+          <w:b w:val="0"/>
           <w:sz w:val="22"/>
           <w:rtl w:val="1"/>
           <w:rFonts w:cs="Calibri"/>
           <w:szCs w:val="22"/>
         </w:rPr>
         <w:t>الميزان 4/4 ‏(Time Signature)‏</w:t>
+        <w:br/>
+        <w:t>- الرقم العلوي ‏(4)‏: عدد الدقات في كل مازورة ‏(4 دقات)‏</w:t>
+        <w:br/>
+        <w:t>- الرقم السفلي ‏(4)‏: النوار ‏(Quarter Note)‏ تأخذ دقة واحدة</w:t>
+        <w:br/>
+        <w:t>- المازورة ‏(Bar/Measure)‏: وحدة الزمن في المقطوعة</w:t>
       </w:r>
     </w:p>
     <w:p>
@@ -4518,116 +4045,19 @@
       <w:r>
         <w:rPr>
           <w:rFonts w:ascii="Calibri" w:hAnsi="Calibri"/>
-          <w:sz w:val="22"/>
-          <w:rtl w:val="1"/>
-          <w:rFonts w:cs="Calibri"/>
-          <w:szCs w:val="22"/>
-        </w:rPr>
-        <w:t>• الرقم العلوي ‏(4)‏: عدد الدقات في كل مازورة ‏(4 دقات)‏</w:t>
-      </w:r>
-    </w:p>
-    <w:p>
-      <w:pPr>
-        <w:bidi w:val="1"/>
-        <w:jc w:val="right"/>
-        <w:textDirection w:val="lrTb"/>
-      </w:pPr>
-      <w:r>
-        <w:rPr>
-          <w:rFonts w:ascii="Calibri" w:hAnsi="Calibri"/>
-          <w:sz w:val="22"/>
-          <w:rtl w:val="1"/>
-          <w:rFonts w:cs="Calibri"/>
-          <w:szCs w:val="22"/>
-        </w:rPr>
-        <w:t>• الرقم السفلي ‏(4)‏: النوار ‏(Quarter Note)‏ تأخذ دقة واحدة</w:t>
-      </w:r>
-    </w:p>
-    <w:p>
-      <w:pPr>
-        <w:bidi w:val="1"/>
-        <w:jc w:val="right"/>
-        <w:textDirection w:val="lrTb"/>
-      </w:pPr>
-      <w:r>
-        <w:rPr>
-          <w:rFonts w:ascii="Calibri" w:hAnsi="Calibri"/>
-          <w:sz w:val="22"/>
-          <w:rtl w:val="1"/>
-          <w:rFonts w:cs="Calibri"/>
-          <w:szCs w:val="22"/>
-        </w:rPr>
-        <w:t>• المازورة ‏(Bar/Measure)‏: وحدة الزمن في المقطوعة</w:t>
-      </w:r>
-    </w:p>
-    <w:p>
-      <w:pPr>
-        <w:bidi w:val="1"/>
-        <w:jc w:val="right"/>
-        <w:textDirection w:val="lrTb"/>
-      </w:pPr>
-      <w:r>
-        <w:rPr>
-          <w:rFonts w:ascii="Calibri" w:hAnsi="Calibri"/>
-          <w:b/>
-          <w:color w:val="333333"/>
+          <w:b w:val="0"/>
           <w:sz w:val="22"/>
           <w:rtl w:val="1"/>
           <w:rFonts w:cs="Calibri"/>
           <w:szCs w:val="22"/>
         </w:rPr>
         <w:t>العلاقة بين القيم:</w:t>
-      </w:r>
-    </w:p>
-    <w:p>
-      <w:pPr>
-        <w:bidi w:val="1"/>
-        <w:jc w:val="right"/>
-        <w:textDirection w:val="lrTb"/>
-      </w:pPr>
-      <w:r>
-        <w:rPr>
-          <w:rFonts w:ascii="Calibri" w:hAnsi="Calibri"/>
-          <w:sz w:val="22"/>
-          <w:rtl w:val="1"/>
-          <w:rFonts w:cs="Calibri"/>
-          <w:szCs w:val="22"/>
-        </w:rPr>
-        <w:t>• 1 Ronde = 2 Blanche = 4 Noire = 8 Croche</w:t>
-      </w:r>
-    </w:p>
-    <w:p>
-      <w:pPr>
-        <w:bidi w:val="1"/>
-        <w:jc w:val="right"/>
-        <w:textDirection w:val="lrTb"/>
-      </w:pPr>
-      <w:r>
-        <w:rPr>
-          <w:rFonts w:ascii="Calibri" w:hAnsi="Calibri"/>
-          <w:sz w:val="22"/>
-          <w:rtl w:val="1"/>
-          <w:rFonts w:cs="Calibri"/>
-          <w:szCs w:val="22"/>
-        </w:rPr>
-        <w:t>• 1 Blanche = 2 Noire = 4 Croche</w:t>
-      </w:r>
-    </w:p>
-    <w:p>
-      <w:pPr>
-        <w:bidi w:val="1"/>
-        <w:jc w:val="right"/>
-        <w:textDirection w:val="lrTb"/>
-      </w:pPr>
-      <w:r>
-        <w:rPr>
-          <w:rFonts w:ascii="Calibri" w:hAnsi="Calibri"/>
-          <w:sz w:val="22"/>
-          <w:rtl w:val="1"/>
-          <w:rFonts w:cs="Calibri"/>
-          <w:szCs w:val="22"/>
-        </w:rPr>
-        <w:t>• 1 Noire = 2 Croche</w:t>
+        <w:br/>
+        <w:t>- 1 Ronde = 2 Blanche = 4 Noire = 8 Croche</w:t>
+        <w:br/>
+        <w:t>- 1 Blanche = 2 Noire = 4 Croche</w:t>
+        <w:br/>
+        <w:t>- 1 Noire = 2 Croche</w:t>
       </w:r>
     </w:p>
     <w:p>
@@ -4659,132 +4089,26 @@
         <w:rPr>
           <w:rFonts w:ascii="Calibri" w:hAnsi="Calibri"/>
           <w:b/>
-          <w:color w:val="333333"/>
           <w:sz w:val="22"/>
           <w:rtl w:val="1"/>
           <w:rFonts w:cs="Calibri"/>
           <w:szCs w:val="22"/>
         </w:rPr>
         <w:t>تمرين 1: إدخال نوتات بقيم مختلفة ‏(10 دقائق)‏</w:t>
-      </w:r>
-    </w:p>
-    <w:p>
-      <w:pPr>
-        <w:bidi w:val="1"/>
-        <w:jc w:val="right"/>
-        <w:textDirection w:val="lrTb"/>
-      </w:pPr>
-      <w:r>
-        <w:rPr>
-          <w:rFonts w:ascii="Calibri" w:hAnsi="Calibri"/>
-          <w:sz w:val="22"/>
-          <w:rtl w:val="1"/>
-          <w:rFonts w:cs="Calibri"/>
-          <w:szCs w:val="22"/>
-        </w:rPr>
-        <w:t>افتح Sibelius → Blank Score → Treble Clef → 4/4</w:t>
-      </w:r>
-    </w:p>
-    <w:p>
-      <w:pPr>
-        <w:bidi w:val="1"/>
-        <w:jc w:val="right"/>
-        <w:textDirection w:val="lrTb"/>
-      </w:pPr>
-      <w:r>
-        <w:rPr>
-          <w:rFonts w:ascii="Calibri" w:hAnsi="Calibri"/>
-          <w:sz w:val="22"/>
-          <w:rtl w:val="1"/>
-          <w:rFonts w:cs="Calibri"/>
-          <w:szCs w:val="22"/>
-        </w:rPr>
-        <w:t>اضغط N لوضع Note Input</w:t>
-      </w:r>
-    </w:p>
-    <w:p>
-      <w:pPr>
-        <w:bidi w:val="1"/>
-        <w:jc w:val="right"/>
-        <w:textDirection w:val="lrTb"/>
-      </w:pPr>
-      <w:r>
-        <w:rPr>
-          <w:rFonts w:ascii="Calibri" w:hAnsi="Calibri"/>
-          <w:sz w:val="22"/>
-          <w:rtl w:val="1"/>
-          <w:rFonts w:cs="Calibri"/>
-          <w:szCs w:val="22"/>
-        </w:rPr>
-        <w:t>استخدم Keypad ‏(F9)‏ لاختيار القيم:</w:t>
-      </w:r>
-    </w:p>
-    <w:p>
-      <w:pPr>
-        <w:bidi w:val="1"/>
-        <w:jc w:val="right"/>
-        <w:textDirection w:val="lrTb"/>
-      </w:pPr>
-      <w:r>
-        <w:rPr>
-          <w:rFonts w:ascii="Calibri" w:hAnsi="Calibri"/>
-          <w:sz w:val="22"/>
-          <w:rtl w:val="1"/>
-          <w:rFonts w:cs="Calibri"/>
-          <w:szCs w:val="22"/>
-        </w:rPr>
-        <w:t>• اختر Noire وضع 4 نوتات Do في مازورة واحدة</w:t>
-      </w:r>
-    </w:p>
-    <w:p>
-      <w:pPr>
-        <w:bidi w:val="1"/>
-        <w:jc w:val="right"/>
-        <w:textDirection w:val="lrTb"/>
-      </w:pPr>
-      <w:r>
-        <w:rPr>
-          <w:rFonts w:ascii="Calibri" w:hAnsi="Calibri"/>
-          <w:sz w:val="22"/>
-          <w:rtl w:val="1"/>
-          <w:rFonts w:cs="Calibri"/>
-          <w:szCs w:val="22"/>
-        </w:rPr>
-        <w:t>• اختر Blanche وضع 2 نوتة Mi</w:t>
-      </w:r>
-    </w:p>
-    <w:p>
-      <w:pPr>
-        <w:bidi w:val="1"/>
-        <w:jc w:val="right"/>
-        <w:textDirection w:val="lrTb"/>
-      </w:pPr>
-      <w:r>
-        <w:rPr>
-          <w:rFonts w:ascii="Calibri" w:hAnsi="Calibri"/>
-          <w:sz w:val="22"/>
-          <w:rtl w:val="1"/>
-          <w:rFonts w:cs="Calibri"/>
-          <w:szCs w:val="22"/>
-        </w:rPr>
-        <w:t>• اختر Ronde وضع 1 نوتة Sol</w:t>
-      </w:r>
-    </w:p>
-    <w:p>
-      <w:pPr>
-        <w:bidi w:val="1"/>
-        <w:jc w:val="right"/>
-        <w:textDirection w:val="lrTb"/>
-      </w:pPr>
-      <w:r>
-        <w:rPr>
-          <w:rFonts w:ascii="Calibri" w:hAnsi="Calibri"/>
-          <w:sz w:val="22"/>
-          <w:rtl w:val="1"/>
-          <w:rFonts w:cs="Calibri"/>
-          <w:szCs w:val="22"/>
-        </w:rPr>
-        <w:t>استمع: اضغط Space</w:t>
+        <w:br/>
+        <w:t>1. افتح Sibelius → Blank Score → Treble Clef → 4/4</w:t>
+        <w:br/>
+        <w:t>2. اضغط N لوضع Note Input</w:t>
+        <w:br/>
+        <w:t>3. استخدم Keypad ‏(F9)‏ لاختيار القيم:</w:t>
+        <w:br/>
+        <w:t xml:space="preserve">   - اختر Noire وضع 4 نوتات Do في مازورة واحدة</w:t>
+        <w:br/>
+        <w:t xml:space="preserve">   - اختر Blanche وضع 2 نوتة Mi</w:t>
+        <w:br/>
+        <w:t xml:space="preserve">   - اختر Ronde وضع 1 نوتة Sol</w:t>
+        <w:br/>
+        <w:t>4. استمع: اضغط Space</w:t>
       </w:r>
     </w:p>
     <w:p>
@@ -5129,7 +4453,7 @@
           <w:szCs w:val="18"/>
         </w:rPr>
         <w:br/>
-        <w:t>#### تمرين 2: أنماط إيقاعية بسيطة ‏(10 دقائق)‏</w:t>
+        <w:t>تمرين 2: أنماط إيقاعية بسيطة ‏(10 دقائق)‏</w:t>
         <w:br/>
         <w:t>اكتب الأنماط التالية في 4/4:</w:t>
         <w:br/>
@@ -5141,7 +4465,7 @@
         <w:t>النمط 3: Do – Do – Mi – Mi – Sol – Sol – Sol – Sol ‏(كلها Croche)‏</w:t>
         <w:br/>
         <w:br/>
-        <w:t>#### تمرين 3: استخدام Croche ‏(Eighth Notes)‏ ‏(10 دقائق)‏</w:t>
+        <w:t>تمرين 3: استخدام Croche ‏(Eighth Notes)‏ ‏(10 دقائق)‏</w:t>
         <w:br/>
         <w:t>1. اختر Croche من Keypad</w:t>
         <w:br/>
@@ -5182,7 +4506,7 @@
         <w:t>### 4. مراجعة وواجب | Review &amp; HW ‏(5 min)‏</w:t>
         <w:br/>
         <w:br/>
-        <w:t>#### أسئلة المراجعة</w:t>
+        <w:t>أسئلة المراجعة</w:t>
         <w:br/>
         <w:t>1. كم Noire تساوي Ronde واحدة؟</w:t>
         <w:br/>
@@ -5191,7 +4515,7 @@
         <w:t>3. ماذا يعني الرقم 4 في الميزان 4/4؟</w:t>
         <w:br/>
         <w:br/>
-        <w:t>#### الواجب المنزلي</w:t>
+        <w:t>الواجب المنزلي</w:t>
         <w:br/>
         <w:t>1. أنشئ نوتة جديدة في Sibelius ‏(Treble Clef, 4/4)‏</w:t>
         <w:br/>
@@ -5797,31 +5121,14 @@
       <w:r>
         <w:rPr>
           <w:rFonts w:ascii="Calibri" w:hAnsi="Calibri"/>
-          <w:b/>
-          <w:color w:val="333333"/>
+          <w:b w:val="0"/>
           <w:sz w:val="22"/>
           <w:rtl w:val="1"/>
           <w:rFonts w:cs="Calibri"/>
           <w:szCs w:val="22"/>
         </w:rPr>
         <w:t>السكتات ‏(Rests)‏</w:t>
-      </w:r>
-    </w:p>
-    <w:p>
-      <w:pPr>
-        <w:bidi w:val="1"/>
-        <w:jc w:val="right"/>
-        <w:textDirection w:val="lrTb"/>
-      </w:pPr>
-      <w:r>
-        <w:rPr>
-          <w:rFonts w:ascii="Calibri" w:hAnsi="Calibri"/>
-          <w:b w:val="0"/>
-          <w:sz w:val="22"/>
-          <w:rtl w:val="1"/>
-          <w:rFonts w:cs="Calibri"/>
-          <w:szCs w:val="22"/>
-        </w:rPr>
+        <w:br/>
         <w:t>السكتة ‏(Rest)‏ هي فترة صمت في الموسيقى. لكل قيمة نوتة هناك سكتة مقابلة:</w:t>
       </w:r>
     </w:p>
@@ -6346,7 +5653,6 @@
         <w:rPr>
           <w:rFonts w:ascii="Calibri" w:hAnsi="Calibri"/>
           <w:b/>
-          <w:color w:val="333333"/>
           <w:sz w:val="22"/>
           <w:rtl w:val="1"/>
           <w:rFonts w:cs="Calibri"/>
@@ -6968,65 +6274,19 @@
       <w:r>
         <w:rPr>
           <w:rFonts w:ascii="Calibri" w:hAnsi="Calibri"/>
-          <w:b/>
-          <w:color w:val="333333"/>
+          <w:b w:val="0"/>
           <w:sz w:val="22"/>
           <w:rtl w:val="1"/>
           <w:rFonts w:cs="Calibri"/>
           <w:szCs w:val="22"/>
         </w:rPr>
         <w:t>الميزان 3/4 ‏(Triple Meter)‏</w:t>
-      </w:r>
-    </w:p>
-    <w:p>
-      <w:pPr>
-        <w:bidi w:val="1"/>
-        <w:jc w:val="right"/>
-        <w:textDirection w:val="lrTb"/>
-      </w:pPr>
-      <w:r>
-        <w:rPr>
-          <w:rFonts w:ascii="Calibri" w:hAnsi="Calibri"/>
-          <w:sz w:val="22"/>
-          <w:rtl w:val="1"/>
-          <w:rFonts w:cs="Calibri"/>
-          <w:szCs w:val="22"/>
-        </w:rPr>
-        <w:t>• 3 دقات في كل مازورة</w:t>
-      </w:r>
-    </w:p>
-    <w:p>
-      <w:pPr>
-        <w:bidi w:val="1"/>
-        <w:jc w:val="right"/>
-        <w:textDirection w:val="lrTb"/>
-      </w:pPr>
-      <w:r>
-        <w:rPr>
-          <w:rFonts w:ascii="Calibri" w:hAnsi="Calibri"/>
-          <w:sz w:val="22"/>
-          <w:rtl w:val="1"/>
-          <w:rFonts w:cs="Calibri"/>
-          <w:szCs w:val="22"/>
-        </w:rPr>
-        <w:t>• النوار ‏(Quarter Note)‏ = دقة واحدة</w:t>
-      </w:r>
-    </w:p>
-    <w:p>
-      <w:pPr>
-        <w:bidi w:val="1"/>
-        <w:jc w:val="right"/>
-        <w:textDirection w:val="lrTb"/>
-      </w:pPr>
-      <w:r>
-        <w:rPr>
-          <w:rFonts w:ascii="Calibri" w:hAnsi="Calibri"/>
-          <w:sz w:val="22"/>
-          <w:rtl w:val="1"/>
-          <w:rFonts w:cs="Calibri"/>
-          <w:szCs w:val="22"/>
-        </w:rPr>
-        <w:t>• يستخدم في الموسيقى العربية: الملفوف، السماعي</w:t>
+        <w:br/>
+        <w:t>- 3 دقات في كل مازورة</w:t>
+        <w:br/>
+        <w:t>- النوار ‏(Quarter Note)‏ = دقة واحدة</w:t>
+        <w:br/>
+        <w:t>- يستخدم في الموسيقى العربية: الملفوف، السماعي</w:t>
       </w:r>
     </w:p>
     <w:p>
@@ -7057,162 +6317,19 @@
       <w:r>
         <w:rPr>
           <w:rFonts w:ascii="Calibri" w:hAnsi="Calibri"/>
-          <w:b/>
-          <w:color w:val="333333"/>
+          <w:b w:val="0"/>
           <w:sz w:val="22"/>
           <w:rtl w:val="1"/>
           <w:rFonts w:cs="Calibri"/>
           <w:szCs w:val="22"/>
         </w:rPr>
         <w:t>تمرين 1: إدخال السكتات ‏(10 دقائق)‏</w:t>
-      </w:r>
-    </w:p>
-    <w:p>
-      <w:pPr>
-        <w:bidi w:val="1"/>
-        <w:jc w:val="right"/>
-        <w:textDirection w:val="lrTb"/>
-      </w:pPr>
-      <w:r>
-        <w:rPr>
-          <w:rFonts w:ascii="Calibri" w:hAnsi="Calibri"/>
-          <w:sz w:val="22"/>
-          <w:rtl w:val="1"/>
-          <w:rFonts w:cs="Calibri"/>
-          <w:szCs w:val="22"/>
-        </w:rPr>
-        <w:t>افتح Sibelius → Blank Score → Treble Clef → 4/4</w:t>
-      </w:r>
-    </w:p>
-    <w:p>
-      <w:pPr>
-        <w:bidi w:val="1"/>
-        <w:jc w:val="right"/>
-        <w:textDirection w:val="lrTb"/>
-      </w:pPr>
-      <w:r>
-        <w:rPr>
-          <w:rFonts w:ascii="Calibri" w:hAnsi="Calibri"/>
-          <w:sz w:val="22"/>
-          <w:rtl w:val="1"/>
-          <w:rFonts w:cs="Calibri"/>
-          <w:szCs w:val="22"/>
-        </w:rPr>
-        <w:t>اضغط N → اختر Noire Rest من Keypad ‏(زر 0)‏</w:t>
-      </w:r>
-    </w:p>
-    <w:p>
-      <w:pPr>
-        <w:bidi w:val="1"/>
-        <w:jc w:val="right"/>
-        <w:textDirection w:val="lrTb"/>
-      </w:pPr>
-      <w:r>
-        <w:rPr>
-          <w:rFonts w:ascii="Calibri" w:hAnsi="Calibri"/>
-          <w:sz w:val="22"/>
-          <w:rtl w:val="1"/>
-          <w:rFonts w:cs="Calibri"/>
-          <w:szCs w:val="22"/>
-        </w:rPr>
-        <w:t>اكتب المازورة التالية:</w:t>
-      </w:r>
-    </w:p>
-    <w:p>
-      <w:pPr>
-        <w:bidi w:val="1"/>
-        <w:jc w:val="right"/>
-        <w:textDirection w:val="lrTb"/>
-        <w:shd w:fill="F5F5F5" w:val="clear"/>
-      </w:pPr>
-      <w:r>
-        <w:rPr>
-          <w:rFonts w:ascii="Courier New" w:hAnsi="Courier New"/>
-          <w:color w:val="333333"/>
-          <w:sz w:val="18"/>
-          <w:rtl w:val="1"/>
-          <w:rFonts w:cs="Calibri"/>
-          <w:szCs w:val="18"/>
-        </w:rPr>
-        <w:t>| Do  ‏(Noire)‏ |  ‏(Noire Rest)‏ | Mi  ‏(Noire)‏ |  ‏(Noire Rest)‏ |</w:t>
-        <w:br/>
-        <w:t>| Sol ‏(Noire)‏ |  ‏(Noire Rest)‏ | Do  ‏(Noire)‏ |  ‏(Noire Rest)‏ |</w:t>
-      </w:r>
-    </w:p>
-    <w:p>
-      <w:pPr>
-        <w:bidi w:val="1"/>
-        <w:jc w:val="right"/>
-        <w:textDirection w:val="lrTb"/>
-      </w:pPr>
-      <w:r>
-        <w:rPr>
-          <w:rFonts w:ascii="Calibri" w:hAnsi="Calibri"/>
-          <w:sz w:val="22"/>
-          <w:rtl w:val="1"/>
-          <w:rFonts w:cs="Calibri"/>
-          <w:szCs w:val="22"/>
-        </w:rPr>
-        <w:t>استمع لتسمع تأثير السكتات</w:t>
-      </w:r>
-    </w:p>
-    <w:p>
-      <w:pPr>
-        <w:bidi w:val="1"/>
-        <w:jc w:val="right"/>
-        <w:textDirection w:val="lrTb"/>
-      </w:pPr>
-      <w:r>
-        <w:rPr>
-          <w:rFonts w:ascii="Calibri" w:hAnsi="Calibri"/>
-          <w:b/>
-          <w:sz w:val="22"/>
-          <w:rtl w:val="1"/>
-          <w:rFonts w:cs="Calibri"/>
-          <w:szCs w:val="22"/>
-        </w:rPr>
-        <w:t>كيفية إدخال السكتة:</w:t>
-        <w:br/>
-        <w:t>- في Note Input Mode: اختر القيمة من Keypad ثم اضغط 0 ‏(Zero)‏ للسكتة</w:t>
-        <w:br/>
-        <w:t>- أو: اختر القيمة ثم اضغط Ctrl+Shift+[قيمة]</w:t>
-      </w:r>
-    </w:p>
-    <w:p>
-      <w:pPr>
-        <w:bidi w:val="1"/>
-        <w:jc w:val="right"/>
-        <w:textDirection w:val="lrTb"/>
-      </w:pPr>
-      <w:r>
-        <w:rPr>
-          <w:rFonts w:ascii="Calibri" w:hAnsi="Calibri"/>
-          <w:b/>
-          <w:color w:val="333333"/>
-          <w:sz w:val="22"/>
-          <w:rtl w:val="1"/>
-          <w:rFonts w:cs="Calibri"/>
-          <w:szCs w:val="22"/>
-        </w:rPr>
-        <w:t>تمرين 2: جميع السكتات ‏(10 دقائق)‏</w:t>
-      </w:r>
-    </w:p>
-    <w:p>
-      <w:pPr>
-        <w:bidi w:val="1"/>
-        <w:jc w:val="right"/>
-        <w:textDirection w:val="lrTb"/>
-      </w:pPr>
-      <w:r>
-        <w:rPr>
-          <w:rFonts w:ascii="Calibri" w:hAnsi="Calibri"/>
-          <w:b w:val="0"/>
-          <w:sz w:val="22"/>
-          <w:rtl w:val="1"/>
-          <w:rFonts w:cs="Calibri"/>
-          <w:szCs w:val="22"/>
-        </w:rPr>
-        <w:t>اكتب مازورة واحدة تحتوي على:</w:t>
+        <w:br/>
+        <w:t>1. افتح Sibelius → Blank Score → Treble Clef → 4/4</w:t>
+        <w:br/>
+        <w:t>2. اضغط N → اختر Noire Rest من Keypad ‏(زر 0)‏</w:t>
+        <w:br/>
+        <w:t>3. اكتب المازورة التالية:</w:t>
         <w:br/>
         <w:t>```</w:t>
       </w:r>
@@ -7260,6 +6377,258 @@
                 <w:rFonts w:cs="Calibri"/>
                 <w:szCs w:val="18"/>
               </w:rPr>
+              <w:t>Do  ‏(Noire)‏</w:t>
+            </w:r>
+          </w:p>
+        </w:tc>
+        <w:tc>
+          <w:tcPr>
+            <w:tcW w:type="dxa" w:w="2268"/>
+            <w:shd w:fill="2C3E6B" w:val="clear"/>
+          </w:tcPr>
+          <w:p>
+            <w:pPr>
+              <w:jc w:val="right"/>
+              <w:bidi w:val="1"/>
+              <w:textDirection w:val="lrTb"/>
+            </w:pPr>
+            <w:r/>
+            <w:r>
+              <w:rPr>
+                <w:rFonts w:ascii="Calibri" w:hAnsi="Calibri"/>
+                <w:b/>
+                <w:color w:val="FFFFFF"/>
+                <w:sz w:val="18"/>
+                <w:rtl w:val="1"/>
+                <w:rFonts w:cs="Calibri"/>
+                <w:szCs w:val="18"/>
+              </w:rPr>
+              <w:t>‏(Noire Rest)‏</w:t>
+            </w:r>
+          </w:p>
+        </w:tc>
+        <w:tc>
+          <w:tcPr>
+            <w:tcW w:type="dxa" w:w="2268"/>
+            <w:shd w:fill="2C3E6B" w:val="clear"/>
+          </w:tcPr>
+          <w:p>
+            <w:pPr>
+              <w:jc w:val="right"/>
+              <w:bidi w:val="1"/>
+              <w:textDirection w:val="lrTb"/>
+            </w:pPr>
+            <w:r/>
+            <w:r>
+              <w:rPr>
+                <w:rFonts w:ascii="Calibri" w:hAnsi="Calibri"/>
+                <w:b/>
+                <w:color w:val="FFFFFF"/>
+                <w:sz w:val="18"/>
+                <w:rtl w:val="1"/>
+                <w:rFonts w:cs="Calibri"/>
+                <w:szCs w:val="18"/>
+              </w:rPr>
+              <w:t>Mi  ‏(Noire)‏</w:t>
+            </w:r>
+          </w:p>
+        </w:tc>
+        <w:tc>
+          <w:tcPr>
+            <w:tcW w:type="dxa" w:w="2268"/>
+            <w:shd w:fill="2C3E6B" w:val="clear"/>
+          </w:tcPr>
+          <w:p>
+            <w:pPr>
+              <w:jc w:val="right"/>
+              <w:bidi w:val="1"/>
+              <w:textDirection w:val="lrTb"/>
+            </w:pPr>
+            <w:r/>
+            <w:r>
+              <w:rPr>
+                <w:rFonts w:ascii="Calibri" w:hAnsi="Calibri"/>
+                <w:b/>
+                <w:color w:val="FFFFFF"/>
+                <w:sz w:val="18"/>
+                <w:rtl w:val="1"/>
+                <w:rFonts w:cs="Calibri"/>
+                <w:szCs w:val="18"/>
+              </w:rPr>
+              <w:t>‏(Noire Rest)‏</w:t>
+            </w:r>
+          </w:p>
+        </w:tc>
+      </w:tr>
+      <w:tr>
+        <w:tc>
+          <w:tcPr>
+            <w:tcW w:type="dxa" w:w="2268"/>
+          </w:tcPr>
+          <w:p>
+            <w:pPr>
+              <w:jc w:val="right"/>
+              <w:bidi w:val="1"/>
+              <w:textDirection w:val="lrTb"/>
+            </w:pPr>
+            <w:r/>
+            <w:r>
+              <w:rPr>
+                <w:rFonts w:ascii="Calibri" w:hAnsi="Calibri"/>
+                <w:sz w:val="18"/>
+                <w:rtl w:val="1"/>
+                <w:rFonts w:cs="Calibri"/>
+                <w:szCs w:val="18"/>
+              </w:rPr>
+              <w:t>Sol ‏(Noire)‏</w:t>
+            </w:r>
+          </w:p>
+        </w:tc>
+        <w:tc>
+          <w:tcPr>
+            <w:tcW w:type="dxa" w:w="2268"/>
+          </w:tcPr>
+          <w:p>
+            <w:pPr>
+              <w:jc w:val="right"/>
+              <w:bidi w:val="1"/>
+              <w:textDirection w:val="lrTb"/>
+            </w:pPr>
+            <w:r/>
+            <w:r>
+              <w:rPr>
+                <w:rFonts w:ascii="Calibri" w:hAnsi="Calibri"/>
+                <w:sz w:val="18"/>
+                <w:rtl w:val="1"/>
+                <w:rFonts w:cs="Calibri"/>
+                <w:szCs w:val="18"/>
+              </w:rPr>
+              <w:t>‏(Noire Rest)‏</w:t>
+            </w:r>
+          </w:p>
+        </w:tc>
+        <w:tc>
+          <w:tcPr>
+            <w:tcW w:type="dxa" w:w="2268"/>
+          </w:tcPr>
+          <w:p>
+            <w:pPr>
+              <w:jc w:val="right"/>
+              <w:bidi w:val="1"/>
+              <w:textDirection w:val="lrTb"/>
+            </w:pPr>
+            <w:r/>
+            <w:r>
+              <w:rPr>
+                <w:rFonts w:ascii="Calibri" w:hAnsi="Calibri"/>
+                <w:sz w:val="18"/>
+                <w:rtl w:val="1"/>
+                <w:rFonts w:cs="Calibri"/>
+                <w:szCs w:val="18"/>
+              </w:rPr>
+              <w:t>Do  ‏(Noire)‏</w:t>
+            </w:r>
+          </w:p>
+        </w:tc>
+        <w:tc>
+          <w:tcPr>
+            <w:tcW w:type="dxa" w:w="2268"/>
+          </w:tcPr>
+          <w:p>
+            <w:pPr>
+              <w:jc w:val="right"/>
+              <w:bidi w:val="1"/>
+              <w:textDirection w:val="lrTb"/>
+            </w:pPr>
+            <w:r/>
+            <w:r>
+              <w:rPr>
+                <w:rFonts w:ascii="Calibri" w:hAnsi="Calibri"/>
+                <w:sz w:val="18"/>
+                <w:rtl w:val="1"/>
+                <w:rFonts w:cs="Calibri"/>
+                <w:szCs w:val="18"/>
+              </w:rPr>
+              <w:t>‏(Noire Rest)‏</w:t>
+            </w:r>
+          </w:p>
+        </w:tc>
+      </w:tr>
+    </w:tbl>
+    <w:p>
+      <w:pPr>
+        <w:bidi w:val="1"/>
+        <w:jc w:val="right"/>
+        <w:textDirection w:val="lrTb"/>
+        <w:shd w:fill="F5F5F5" w:val="clear"/>
+      </w:pPr>
+      <w:r>
+        <w:rPr>
+          <w:rFonts w:ascii="Courier New" w:hAnsi="Courier New"/>
+          <w:color w:val="333333"/>
+          <w:sz w:val="18"/>
+          <w:rtl w:val="1"/>
+          <w:rFonts w:cs="Calibri"/>
+          <w:szCs w:val="18"/>
+        </w:rPr>
+        <w:t>4. استمع لتسمع تأثير السكتات</w:t>
+        <w:br/>
+        <w:br/>
+        <w:t>كيفية إدخال السكتة:</w:t>
+        <w:br/>
+        <w:t>- في Note Input Mode: اختر القيمة من Keypad ثم اضغط 0 ‏(Zero)‏ للسكتة</w:t>
+        <w:br/>
+        <w:t>- أو: اختر القيمة ثم اضغط Ctrl+Shift+[قيمة]</w:t>
+        <w:br/>
+        <w:br/>
+        <w:t>تمرين 2: جميع السكتات ‏(10 دقائق)‏</w:t>
+        <w:br/>
+        <w:t>اكتب مازورة واحدة تحتوي على:</w:t>
+      </w:r>
+    </w:p>
+    <w:tbl>
+      <w:tblPr>
+        <w:tblW w:type="auto" w:w="0"/>
+        <w:jc w:val="center"/>
+        <w:tblLook w:firstColumn="1" w:firstRow="1" w:lastColumn="0" w:lastRow="0" w:noHBand="0" w:noVBand="1" w:val="04A0"/>
+        <w:tblBorders>
+          <w:top w:val="single" w:sz="4" w:space="0" w:color="2C3E6B"/>
+          <w:left w:val="single" w:sz="4" w:space="0" w:color="2C3E6B"/>
+          <w:bottom w:val="single" w:sz="4" w:space="0" w:color="2C3E6B"/>
+          <w:right w:val="single" w:sz="4" w:space="0" w:color="2C3E6B"/>
+          <w:insideH w:val="single" w:sz="4" w:space="0" w:color="2C3E6B"/>
+          <w:insideV w:val="single" w:sz="4" w:space="0" w:color="2C3E6B"/>
+        </w:tblBorders>
+      </w:tblPr>
+      <w:tblGrid>
+        <w:gridCol w:w="2268"/>
+        <w:gridCol w:w="2268"/>
+        <w:gridCol w:w="2268"/>
+        <w:gridCol w:w="2268"/>
+      </w:tblGrid>
+      <w:tr>
+        <w:tc>
+          <w:tcPr>
+            <w:tcW w:type="dxa" w:w="2268"/>
+            <w:shd w:fill="2C3E6B" w:val="clear"/>
+          </w:tcPr>
+          <w:p>
+            <w:pPr>
+              <w:jc w:val="right"/>
+              <w:bidi w:val="1"/>
+              <w:textDirection w:val="lrTb"/>
+            </w:pPr>
+            <w:r/>
+            <w:r>
+              <w:rPr>
+                <w:rFonts w:ascii="Calibri" w:hAnsi="Calibri"/>
+                <w:b/>
+                <w:color w:val="FFFFFF"/>
+                <w:sz w:val="18"/>
+                <w:rtl w:val="1"/>
+                <w:rFonts w:cs="Calibri"/>
+                <w:szCs w:val="18"/>
+              </w:rPr>
               <w:t>Do ‏(Noire)‏</w:t>
             </w:r>
           </w:p>
@@ -7442,7 +6811,7 @@
         <w:t>- اضغط Ctrl+Shift+R لإدخال Ronde Rest</w:t>
         <w:br/>
         <w:br/>
-        <w:t>#### تمرين 3: الميزان 3/4 ‏(10 دقائق)‏</w:t>
+        <w:t>تمرين 3: الميزان 3/4 ‏(10 دقائق)‏</w:t>
         <w:br/>
         <w:t>1. اختر Tab: Notations → Time Signature ‏(أو اسحب من Gallery)‏</w:t>
         <w:br/>
@@ -7488,7 +6857,7 @@
         <w:t>4. استمع ‏(لاحظ الإحساس 1-2-3, 1-2-3)‏</w:t>
         <w:br/>
         <w:br/>
-        <w:t>#### تمرين إضافي: خط المكرر ‏(Repeat)‏</w:t>
+        <w:t>تمرين إضافي: خط المكرر ‏(Repeat)‏</w:t>
         <w:br/>
         <w:t>1. ضع خط تكرار في البداية: اختر Repeat Barline من Notations → Barline</w:t>
         <w:br/>
@@ -7522,7 +6891,7 @@
         <w:t>### 4. مراجعة وواجب | Review &amp; HW ‏(5 min)‏</w:t>
         <w:br/>
         <w:br/>
-        <w:t>#### أسئلة المراجعة</w:t>
+        <w:t>أسئلة المراجعة</w:t>
         <w:br/>
         <w:t>1. ما الفرق بين Ronde Rest و Blanche Rest في الشكل والموضع؟</w:t>
         <w:br/>
@@ -7531,7 +6900,7 @@
         <w:t>3. ما اختصار إدخال سكتة في Sibelius؟</w:t>
         <w:br/>
         <w:br/>
-        <w:t>#### الواجب المنزلي</w:t>
+        <w:t>الواجب المنزلي</w:t>
         <w:br/>
         <w:t>1. أنشئ نوتة جديدة في 3/4 ‏(Treble Clef)‏</w:t>
         <w:br/>
@@ -8141,48 +7510,17 @@
       <w:r>
         <w:rPr>
           <w:rFonts w:ascii="Calibri" w:hAnsi="Calibri"/>
-          <w:b/>
-          <w:color w:val="333333"/>
+          <w:b w:val="0"/>
           <w:sz w:val="22"/>
           <w:rtl w:val="1"/>
           <w:rFonts w:cs="Calibri"/>
           <w:szCs w:val="22"/>
         </w:rPr>
         <w:t>الخطوط الإضافية ‏(Ledger Lines)‏</w:t>
-      </w:r>
-    </w:p>
-    <w:p>
-      <w:pPr>
-        <w:bidi w:val="1"/>
-        <w:jc w:val="right"/>
-        <w:textDirection w:val="lrTb"/>
-      </w:pPr>
-      <w:r>
-        <w:rPr>
-          <w:rFonts w:ascii="Calibri" w:hAnsi="Calibri"/>
-          <w:sz w:val="22"/>
-          <w:rtl w:val="1"/>
-          <w:rFonts w:cs="Calibri"/>
-          <w:szCs w:val="22"/>
-        </w:rPr>
-        <w:t>• تُستخدم لكتابة النوتات التي تكون أعلى أو أقل من المدرج</w:t>
-      </w:r>
-    </w:p>
-    <w:p>
-      <w:pPr>
-        <w:bidi w:val="1"/>
-        <w:jc w:val="right"/>
-        <w:textDirection w:val="lrTb"/>
-      </w:pPr>
-      <w:r>
-        <w:rPr>
-          <w:rFonts w:ascii="Calibri" w:hAnsi="Calibri"/>
-          <w:sz w:val="22"/>
-          <w:rtl w:val="1"/>
-          <w:rFonts w:cs="Calibri"/>
-          <w:szCs w:val="22"/>
-        </w:rPr>
-        <w:t>• كل خط إضافي يمثل درجة موسيقية</w:t>
+        <w:br/>
+        <w:t>- تُستخدم لكتابة النوتات التي تكون أعلى أو أقل من المدرج</w:t>
+        <w:br/>
+        <w:t>- كل خط إضافي يمثل درجة موسيقية</w:t>
       </w:r>
     </w:p>
     <w:p>
@@ -8237,7 +7575,6 @@
         <w:rPr>
           <w:rFonts w:ascii="Calibri" w:hAnsi="Calibri"/>
           <w:b/>
-          <w:color w:val="333333"/>
           <w:sz w:val="22"/>
           <w:rtl w:val="1"/>
           <w:rFonts w:cs="Calibri"/>
@@ -8668,48 +8005,17 @@
       <w:r>
         <w:rPr>
           <w:rFonts w:ascii="Calibri" w:hAnsi="Calibri"/>
-          <w:b/>
-          <w:color w:val="333333"/>
+          <w:b w:val="0"/>
           <w:sz w:val="22"/>
           <w:rtl w:val="1"/>
           <w:rFonts w:cs="Calibri"/>
           <w:szCs w:val="22"/>
         </w:rPr>
         <w:t>أنصاف الدرجات ‏(Half Steps / Semitones)‏</w:t>
-      </w:r>
-    </w:p>
-    <w:p>
-      <w:pPr>
-        <w:bidi w:val="1"/>
-        <w:jc w:val="right"/>
-        <w:textDirection w:val="lrTb"/>
-      </w:pPr>
-      <w:r>
-        <w:rPr>
-          <w:rFonts w:ascii="Calibri" w:hAnsi="Calibri"/>
-          <w:sz w:val="22"/>
-          <w:rtl w:val="1"/>
-          <w:rFonts w:cs="Calibri"/>
-          <w:szCs w:val="22"/>
-        </w:rPr>
-        <w:t>• نصف الدرجة ‏(Semitone)‏: أصغر مسافة بين نوتتين متجاورتين على البيانو</w:t>
-      </w:r>
-    </w:p>
-    <w:p>
-      <w:pPr>
-        <w:bidi w:val="1"/>
-        <w:jc w:val="right"/>
-        <w:textDirection w:val="lrTb"/>
-      </w:pPr>
-      <w:r>
-        <w:rPr>
-          <w:rFonts w:ascii="Calibri" w:hAnsi="Calibri"/>
-          <w:sz w:val="22"/>
-          <w:rtl w:val="1"/>
-          <w:rFonts w:cs="Calibri"/>
-          <w:szCs w:val="22"/>
-        </w:rPr>
-        <w:t>• الدرجة الكاملة ‏(Tone)‏: = 2 Semitones</w:t>
+        <w:br/>
+        <w:t>- نصف الدرجة ‏(Semitone)‏: أصغر مسافة بين نوتتين متجاورتين على البيانو</w:t>
+        <w:br/>
+        <w:t>- الدرجة الكاملة ‏(Tone)‏: = 2 Semitones</w:t>
       </w:r>
     </w:p>
     <w:p>
@@ -8740,150 +8046,29 @@
       <w:r>
         <w:rPr>
           <w:rFonts w:ascii="Calibri" w:hAnsi="Calibri"/>
-          <w:b/>
-          <w:color w:val="333333"/>
+          <w:b w:val="0"/>
           <w:sz w:val="22"/>
           <w:rtl w:val="1"/>
           <w:rFonts w:cs="Calibri"/>
           <w:szCs w:val="22"/>
         </w:rPr>
         <w:t>تمرين 1: الخطوط الإضافية ‏(10 دقائق)‏</w:t>
-      </w:r>
-    </w:p>
-    <w:p>
-      <w:pPr>
-        <w:bidi w:val="1"/>
-        <w:jc w:val="right"/>
-        <w:textDirection w:val="lrTb"/>
-      </w:pPr>
-      <w:r>
-        <w:rPr>
-          <w:rFonts w:ascii="Calibri" w:hAnsi="Calibri"/>
-          <w:sz w:val="22"/>
-          <w:rtl w:val="1"/>
-          <w:rFonts w:cs="Calibri"/>
-          <w:szCs w:val="22"/>
-        </w:rPr>
-        <w:t>افتح Sibelius → Treble Clef → 4/4</w:t>
-      </w:r>
-    </w:p>
-    <w:p>
-      <w:pPr>
-        <w:bidi w:val="1"/>
-        <w:jc w:val="right"/>
-        <w:textDirection w:val="lrTb"/>
-      </w:pPr>
-      <w:r>
-        <w:rPr>
-          <w:rFonts w:ascii="Calibri" w:hAnsi="Calibri"/>
-          <w:sz w:val="22"/>
-          <w:rtl w:val="1"/>
-          <w:rFonts w:cs="Calibri"/>
-          <w:szCs w:val="22"/>
-        </w:rPr>
-        <w:t>اكتب النوتات التالية ‏(منخفضة)‏:</w:t>
-      </w:r>
-    </w:p>
-    <w:p>
-      <w:pPr>
-        <w:bidi w:val="1"/>
-        <w:jc w:val="right"/>
-        <w:textDirection w:val="lrTb"/>
-      </w:pPr>
-      <w:r>
-        <w:rPr>
-          <w:rFonts w:ascii="Calibri" w:hAnsi="Calibri"/>
-          <w:sz w:val="22"/>
-          <w:rtl w:val="1"/>
-          <w:rFonts w:cs="Calibri"/>
-          <w:szCs w:val="22"/>
-        </w:rPr>
-        <w:t>• Do ‏(Middle C)‏: تحت المدرج، أول خط إضافي ← اكتب Do من Keypad</w:t>
-      </w:r>
-    </w:p>
-    <w:p>
-      <w:pPr>
-        <w:bidi w:val="1"/>
-        <w:jc w:val="right"/>
-        <w:textDirection w:val="lrTb"/>
-      </w:pPr>
-      <w:r>
-        <w:rPr>
-          <w:rFonts w:ascii="Calibri" w:hAnsi="Calibri"/>
-          <w:sz w:val="22"/>
-          <w:rtl w:val="1"/>
-          <w:rFonts w:cs="Calibri"/>
-          <w:szCs w:val="22"/>
-        </w:rPr>
-        <w:t>• Si ‏(B3)‏: تحت المدرج مباشرة ‏(آخر فراغ)‏</w:t>
-      </w:r>
-    </w:p>
-    <w:p>
-      <w:pPr>
-        <w:bidi w:val="1"/>
-        <w:jc w:val="right"/>
-        <w:textDirection w:val="lrTb"/>
-      </w:pPr>
-      <w:r>
-        <w:rPr>
-          <w:rFonts w:ascii="Calibri" w:hAnsi="Calibri"/>
-          <w:sz w:val="22"/>
-          <w:rtl w:val="1"/>
-          <w:rFonts w:cs="Calibri"/>
-          <w:szCs w:val="22"/>
-        </w:rPr>
-        <w:t>• La ‏(A3)‏: تحت المدرج، أول خط إضافي إضافي</w:t>
-      </w:r>
-    </w:p>
-    <w:p>
-      <w:pPr>
-        <w:bidi w:val="1"/>
-        <w:jc w:val="right"/>
-        <w:textDirection w:val="lrTb"/>
-      </w:pPr>
-      <w:r>
-        <w:rPr>
-          <w:rFonts w:ascii="Calibri" w:hAnsi="Calibri"/>
-          <w:sz w:val="22"/>
-          <w:rtl w:val="1"/>
-          <w:rFonts w:cs="Calibri"/>
-          <w:szCs w:val="22"/>
-        </w:rPr>
-        <w:t>اكتب النوتات التالية ‏(مرتفعة)‏:</w:t>
-      </w:r>
-    </w:p>
-    <w:p>
-      <w:pPr>
-        <w:bidi w:val="1"/>
-        <w:jc w:val="right"/>
-        <w:textDirection w:val="lrTb"/>
-      </w:pPr>
-      <w:r>
-        <w:rPr>
-          <w:rFonts w:ascii="Calibri" w:hAnsi="Calibri"/>
-          <w:sz w:val="22"/>
-          <w:rtl w:val="1"/>
-          <w:rFonts w:cs="Calibri"/>
-          <w:szCs w:val="22"/>
-        </w:rPr>
-        <w:t>• La ‏(A5)‏: فوق المدرج × 1</w:t>
-      </w:r>
-    </w:p>
-    <w:p>
-      <w:pPr>
-        <w:bidi w:val="1"/>
-        <w:jc w:val="right"/>
-        <w:textDirection w:val="lrTb"/>
-      </w:pPr>
-      <w:r>
-        <w:rPr>
-          <w:rFonts w:ascii="Calibri" w:hAnsi="Calibri"/>
-          <w:sz w:val="22"/>
-          <w:rtl w:val="1"/>
-          <w:rFonts w:cs="Calibri"/>
-          <w:szCs w:val="22"/>
-        </w:rPr>
-        <w:t>• Do ‏(C6)‏: فوق المدرج × 2</w:t>
+        <w:br/>
+        <w:t>1. افتح Sibelius → Treble Clef → 4/4</w:t>
+        <w:br/>
+        <w:t>2. اكتب النوتات التالية ‏(منخفضة)‏:</w:t>
+        <w:br/>
+        <w:t xml:space="preserve">   - Do ‏(Middle C)‏: تحت المدرج، أول خط إضافي ← اكتب Do من Keypad</w:t>
+        <w:br/>
+        <w:t xml:space="preserve">   - Si ‏(B3)‏: تحت المدرج مباشرة ‏(آخر فراغ)‏</w:t>
+        <w:br/>
+        <w:t xml:space="preserve">   - La ‏(A3)‏: تحت المدرج، أول خط إضافي إضافي</w:t>
+        <w:br/>
+        <w:t>3. اكتب النوتات التالية ‏(مرتفعة)‏:</w:t>
+        <w:br/>
+        <w:t xml:space="preserve">   - La ‏(A5)‏: فوق المدرج × 1</w:t>
+        <w:br/>
+        <w:t xml:space="preserve">   - Do ‏(C6)‏: فوق المدرج × 2</w:t>
       </w:r>
     </w:p>
     <w:p>
@@ -8921,31 +8106,15 @@
       <w:r>
         <w:rPr>
           <w:rFonts w:ascii="Calibri" w:hAnsi="Calibri"/>
-          <w:b/>
-          <w:color w:val="333333"/>
+          <w:b w:val="0"/>
           <w:sz w:val="22"/>
           <w:rtl w:val="1"/>
           <w:rFonts w:cs="Calibri"/>
           <w:szCs w:val="22"/>
         </w:rPr>
         <w:t>تمرين 2: العلامات العرضية ‏(10 دقائق)‏</w:t>
-      </w:r>
-    </w:p>
-    <w:p>
-      <w:pPr>
-        <w:bidi w:val="1"/>
-        <w:jc w:val="right"/>
-        <w:textDirection w:val="lrTb"/>
-      </w:pPr>
-      <w:r>
-        <w:rPr>
-          <w:rFonts w:ascii="Calibri" w:hAnsi="Calibri"/>
-          <w:sz w:val="22"/>
-          <w:rtl w:val="1"/>
-          <w:rFonts w:cs="Calibri"/>
-          <w:szCs w:val="22"/>
-        </w:rPr>
-        <w:t>اكتب الأنماط التالية:</w:t>
+        <w:br/>
+        <w:t>1. اكتب الأنماط التالية:</w:t>
       </w:r>
     </w:p>
     <w:p>
@@ -9014,7 +8183,7 @@
         <w:t>- اضغط = ‏(Equals)‏ ← إلغاء العلامة ‏(Natural)‏</w:t>
         <w:br/>
         <w:br/>
-        <w:t>#### تمرين 3: مازورة بالعلامات العرضية ‏(10 دقائق)‏</w:t>
+        <w:t>تمرين 3: مازورة بالعلامات العرضية ‏(10 دقائق)‏</w:t>
         <w:br/>
         <w:t>اكتب:</w:t>
       </w:r>
@@ -9257,7 +8426,7 @@
           <w:szCs w:val="18"/>
         </w:rPr>
         <w:br/>
-        <w:t>#### تمرين إضافي: عزف البيانو الخيالي</w:t>
+        <w:t>تمرين إضافي: عزف البيانو الخيالي</w:t>
         <w:br/>
         <w:t>- تخيل أن Do - Do♯ - Re - Re♯ - Mi - Fa - Fa♯ - Sol - Sol♯ - La - La♯ - Si - Do</w:t>
         <w:br/>
@@ -9291,7 +8460,7 @@
         <w:t>### 4. مراجعة وواجب | Review &amp; HW ‏(5 min)‏</w:t>
         <w:br/>
         <w:br/>
-        <w:t>#### أسئلة المراجعة</w:t>
+        <w:t>أسئلة المراجعة</w:t>
         <w:br/>
         <w:t>1. ما اسم الخط الذي يُستخدم لكتابة النوتات خارج المدرج؟</w:t>
         <w:br/>
@@ -9300,7 +8469,7 @@
         <w:t>3. ما اختصار إضافة Sharp في Sibelius؟</w:t>
         <w:br/>
         <w:br/>
-        <w:t>#### الواجب المنزلي</w:t>
+        <w:t>الواجب المنزلي</w:t>
         <w:br/>
         <w:t>1. أنشئ نوتة جديدة ‏(Treble Clef, 4/4)‏</w:t>
         <w:br/>
@@ -9909,7 +9078,6 @@
         <w:rPr>
           <w:rFonts w:ascii="Calibri" w:hAnsi="Calibri"/>
           <w:b/>
-          <w:color w:val="333333"/>
           <w:sz w:val="22"/>
           <w:rtl w:val="1"/>
           <w:rFonts w:cs="Calibri"/>
@@ -10441,7 +9609,6 @@
         <w:rPr>
           <w:rFonts w:ascii="Calibri" w:hAnsi="Calibri"/>
           <w:b/>
-          <w:color w:val="333333"/>
           <w:sz w:val="22"/>
           <w:rtl w:val="1"/>
           <w:rFonts w:cs="Calibri"/>
@@ -10991,152 +10158,27 @@
       <w:r>
         <w:rPr>
           <w:rFonts w:ascii="Calibri" w:hAnsi="Calibri"/>
-          <w:b/>
-          <w:color w:val="333333"/>
+          <w:b w:val="0"/>
           <w:sz w:val="22"/>
           <w:rtl w:val="1"/>
           <w:rFonts w:cs="Calibri"/>
           <w:szCs w:val="22"/>
         </w:rPr>
         <w:t>تمرين 1: استكشاف الواجهة ‏(10 دقائق)‏</w:t>
-      </w:r>
-    </w:p>
-    <w:p>
-      <w:pPr>
-        <w:bidi w:val="1"/>
-        <w:jc w:val="right"/>
-        <w:textDirection w:val="lrTb"/>
-      </w:pPr>
-      <w:r>
-        <w:rPr>
-          <w:rFonts w:ascii="Calibri" w:hAnsi="Calibri"/>
-          <w:sz w:val="22"/>
-          <w:rtl w:val="1"/>
-          <w:rFonts w:cs="Calibri"/>
-          <w:szCs w:val="22"/>
-        </w:rPr>
-        <w:t>افتح Sibelius → Blank Score → ‏(اختر أي إعدادات)‏</w:t>
-      </w:r>
-    </w:p>
-    <w:p>
-      <w:pPr>
-        <w:bidi w:val="1"/>
-        <w:jc w:val="right"/>
-        <w:textDirection w:val="lrTb"/>
-      </w:pPr>
-      <w:r>
-        <w:rPr>
-          <w:rFonts w:ascii="Calibri" w:hAnsi="Calibri"/>
-          <w:sz w:val="22"/>
-          <w:rtl w:val="1"/>
-          <w:rFonts w:cs="Calibri"/>
-          <w:szCs w:val="22"/>
-        </w:rPr>
-        <w:t>جرب إظهار وإخفاء الأجزاء التالية:</w:t>
-      </w:r>
-    </w:p>
-    <w:p>
-      <w:pPr>
-        <w:bidi w:val="1"/>
-        <w:jc w:val="right"/>
-        <w:textDirection w:val="lrTb"/>
-      </w:pPr>
-      <w:r>
-        <w:rPr>
-          <w:rFonts w:ascii="Calibri" w:hAnsi="Calibri"/>
-          <w:sz w:val="22"/>
-          <w:rtl w:val="1"/>
-          <w:rFonts w:cs="Calibri"/>
-          <w:szCs w:val="22"/>
-        </w:rPr>
-        <w:t>• Keypad: F9</w:t>
-      </w:r>
-    </w:p>
-    <w:p>
-      <w:pPr>
-        <w:bidi w:val="1"/>
-        <w:jc w:val="right"/>
-        <w:textDirection w:val="lrTb"/>
-      </w:pPr>
-      <w:r>
-        <w:rPr>
-          <w:rFonts w:ascii="Calibri" w:hAnsi="Calibri"/>
-          <w:sz w:val="22"/>
-          <w:rtl w:val="1"/>
-          <w:rFonts w:cs="Calibri"/>
-          <w:szCs w:val="22"/>
-        </w:rPr>
-        <w:t>• Mixer: F10</w:t>
-      </w:r>
-    </w:p>
-    <w:p>
-      <w:pPr>
-        <w:bidi w:val="1"/>
-        <w:jc w:val="right"/>
-        <w:textDirection w:val="lrTb"/>
-      </w:pPr>
-      <w:r>
-        <w:rPr>
-          <w:rFonts w:ascii="Calibri" w:hAnsi="Calibri"/>
-          <w:sz w:val="22"/>
-          <w:rtl w:val="1"/>
-          <w:rFonts w:cs="Calibri"/>
-          <w:szCs w:val="22"/>
-        </w:rPr>
-        <w:t>• Properties: F8</w:t>
-      </w:r>
-    </w:p>
-    <w:p>
-      <w:pPr>
-        <w:bidi w:val="1"/>
-        <w:jc w:val="right"/>
-        <w:textDirection w:val="lrTb"/>
-      </w:pPr>
-      <w:r>
-        <w:rPr>
-          <w:rFonts w:ascii="Calibri" w:hAnsi="Calibri"/>
-          <w:sz w:val="22"/>
-          <w:rtl w:val="1"/>
-          <w:rFonts w:cs="Calibri"/>
-          <w:szCs w:val="22"/>
-        </w:rPr>
-        <w:t>• Navigator: Ctrl+Shift+N</w:t>
-      </w:r>
-    </w:p>
-    <w:p>
-      <w:pPr>
-        <w:bidi w:val="1"/>
-        <w:jc w:val="right"/>
-        <w:textDirection w:val="lrTb"/>
-      </w:pPr>
-      <w:r>
-        <w:rPr>
-          <w:rFonts w:ascii="Calibri" w:hAnsi="Calibri"/>
-          <w:sz w:val="22"/>
-          <w:rtl w:val="1"/>
-          <w:rFonts w:cs="Calibri"/>
-          <w:szCs w:val="22"/>
-        </w:rPr>
-        <w:t>مرر الماوس على كل أيقونة في Ribbon لقراءة التلميح</w:t>
-      </w:r>
-    </w:p>
-    <w:p>
-      <w:pPr>
-        <w:bidi w:val="1"/>
-        <w:jc w:val="right"/>
-        <w:textDirection w:val="lrTb"/>
-      </w:pPr>
-      <w:r>
-        <w:rPr>
-          <w:rFonts w:ascii="Calibri" w:hAnsi="Calibri"/>
-          <w:b/>
-          <w:color w:val="333333"/>
-          <w:sz w:val="22"/>
-          <w:rtl w:val="1"/>
-          <w:rFonts w:cs="Calibri"/>
-          <w:szCs w:val="22"/>
-        </w:rPr>
-        <w:t>تمرين 2: استخدام Keypad المتقدم ‏(10 دقائق)‏</w:t>
+        <w:br/>
+        <w:t>1. افتح Sibelius → Blank Score → ‏(اختر أي إعدادات)‏</w:t>
+        <w:br/>
+        <w:t>2. جرب إظهار وإخفاء الأجزاء التالية:</w:t>
+        <w:br/>
+        <w:t xml:space="preserve">   - Keypad: F9</w:t>
+        <w:br/>
+        <w:t xml:space="preserve">   - Mixer: F10</w:t>
+        <w:br/>
+        <w:t xml:space="preserve">   - Properties: F8</w:t>
+        <w:br/>
+        <w:t xml:space="preserve">   - Navigator: Ctrl+Shift+N</w:t>
+        <w:br/>
+        <w:t>3. مرر الماوس على كل أيقونة في Ribbon لقراءة التلميح</w:t>
       </w:r>
     </w:p>
     <w:p>
@@ -11154,6 +10196,8 @@
           <w:rFonts w:cs="Calibri"/>
           <w:szCs w:val="22"/>
         </w:rPr>
+        <w:t>تمرين 2: استخدام Keypad المتقدم ‏(10 دقائق)‏</w:t>
+        <w:br/>
         <w:t>Keypad له 3 صفحات ‏(Layouts)‏:</w:t>
       </w:r>
     </w:p>
@@ -11255,81 +10299,20 @@
         <w:rPr>
           <w:rFonts w:ascii="Calibri" w:hAnsi="Calibri"/>
           <w:b/>
-          <w:color w:val="333333"/>
           <w:sz w:val="22"/>
           <w:rtl w:val="1"/>
           <w:rFonts w:cs="Calibri"/>
           <w:szCs w:val="22"/>
         </w:rPr>
         <w:t>تمرين 3: تخصيص Quick Access Toolbar ‏(5 دقائق)‏</w:t>
-      </w:r>
-    </w:p>
-    <w:p>
-      <w:pPr>
-        <w:bidi w:val="1"/>
-        <w:jc w:val="right"/>
-        <w:textDirection w:val="lrTb"/>
-      </w:pPr>
-      <w:r>
-        <w:rPr>
-          <w:rFonts w:ascii="Calibri" w:hAnsi="Calibri"/>
-          <w:sz w:val="22"/>
-          <w:rtl w:val="1"/>
-          <w:rFonts w:cs="Calibri"/>
-          <w:szCs w:val="22"/>
-        </w:rPr>
-        <w:t>اضغط على السهم الصغير بجانب Quick Access Toolbar</w:t>
-      </w:r>
-    </w:p>
-    <w:p>
-      <w:pPr>
-        <w:bidi w:val="1"/>
-        <w:jc w:val="right"/>
-        <w:textDirection w:val="lrTb"/>
-      </w:pPr>
-      <w:r>
-        <w:rPr>
-          <w:rFonts w:ascii="Calibri" w:hAnsi="Calibri"/>
-          <w:sz w:val="22"/>
-          <w:rtl w:val="1"/>
-          <w:rFonts w:cs="Calibri"/>
-          <w:szCs w:val="22"/>
-        </w:rPr>
-        <w:t>اختر More Commands</w:t>
-      </w:r>
-    </w:p>
-    <w:p>
-      <w:pPr>
-        <w:bidi w:val="1"/>
-        <w:jc w:val="right"/>
-        <w:textDirection w:val="lrTb"/>
-      </w:pPr>
-      <w:r>
-        <w:rPr>
-          <w:rFonts w:ascii="Calibri" w:hAnsi="Calibri"/>
-          <w:sz w:val="22"/>
-          <w:rtl w:val="1"/>
-          <w:rFonts w:cs="Calibri"/>
-          <w:szCs w:val="22"/>
-        </w:rPr>
-        <w:t>أضف الأوامر المفضلة ‏(مثلاً: Save As, Export PDF, Print)‏</w:t>
-      </w:r>
-    </w:p>
-    <w:p>
-      <w:pPr>
-        <w:bidi w:val="1"/>
-        <w:jc w:val="right"/>
-        <w:textDirection w:val="lrTb"/>
-      </w:pPr>
-      <w:r>
-        <w:rPr>
-          <w:rFonts w:ascii="Calibri" w:hAnsi="Calibri"/>
-          <w:sz w:val="22"/>
-          <w:rtl w:val="1"/>
-          <w:rFonts w:cs="Calibri"/>
-          <w:szCs w:val="22"/>
-        </w:rPr>
-        <w:t>انقر OK</w:t>
+        <w:br/>
+        <w:t>1. اضغط على السهم الصغير بجانب Quick Access Toolbar</w:t>
+        <w:br/>
+        <w:t>2. اختر More Commands</w:t>
+        <w:br/>
+        <w:t>3. أضف الأوامر المفضلة ‏(مثلاً: Save As, Export PDF, Print)‏</w:t>
+        <w:br/>
+        <w:t>4. انقر OK</w:t>
       </w:r>
     </w:p>
     <w:p>
@@ -11342,7 +10325,6 @@
         <w:rPr>
           <w:rFonts w:ascii="Calibri" w:hAnsi="Calibri"/>
           <w:b/>
-          <w:color w:val="333333"/>
           <w:sz w:val="22"/>
           <w:rtl w:val="1"/>
           <w:rFonts w:cs="Calibri"/>
@@ -12272,14 +11254,19 @@
       <w:r>
         <w:rPr>
           <w:rFonts w:ascii="Calibri" w:hAnsi="Calibri"/>
-          <w:b/>
-          <w:color w:val="333333"/>
+          <w:b w:val="0"/>
           <w:sz w:val="22"/>
           <w:rtl w:val="1"/>
           <w:rFonts w:cs="Calibri"/>
           <w:szCs w:val="22"/>
         </w:rPr>
         <w:t>أسئلة المراجعة</w:t>
+        <w:br/>
+        <w:t>1. كم عدد التبويبات الرئيسية في Ribbon؟</w:t>
+        <w:br/>
+        <w:t>2. ما اختصار إظهار Keypad؟</w:t>
+        <w:br/>
+        <w:t>3. كيف تنتقل إلى مازورة رقم 25 بسرعة؟</w:t>
       </w:r>
     </w:p>
     <w:p>
@@ -12291,218 +11278,31 @@
       <w:r>
         <w:rPr>
           <w:rFonts w:ascii="Calibri" w:hAnsi="Calibri"/>
-          <w:sz w:val="22"/>
-          <w:rtl w:val="1"/>
-          <w:rFonts w:cs="Calibri"/>
-          <w:szCs w:val="22"/>
-        </w:rPr>
-        <w:t>كم عدد التبويبات الرئيسية في Ribbon؟</w:t>
-      </w:r>
-    </w:p>
-    <w:p>
-      <w:pPr>
-        <w:bidi w:val="1"/>
-        <w:jc w:val="right"/>
-        <w:textDirection w:val="lrTb"/>
-      </w:pPr>
-      <w:r>
-        <w:rPr>
-          <w:rFonts w:ascii="Calibri" w:hAnsi="Calibri"/>
-          <w:sz w:val="22"/>
-          <w:rtl w:val="1"/>
-          <w:rFonts w:cs="Calibri"/>
-          <w:szCs w:val="22"/>
-        </w:rPr>
-        <w:t>ما اختصار إظهار Keypad؟</w:t>
-      </w:r>
-    </w:p>
-    <w:p>
-      <w:pPr>
-        <w:bidi w:val="1"/>
-        <w:jc w:val="right"/>
-        <w:textDirection w:val="lrTb"/>
-      </w:pPr>
-      <w:r>
-        <w:rPr>
-          <w:rFonts w:ascii="Calibri" w:hAnsi="Calibri"/>
-          <w:sz w:val="22"/>
-          <w:rtl w:val="1"/>
-          <w:rFonts w:cs="Calibri"/>
-          <w:szCs w:val="22"/>
-        </w:rPr>
-        <w:t>كيف تنتقل إلى مازورة رقم 25 بسرعة؟</w:t>
-      </w:r>
-    </w:p>
-    <w:p>
-      <w:pPr>
-        <w:bidi w:val="1"/>
-        <w:jc w:val="right"/>
-        <w:textDirection w:val="lrTb"/>
-      </w:pPr>
-      <w:r>
-        <w:rPr>
-          <w:rFonts w:ascii="Calibri" w:hAnsi="Calibri"/>
-          <w:b/>
-          <w:color w:val="333333"/>
+          <w:b w:val="0"/>
           <w:sz w:val="22"/>
           <w:rtl w:val="1"/>
           <w:rFonts w:cs="Calibri"/>
           <w:szCs w:val="22"/>
         </w:rPr>
         <w:t>الواجب المنزلي</w:t>
-      </w:r>
-    </w:p>
-    <w:p>
-      <w:pPr>
-        <w:bidi w:val="1"/>
-        <w:jc w:val="right"/>
-        <w:textDirection w:val="lrTb"/>
-      </w:pPr>
-      <w:r>
-        <w:rPr>
-          <w:rFonts w:ascii="Calibri" w:hAnsi="Calibri"/>
-          <w:sz w:val="22"/>
-          <w:rtl w:val="1"/>
-          <w:rFonts w:cs="Calibri"/>
-          <w:szCs w:val="22"/>
-        </w:rPr>
-        <w:t>افتح Sibelius وأنشئ نوتة جديدة ‏(أي إعدادات)‏</w:t>
-      </w:r>
-    </w:p>
-    <w:p>
-      <w:pPr>
-        <w:bidi w:val="1"/>
-        <w:jc w:val="right"/>
-        <w:textDirection w:val="lrTb"/>
-      </w:pPr>
-      <w:r>
-        <w:rPr>
-          <w:rFonts w:ascii="Calibri" w:hAnsi="Calibri"/>
-          <w:sz w:val="22"/>
-          <w:rtl w:val="1"/>
-          <w:rFonts w:cs="Calibri"/>
-          <w:szCs w:val="22"/>
-        </w:rPr>
-        <w:t>تخصيص Quick Access Toolbar بإضافة:</w:t>
-      </w:r>
-    </w:p>
-    <w:p>
-      <w:pPr>
-        <w:bidi w:val="1"/>
-        <w:jc w:val="right"/>
-        <w:textDirection w:val="lrTb"/>
-      </w:pPr>
-      <w:r>
-        <w:rPr>
-          <w:rFonts w:ascii="Calibri" w:hAnsi="Calibri"/>
-          <w:sz w:val="22"/>
-          <w:rtl w:val="1"/>
-          <w:rFonts w:cs="Calibri"/>
-          <w:szCs w:val="22"/>
-        </w:rPr>
-        <w:t>• Export PDF</w:t>
-      </w:r>
-    </w:p>
-    <w:p>
-      <w:pPr>
-        <w:bidi w:val="1"/>
-        <w:jc w:val="right"/>
-        <w:textDirection w:val="lrTb"/>
-      </w:pPr>
-      <w:r>
-        <w:rPr>
-          <w:rFonts w:ascii="Calibri" w:hAnsi="Calibri"/>
-          <w:sz w:val="22"/>
-          <w:rtl w:val="1"/>
-          <w:rFonts w:cs="Calibri"/>
-          <w:szCs w:val="22"/>
-        </w:rPr>
-        <w:t>• Print</w:t>
-      </w:r>
-    </w:p>
-    <w:p>
-      <w:pPr>
-        <w:bidi w:val="1"/>
-        <w:jc w:val="right"/>
-        <w:textDirection w:val="lrTb"/>
-      </w:pPr>
-      <w:r>
-        <w:rPr>
-          <w:rFonts w:ascii="Calibri" w:hAnsi="Calibri"/>
-          <w:sz w:val="22"/>
-          <w:rtl w:val="1"/>
-          <w:rFonts w:cs="Calibri"/>
-          <w:szCs w:val="22"/>
-        </w:rPr>
-        <w:t>• Undo</w:t>
-      </w:r>
-    </w:p>
-    <w:p>
-      <w:pPr>
-        <w:bidi w:val="1"/>
-        <w:jc w:val="right"/>
-        <w:textDirection w:val="lrTb"/>
-      </w:pPr>
-      <w:r>
-        <w:rPr>
-          <w:rFonts w:ascii="Calibri" w:hAnsi="Calibri"/>
-          <w:sz w:val="22"/>
-          <w:rtl w:val="1"/>
-          <w:rFonts w:cs="Calibri"/>
-          <w:szCs w:val="22"/>
-        </w:rPr>
-        <w:t>• Redo</w:t>
-      </w:r>
-    </w:p>
-    <w:p>
-      <w:pPr>
-        <w:bidi w:val="1"/>
-        <w:jc w:val="right"/>
-        <w:textDirection w:val="lrTb"/>
-      </w:pPr>
-      <w:r>
-        <w:rPr>
-          <w:rFonts w:ascii="Calibri" w:hAnsi="Calibri"/>
-          <w:sz w:val="22"/>
-          <w:rtl w:val="1"/>
-          <w:rFonts w:cs="Calibri"/>
-          <w:szCs w:val="22"/>
-        </w:rPr>
-        <w:t>جرب التنقل بين جميع تبويبات Ribbon</w:t>
-      </w:r>
-    </w:p>
-    <w:p>
-      <w:pPr>
-        <w:bidi w:val="1"/>
-        <w:jc w:val="right"/>
-        <w:textDirection w:val="lrTb"/>
-      </w:pPr>
-      <w:r>
-        <w:rPr>
-          <w:rFonts w:ascii="Calibri" w:hAnsi="Calibri"/>
-          <w:sz w:val="22"/>
-          <w:rtl w:val="1"/>
-          <w:rFonts w:cs="Calibri"/>
-          <w:szCs w:val="22"/>
-        </w:rPr>
-        <w:t>أرسل لقطة شاشة لواجهة Sibelius مع تحديد 5 أجزاء رئيسية</w:t>
-      </w:r>
-    </w:p>
-    <w:p>
-      <w:pPr>
-        <w:bidi w:val="1"/>
-        <w:jc w:val="right"/>
-        <w:textDirection w:val="lrTb"/>
-      </w:pPr>
-      <w:r>
-        <w:rPr>
-          <w:rFonts w:ascii="Calibri" w:hAnsi="Calibri"/>
-          <w:sz w:val="22"/>
-          <w:rtl w:val="1"/>
-          <w:rFonts w:cs="Calibri"/>
-          <w:szCs w:val="22"/>
-        </w:rPr>
-        <w:t>احفظ باسم `Lesson5_Interface.sib`</w:t>
+        <w:br/>
+        <w:t>1. افتح Sibelius وأنشئ نوتة جديدة ‏(أي إعدادات)‏</w:t>
+        <w:br/>
+        <w:t>2. تخصيص Quick Access Toolbar بإضافة:</w:t>
+        <w:br/>
+        <w:t xml:space="preserve">   - Export PDF</w:t>
+        <w:br/>
+        <w:t xml:space="preserve">   - Print</w:t>
+        <w:br/>
+        <w:t xml:space="preserve">   - Undo</w:t>
+        <w:br/>
+        <w:t xml:space="preserve">   - Redo</w:t>
+        <w:br/>
+        <w:t>3. جرب التنقل بين جميع تبويبات Ribbon</w:t>
+        <w:br/>
+        <w:t>4. أرسل لقطة شاشة لواجهة Sibelius مع تحديد 5 أجزاء رئيسية</w:t>
+        <w:br/>
+        <w:t>5. احفظ باسم `Lesson5_Interface.sib`</w:t>
       </w:r>
     </w:p>
     <w:p>
@@ -13978,31 +12778,14 @@
       <w:r>
         <w:rPr>
           <w:rFonts w:ascii="Calibri" w:hAnsi="Calibri"/>
-          <w:b/>
-          <w:color w:val="333333"/>
+          <w:b w:val="0"/>
           <w:sz w:val="22"/>
           <w:rtl w:val="1"/>
           <w:rFonts w:cs="Calibri"/>
           <w:szCs w:val="22"/>
         </w:rPr>
         <w:t>إدخال النوتة بالحروف ‏(Alphabetical Input)‏</w:t>
-      </w:r>
-    </w:p>
-    <w:p>
-      <w:pPr>
-        <w:bidi w:val="1"/>
-        <w:jc w:val="right"/>
-        <w:textDirection w:val="lrTb"/>
-      </w:pPr>
-      <w:r>
-        <w:rPr>
-          <w:rFonts w:ascii="Calibri" w:hAnsi="Calibri"/>
-          <w:b w:val="0"/>
-          <w:sz w:val="22"/>
-          <w:rtl w:val="1"/>
-          <w:rFonts w:cs="Calibri"/>
-          <w:szCs w:val="22"/>
-        </w:rPr>
+        <w:br/>
         <w:t>في Sibelius، يمكن إدخال النوتة بسرعة باستخدام الحروف:</w:t>
       </w:r>
     </w:p>
@@ -14621,14 +13404,23 @@
       <w:r>
         <w:rPr>
           <w:rFonts w:ascii="Calibri" w:hAnsi="Calibri"/>
-          <w:b/>
-          <w:color w:val="333333"/>
+          <w:b w:val="0"/>
           <w:sz w:val="22"/>
           <w:rtl w:val="1"/>
           <w:rFonts w:cs="Calibri"/>
           <w:szCs w:val="22"/>
         </w:rPr>
         <w:t>Step Time Input</w:t>
+        <w:br/>
+        <w:t>أسرع طريقة لإدخال النوتة في Sibelius:</w:t>
+        <w:br/>
+        <w:t>1. اضغط N ‏(Note Input Mode)‏</w:t>
+        <w:br/>
+        <w:t>2. اختر القيمة من Keypad ‏(1-2-3-4-5-6-7)‏</w:t>
+        <w:br/>
+        <w:t>3. اكتب الحرف ‏(C D E F G A B)‏ ← تظهر النوتة فوراً</w:t>
+        <w:br/>
+        <w:t>4. تنتقل المؤشر تلقائياً للنوتة التالية</w:t>
       </w:r>
     </w:p>
     <w:p>
@@ -14646,85 +13438,13 @@
           <w:rFonts w:cs="Calibri"/>
           <w:szCs w:val="22"/>
         </w:rPr>
-        <w:t>أسرع طريقة لإدخال النوتة في Sibelius:</w:t>
-        <w:br/>
-        <w:t>1. اضغط N ‏(Note Input Mode)‏</w:t>
-        <w:br/>
-        <w:t>2. اختر القيمة من Keypad ‏(1-2-3-4-5-6-7)‏</w:t>
-        <w:br/>
-        <w:t>3. اكتب الحرف ‏(C D E F G A B)‏ ← تظهر النوتة فوراً</w:t>
-        <w:br/>
-        <w:t>4. تنتقل المؤشر تلقائياً للنوتة التالية</w:t>
-      </w:r>
-    </w:p>
-    <w:p>
-      <w:pPr>
-        <w:bidi w:val="1"/>
-        <w:jc w:val="right"/>
-        <w:textDirection w:val="lrTb"/>
-      </w:pPr>
-      <w:r>
-        <w:rPr>
-          <w:rFonts w:ascii="Calibri" w:hAnsi="Calibri"/>
-          <w:b/>
-          <w:color w:val="333333"/>
-          <w:sz w:val="22"/>
-          <w:rtl w:val="1"/>
-          <w:rFonts w:cs="Calibri"/>
-          <w:szCs w:val="22"/>
-        </w:rPr>
         <w:t>إدخال أوكتافات مختلفة</w:t>
-      </w:r>
-    </w:p>
-    <w:p>
-      <w:pPr>
-        <w:bidi w:val="1"/>
-        <w:jc w:val="right"/>
-        <w:textDirection w:val="lrTb"/>
-      </w:pPr>
-      <w:r>
-        <w:rPr>
-          <w:rFonts w:ascii="Calibri" w:hAnsi="Calibri"/>
-          <w:sz w:val="22"/>
-          <w:rtl w:val="1"/>
-          <w:rFonts w:cs="Calibri"/>
-          <w:szCs w:val="22"/>
-        </w:rPr>
-        <w:t>• C' ‏(Middle C)‏ = C صغير</w:t>
-      </w:r>
-    </w:p>
-    <w:p>
-      <w:pPr>
-        <w:bidi w:val="1"/>
-        <w:jc w:val="right"/>
-        <w:textDirection w:val="lrTb"/>
-      </w:pPr>
-      <w:r>
-        <w:rPr>
-          <w:rFonts w:ascii="Calibri" w:hAnsi="Calibri"/>
-          <w:sz w:val="22"/>
-          <w:rtl w:val="1"/>
-          <w:rFonts w:cs="Calibri"/>
-          <w:szCs w:val="22"/>
-        </w:rPr>
-        <w:t>• C'' ‏(أوكتاف أعلى)‏</w:t>
-      </w:r>
-    </w:p>
-    <w:p>
-      <w:pPr>
-        <w:bidi w:val="1"/>
-        <w:jc w:val="right"/>
-        <w:textDirection w:val="lrTb"/>
-      </w:pPr>
-      <w:r>
-        <w:rPr>
-          <w:rFonts w:ascii="Calibri" w:hAnsi="Calibri"/>
-          <w:sz w:val="22"/>
-          <w:rtl w:val="1"/>
-          <w:rFonts w:cs="Calibri"/>
-          <w:szCs w:val="22"/>
-        </w:rPr>
-        <w:t>• C, ‏(أوكتاف أقل)‏</w:t>
+        <w:br/>
+        <w:t>- C' ‏(Middle C)‏ = C صغير</w:t>
+        <w:br/>
+        <w:t>- C'' ‏(أوكتاف أعلى)‏</w:t>
+        <w:br/>
+        <w:t>- C, ‏(أوكتاف أقل)‏</w:t>
       </w:r>
     </w:p>
     <w:p>
@@ -14773,118 +13493,23 @@
       <w:r>
         <w:rPr>
           <w:rFonts w:ascii="Calibri" w:hAnsi="Calibri"/>
-          <w:b/>
-          <w:color w:val="333333"/>
+          <w:b w:val="0"/>
           <w:sz w:val="22"/>
           <w:rtl w:val="1"/>
           <w:rFonts w:cs="Calibri"/>
           <w:szCs w:val="22"/>
         </w:rPr>
         <w:t>تمرين 1: إدخال سلم Do الكبير ‏(5 دقائق)‏</w:t>
-      </w:r>
-    </w:p>
-    <w:p>
-      <w:pPr>
-        <w:bidi w:val="1"/>
-        <w:jc w:val="right"/>
-        <w:textDirection w:val="lrTb"/>
-      </w:pPr>
-      <w:r>
-        <w:rPr>
-          <w:rFonts w:ascii="Calibri" w:hAnsi="Calibri"/>
-          <w:sz w:val="22"/>
-          <w:rtl w:val="1"/>
-          <w:rFonts w:cs="Calibri"/>
-          <w:szCs w:val="22"/>
-        </w:rPr>
-        <w:t>افتح Sibelius → Treble Clef → 4/4</w:t>
-      </w:r>
-    </w:p>
-    <w:p>
-      <w:pPr>
-        <w:bidi w:val="1"/>
-        <w:jc w:val="right"/>
-        <w:textDirection w:val="lrTb"/>
-      </w:pPr>
-      <w:r>
-        <w:rPr>
-          <w:rFonts w:ascii="Calibri" w:hAnsi="Calibri"/>
-          <w:sz w:val="22"/>
-          <w:rtl w:val="1"/>
-          <w:rFonts w:cs="Calibri"/>
-          <w:szCs w:val="22"/>
-        </w:rPr>
-        <w:t>اضغط N</w:t>
-      </w:r>
-    </w:p>
-    <w:p>
-      <w:pPr>
-        <w:bidi w:val="1"/>
-        <w:jc w:val="right"/>
-        <w:textDirection w:val="lrTb"/>
-      </w:pPr>
-      <w:r>
-        <w:rPr>
-          <w:rFonts w:ascii="Calibri" w:hAnsi="Calibri"/>
-          <w:sz w:val="22"/>
-          <w:rtl w:val="1"/>
-          <w:rFonts w:cs="Calibri"/>
-          <w:szCs w:val="22"/>
-        </w:rPr>
-        <w:t>اختر Noire ‏(اضغط 3 في Keypad)‏</w:t>
-      </w:r>
-    </w:p>
-    <w:p>
-      <w:pPr>
-        <w:bidi w:val="1"/>
-        <w:jc w:val="right"/>
-        <w:textDirection w:val="lrTb"/>
-      </w:pPr>
-      <w:r>
-        <w:rPr>
-          <w:rFonts w:ascii="Calibri" w:hAnsi="Calibri"/>
-          <w:sz w:val="22"/>
-          <w:rtl w:val="1"/>
-          <w:rFonts w:cs="Calibri"/>
-          <w:szCs w:val="22"/>
-        </w:rPr>
-        <w:t>اكتب: C D E F G A B C ‏(الحروف الإنجليزية)‏</w:t>
-      </w:r>
-    </w:p>
-    <w:p>
-      <w:pPr>
-        <w:bidi w:val="1"/>
-        <w:jc w:val="right"/>
-        <w:textDirection w:val="lrTb"/>
-      </w:pPr>
-      <w:r>
-        <w:rPr>
-          <w:rFonts w:ascii="Calibri" w:hAnsi="Calibri"/>
-          <w:sz w:val="22"/>
-          <w:rtl w:val="1"/>
-          <w:rFonts w:cs="Calibri"/>
-          <w:szCs w:val="22"/>
-        </w:rPr>
-        <w:t>استمع</w:t>
-      </w:r>
-    </w:p>
-    <w:p>
-      <w:pPr>
-        <w:bidi w:val="1"/>
-        <w:jc w:val="right"/>
-        <w:textDirection w:val="lrTb"/>
-      </w:pPr>
-      <w:r>
-        <w:rPr>
-          <w:rFonts w:ascii="Calibri" w:hAnsi="Calibri"/>
-          <w:b/>
-          <w:color w:val="333333"/>
-          <w:sz w:val="22"/>
-          <w:rtl w:val="1"/>
-          <w:rFonts w:cs="Calibri"/>
-          <w:szCs w:val="22"/>
-        </w:rPr>
-        <w:t>تمرين 2: إدخال بقيم مختلفة ‏(10 دقائق)‏</w:t>
+        <w:br/>
+        <w:t>1. افتح Sibelius → Treble Clef → 4/4</w:t>
+        <w:br/>
+        <w:t>2. اضغط N</w:t>
+        <w:br/>
+        <w:t>3. اختر Noire ‏(اضغط 3 في Keypad)‏</w:t>
+        <w:br/>
+        <w:t>4. اكتب: C D E F G A B C ‏(الحروف الإنجليزية)‏</w:t>
+        <w:br/>
+        <w:t>5. استمع</w:t>
       </w:r>
     </w:p>
     <w:p>
@@ -14902,6 +13527,8 @@
           <w:rFonts w:cs="Calibri"/>
           <w:szCs w:val="22"/>
         </w:rPr>
+        <w:t>تمرين 2: إدخال بقيم مختلفة ‏(10 دقائق)‏</w:t>
+        <w:br/>
         <w:t xml:space="preserve">ارفع يدك عن الماوس! </w:t>
       </w:r>
     </w:p>
@@ -14979,31 +13606,14 @@
       <w:r>
         <w:rPr>
           <w:rFonts w:ascii="Calibri" w:hAnsi="Calibri"/>
-          <w:b/>
-          <w:color w:val="333333"/>
+          <w:b w:val="0"/>
           <w:sz w:val="22"/>
           <w:rtl w:val="1"/>
           <w:rFonts w:cs="Calibri"/>
           <w:szCs w:val="22"/>
         </w:rPr>
         <w:t>تمرين 3: ألحان بسيطة ‏(10 دقائق)‏</w:t>
-      </w:r>
-    </w:p>
-    <w:p>
-      <w:pPr>
-        <w:bidi w:val="1"/>
-        <w:jc w:val="right"/>
-        <w:textDirection w:val="lrTb"/>
-      </w:pPr>
-      <w:r>
-        <w:rPr>
-          <w:rFonts w:ascii="Calibri" w:hAnsi="Calibri"/>
-          <w:b w:val="0"/>
-          <w:sz w:val="22"/>
-          <w:rtl w:val="1"/>
-          <w:rFonts w:cs="Calibri"/>
-          <w:szCs w:val="22"/>
-        </w:rPr>
+        <w:br/>
         <w:t>اكتب هذه الألحان باستخدام الحروف:</w:t>
       </w:r>
     </w:p>
@@ -15321,7 +13931,7 @@
           <w:szCs w:val="18"/>
         </w:rPr>
         <w:br/>
-        <w:t>#### تمرين 4: إدخال النوتة بالأسهم ‏(5 دقائق)‏</w:t>
+        <w:t>تمرين 4: إدخال النوتة بالأسهم ‏(5 دقائق)‏</w:t>
         <w:br/>
         <w:t>1. اضغط N → اختر Noire</w:t>
         <w:br/>
@@ -15361,7 +13971,7 @@
         <w:t>### 4. مراجعة وواجب | Review &amp; HW ‏(5 min)‏</w:t>
         <w:br/>
         <w:br/>
-        <w:t>#### أسئلة المراجعة</w:t>
+        <w:t>أسئلة المراجعة</w:t>
         <w:br/>
         <w:t>1. ما الحرف الذي يمثل النوتة Do في Sibelius؟</w:t>
         <w:br/>
@@ -15370,7 +13980,7 @@
         <w:t>3. كيف ترفع النوتة أوكتاف كامل عند الإدخال؟</w:t>
         <w:br/>
         <w:br/>
-        <w:t>#### الواجب المنزلي</w:t>
+        <w:t>الواجب المنزلي</w:t>
         <w:br/>
         <w:t>1. أنشئ نوتة جديدة ‏(Treble Clef, 4/4)‏</w:t>
         <w:br/>
@@ -15973,7 +14583,6 @@
         <w:rPr>
           <w:rFonts w:ascii="Calibri" w:hAnsi="Calibri"/>
           <w:b/>
-          <w:color w:val="333333"/>
           <w:sz w:val="22"/>
           <w:rtl w:val="1"/>
           <w:rFonts w:cs="Calibri"/>
@@ -16527,7 +15136,6 @@
         <w:rPr>
           <w:rFonts w:ascii="Calibri" w:hAnsi="Calibri"/>
           <w:b/>
-          <w:color w:val="333333"/>
           <w:sz w:val="22"/>
           <w:rtl w:val="1"/>
           <w:rFonts w:cs="Calibri"/>
@@ -16935,65 +15543,19 @@
       <w:r>
         <w:rPr>
           <w:rFonts w:ascii="Calibri" w:hAnsi="Calibri"/>
-          <w:b/>
-          <w:color w:val="333333"/>
+          <w:b w:val="0"/>
           <w:sz w:val="22"/>
           <w:rtl w:val="1"/>
           <w:rFonts w:cs="Calibri"/>
           <w:szCs w:val="22"/>
         </w:rPr>
         <w:t>ميزان 2/4</w:t>
-      </w:r>
-    </w:p>
-    <w:p>
-      <w:pPr>
-        <w:bidi w:val="1"/>
-        <w:jc w:val="right"/>
-        <w:textDirection w:val="lrTb"/>
-      </w:pPr>
-      <w:r>
-        <w:rPr>
-          <w:rFonts w:ascii="Calibri" w:hAnsi="Calibri"/>
-          <w:sz w:val="22"/>
-          <w:rtl w:val="1"/>
-          <w:rFonts w:cs="Calibri"/>
-          <w:szCs w:val="22"/>
-        </w:rPr>
-        <w:t>• دقتان في كل مازورة</w:t>
-      </w:r>
-    </w:p>
-    <w:p>
-      <w:pPr>
-        <w:bidi w:val="1"/>
-        <w:jc w:val="right"/>
-        <w:textDirection w:val="lrTb"/>
-      </w:pPr>
-      <w:r>
-        <w:rPr>
-          <w:rFonts w:ascii="Calibri" w:hAnsi="Calibri"/>
-          <w:sz w:val="22"/>
-          <w:rtl w:val="1"/>
-          <w:rFonts w:cs="Calibri"/>
-          <w:szCs w:val="22"/>
-        </w:rPr>
-        <w:t>• يستخدم في: الخبيتي، الملفوف، الهيوا</w:t>
-      </w:r>
-    </w:p>
-    <w:p>
-      <w:pPr>
-        <w:bidi w:val="1"/>
-        <w:jc w:val="right"/>
-        <w:textDirection w:val="lrTb"/>
-      </w:pPr>
-      <w:r>
-        <w:rPr>
-          <w:rFonts w:ascii="Calibri" w:hAnsi="Calibri"/>
-          <w:sz w:val="22"/>
-          <w:rtl w:val="1"/>
-          <w:rFonts w:cs="Calibri"/>
-          <w:szCs w:val="22"/>
-        </w:rPr>
-        <w:t>• يُعطي إحساساً سريعاً وخفيفاً</w:t>
+        <w:br/>
+        <w:t>- دقتان في كل مازورة</w:t>
+        <w:br/>
+        <w:t>- يستخدم في: الخبيتي، الملفوف، الهيوا</w:t>
+        <w:br/>
+        <w:t>- يُعطي إحساساً سريعاً وخفيفاً</w:t>
       </w:r>
     </w:p>
     <w:p>
@@ -17024,48 +15586,19 @@
       <w:r>
         <w:rPr>
           <w:rFonts w:ascii="Calibri" w:hAnsi="Calibri"/>
-          <w:b/>
-          <w:color w:val="333333"/>
+          <w:b w:val="0"/>
           <w:sz w:val="22"/>
           <w:rtl w:val="1"/>
           <w:rFonts w:cs="Calibri"/>
           <w:szCs w:val="22"/>
         </w:rPr>
         <w:t>تمرين 1: تحديد ونسخ ‏(10 دقائق)‏</w:t>
-      </w:r>
-    </w:p>
-    <w:p>
-      <w:pPr>
-        <w:bidi w:val="1"/>
-        <w:jc w:val="right"/>
-        <w:textDirection w:val="lrTb"/>
-      </w:pPr>
-      <w:r>
-        <w:rPr>
-          <w:rFonts w:ascii="Calibri" w:hAnsi="Calibri"/>
-          <w:sz w:val="22"/>
-          <w:rtl w:val="1"/>
-          <w:rFonts w:cs="Calibri"/>
-          <w:szCs w:val="22"/>
-        </w:rPr>
-        <w:t>افتح Sibelius → Treble Clef → 4/4</w:t>
-      </w:r>
-    </w:p>
-    <w:p>
-      <w:pPr>
-        <w:bidi w:val="1"/>
-        <w:jc w:val="right"/>
-        <w:textDirection w:val="lrTb"/>
-      </w:pPr>
-      <w:r>
-        <w:rPr>
-          <w:rFonts w:ascii="Calibri" w:hAnsi="Calibri"/>
-          <w:sz w:val="22"/>
-          <w:rtl w:val="1"/>
-          <w:rFonts w:cs="Calibri"/>
-          <w:szCs w:val="22"/>
-        </w:rPr>
-        <w:t>اكتب هذا النمط في أول مازورة:</w:t>
+        <w:br/>
+        <w:t>1. افتح Sibelius → Treble Clef → 4/4</w:t>
+        <w:br/>
+        <w:t>2. اكتب هذا النمط في أول مازورة:</w:t>
+        <w:br/>
+        <w:t>```</w:t>
       </w:r>
     </w:p>
     <w:p>
@@ -17084,7 +15617,20 @@
           <w:rFonts w:cs="Calibri"/>
           <w:szCs w:val="18"/>
         </w:rPr>
-        <w:t>| C D E F | ‏(كلها Noire)‏</w:t>
+        <w:t>3. طرق التحديد:</w:t>
+        <w:br/>
+        <w:t xml:space="preserve">   - انقر على المازورة ‏(المساحة الفارغة)‏ ← تظلل باللون الأزرق</w:t>
+        <w:br/>
+        <w:t xml:space="preserve">   - اضغط Ctrl+C ‏(نسخ)‏</w:t>
+        <w:br/>
+        <w:t xml:space="preserve">   - انقر على المازورة 2 ← Ctrl+V ‏(لصق)‏</w:t>
+        <w:br/>
+        <w:t>4. كرر حتى المازورة 8</w:t>
+        <w:br/>
+        <w:br/>
+        <w:t>تمرين 2: لصق متعدد ‏(10 دقائق)‏</w:t>
+        <w:br/>
+        <w:t>1. اكتب نمطاً من 4 نوتات في المازورة 1:</w:t>
       </w:r>
     </w:p>
     <w:p>
@@ -17096,141 +15642,19 @@
       <w:r>
         <w:rPr>
           <w:rFonts w:ascii="Calibri" w:hAnsi="Calibri"/>
+          <w:b w:val="0"/>
           <w:sz w:val="22"/>
           <w:rtl w:val="1"/>
           <w:rFonts w:cs="Calibri"/>
           <w:szCs w:val="22"/>
         </w:rPr>
-        <w:t>طرق التحديد:</w:t>
-      </w:r>
-    </w:p>
-    <w:p>
-      <w:pPr>
-        <w:bidi w:val="1"/>
-        <w:jc w:val="right"/>
-        <w:textDirection w:val="lrTb"/>
-      </w:pPr>
-      <w:r>
-        <w:rPr>
-          <w:rFonts w:ascii="Calibri" w:hAnsi="Calibri"/>
-          <w:sz w:val="22"/>
-          <w:rtl w:val="1"/>
-          <w:rFonts w:cs="Calibri"/>
-          <w:szCs w:val="22"/>
-        </w:rPr>
-        <w:t>• انقر على المازورة ‏(المساحة الفارغة)‏ ← تظلل باللون الأزرق</w:t>
-      </w:r>
-    </w:p>
-    <w:p>
-      <w:pPr>
-        <w:bidi w:val="1"/>
-        <w:jc w:val="right"/>
-        <w:textDirection w:val="lrTb"/>
-      </w:pPr>
-      <w:r>
-        <w:rPr>
-          <w:rFonts w:ascii="Calibri" w:hAnsi="Calibri"/>
-          <w:sz w:val="22"/>
-          <w:rtl w:val="1"/>
-          <w:rFonts w:cs="Calibri"/>
-          <w:szCs w:val="22"/>
-        </w:rPr>
-        <w:t>• اضغط Ctrl+C ‏(نسخ)‏</w:t>
-      </w:r>
-    </w:p>
-    <w:p>
-      <w:pPr>
-        <w:bidi w:val="1"/>
-        <w:jc w:val="right"/>
-        <w:textDirection w:val="lrTb"/>
-      </w:pPr>
-      <w:r>
-        <w:rPr>
-          <w:rFonts w:ascii="Calibri" w:hAnsi="Calibri"/>
-          <w:sz w:val="22"/>
-          <w:rtl w:val="1"/>
-          <w:rFonts w:cs="Calibri"/>
-          <w:szCs w:val="22"/>
-        </w:rPr>
-        <w:t>• انقر على المازورة 2 ← Ctrl+V ‏(لصق)‏</w:t>
-      </w:r>
-    </w:p>
-    <w:p>
-      <w:pPr>
-        <w:bidi w:val="1"/>
-        <w:jc w:val="right"/>
-        <w:textDirection w:val="lrTb"/>
-      </w:pPr>
-      <w:r>
-        <w:rPr>
-          <w:rFonts w:ascii="Calibri" w:hAnsi="Calibri"/>
-          <w:sz w:val="22"/>
-          <w:rtl w:val="1"/>
-          <w:rFonts w:cs="Calibri"/>
-          <w:szCs w:val="22"/>
-        </w:rPr>
-        <w:t>كرر حتى المازورة 8</w:t>
-      </w:r>
-    </w:p>
-    <w:p>
-      <w:pPr>
-        <w:bidi w:val="1"/>
-        <w:jc w:val="right"/>
-        <w:textDirection w:val="lrTb"/>
-      </w:pPr>
-      <w:r>
-        <w:rPr>
-          <w:rFonts w:ascii="Calibri" w:hAnsi="Calibri"/>
-          <w:b/>
-          <w:color w:val="333333"/>
-          <w:sz w:val="22"/>
-          <w:rtl w:val="1"/>
-          <w:rFonts w:cs="Calibri"/>
-          <w:szCs w:val="22"/>
-        </w:rPr>
-        <w:t>تمرين 2: لصق متعدد ‏(10 دقائق)‏</w:t>
-      </w:r>
-    </w:p>
-    <w:p>
-      <w:pPr>
-        <w:bidi w:val="1"/>
-        <w:jc w:val="right"/>
-        <w:textDirection w:val="lrTb"/>
-      </w:pPr>
-      <w:r>
-        <w:rPr>
-          <w:rFonts w:ascii="Calibri" w:hAnsi="Calibri"/>
-          <w:sz w:val="22"/>
-          <w:rtl w:val="1"/>
-          <w:rFonts w:cs="Calibri"/>
-          <w:szCs w:val="22"/>
-        </w:rPr>
-        <w:t>اكتب نمطاً من 4 نوتات في المازورة 1:</w:t>
-      </w:r>
-    </w:p>
-    <w:p>
-      <w:pPr>
-        <w:bidi w:val="1"/>
-        <w:jc w:val="right"/>
-        <w:textDirection w:val="lrTb"/>
-        <w:shd w:fill="F5F5F5" w:val="clear"/>
-      </w:pPr>
-      <w:r>
-        <w:rPr>
-          <w:rFonts w:ascii="Courier New" w:hAnsi="Courier New"/>
-          <w:color w:val="333333"/>
-          <w:sz w:val="18"/>
-          <w:rtl w:val="1"/>
-          <w:rFonts w:cs="Calibri"/>
-          <w:szCs w:val="18"/>
-        </w:rPr>
-        <w:t>| C  D  E  F  | G  G  A  A  | B  B  C  C  | ‏(Croche)‏</w:t>
-        <w:br/>
         <w:t>‏(اختر Croche من Keypad واكتب: C D E F)‏</w:t>
         <w:br/>
         <w:t>‏(دون تغيير القيمة: G G A A)‏</w:t>
         <w:br/>
         <w:t>‏(ثم B B C C)‏</w:t>
+        <w:br/>
+        <w:t>```</w:t>
       </w:r>
     </w:p>
     <w:p>
@@ -17310,224 +15734,31 @@
       <w:r>
         <w:rPr>
           <w:rFonts w:ascii="Calibri" w:hAnsi="Calibri"/>
-          <w:b/>
-          <w:color w:val="333333"/>
+          <w:b w:val="0"/>
           <w:sz w:val="22"/>
           <w:rtl w:val="1"/>
           <w:rFonts w:cs="Calibri"/>
           <w:szCs w:val="22"/>
         </w:rPr>
         <w:t>تمرين 3: استخدام التكرار مع 2/4 ‏(10 دقائق)‏</w:t>
-      </w:r>
-    </w:p>
-    <w:p>
-      <w:pPr>
-        <w:bidi w:val="1"/>
-        <w:jc w:val="right"/>
-        <w:textDirection w:val="lrTb"/>
-      </w:pPr>
-      <w:r>
-        <w:rPr>
-          <w:rFonts w:ascii="Calibri" w:hAnsi="Calibri"/>
-          <w:sz w:val="22"/>
-          <w:rtl w:val="1"/>
-          <w:rFonts w:cs="Calibri"/>
-          <w:szCs w:val="22"/>
-        </w:rPr>
-        <w:t>غير الميزان إلى 2/4 ‏(Notations → Time Signature → 2/4)‏</w:t>
-      </w:r>
-    </w:p>
-    <w:p>
-      <w:pPr>
-        <w:bidi w:val="1"/>
-        <w:jc w:val="right"/>
-        <w:textDirection w:val="lrTb"/>
-      </w:pPr>
-      <w:r>
-        <w:rPr>
-          <w:rFonts w:ascii="Calibri" w:hAnsi="Calibri"/>
-          <w:sz w:val="22"/>
-          <w:rtl w:val="1"/>
-          <w:rFonts w:cs="Calibri"/>
-          <w:szCs w:val="22"/>
-        </w:rPr>
-        <w:t>اكتب في أول مازورتين:</w:t>
-      </w:r>
-    </w:p>
-    <w:p>
-      <w:pPr>
-        <w:bidi w:val="1"/>
-        <w:jc w:val="right"/>
-        <w:textDirection w:val="lrTb"/>
-        <w:shd w:fill="F5F5F5" w:val="clear"/>
-      </w:pPr>
-      <w:r>
-        <w:rPr>
-          <w:rFonts w:ascii="Courier New" w:hAnsi="Courier New"/>
-          <w:color w:val="333333"/>
-          <w:sz w:val="18"/>
-          <w:rtl w:val="1"/>
-          <w:rFonts w:cs="Calibri"/>
-          <w:szCs w:val="18"/>
-        </w:rPr>
+        <w:br/>
+        <w:t>1. غير الميزان إلى 2/4 ‏(Notations → Time Signature → 2/4)‏</w:t>
+        <w:br/>
+        <w:t>2. اكتب في أول مازورتين:</w:t>
+        <w:br/>
+        <w:t>```</w:t>
+        <w:br/>
         <w:t>مازورة 1: | C Noire | D Noire |</w:t>
         <w:br/>
         <w:t>مازورة 2: | E Noire | F Noire |</w:t>
-      </w:r>
-    </w:p>
-    <w:p>
-      <w:pPr>
-        <w:bidi w:val="1"/>
-        <w:jc w:val="right"/>
-        <w:textDirection w:val="lrTb"/>
-      </w:pPr>
-      <w:r>
-        <w:rPr>
-          <w:rFonts w:ascii="Calibri" w:hAnsi="Calibri"/>
-          <w:sz w:val="22"/>
-          <w:rtl w:val="1"/>
-          <w:rFonts w:cs="Calibri"/>
-          <w:szCs w:val="22"/>
-        </w:rPr>
-        <w:t>حدد المازورتين ‏(من المازورة 1 للمازورة 2)‏</w:t>
-      </w:r>
-    </w:p>
-    <w:p>
-      <w:pPr>
-        <w:bidi w:val="1"/>
-        <w:jc w:val="right"/>
-        <w:textDirection w:val="lrTb"/>
-      </w:pPr>
-      <w:r>
-        <w:rPr>
-          <w:rFonts w:ascii="Calibri" w:hAnsi="Calibri"/>
-          <w:sz w:val="22"/>
-          <w:rtl w:val="1"/>
-          <w:rFonts w:cs="Calibri"/>
-          <w:szCs w:val="22"/>
-        </w:rPr>
-        <w:t>Ctrl+C ← Ctrl+V ثلاث مرات ‏(للوصول للمازورة 8)‏</w:t>
-      </w:r>
-    </w:p>
-    <w:p>
-      <w:pPr>
-        <w:bidi w:val="1"/>
-        <w:jc w:val="right"/>
-        <w:textDirection w:val="lrTb"/>
-      </w:pPr>
-      <w:r>
-        <w:rPr>
-          <w:rFonts w:ascii="Calibri" w:hAnsi="Calibri"/>
-          <w:sz w:val="22"/>
-          <w:rtl w:val="1"/>
-          <w:rFonts w:cs="Calibri"/>
-          <w:szCs w:val="22"/>
-        </w:rPr>
-        <w:t>الآن لديك 8 مازورات من اللحن</w:t>
-      </w:r>
-    </w:p>
-    <w:p>
-      <w:pPr>
-        <w:bidi w:val="1"/>
-        <w:jc w:val="right"/>
-        <w:textDirection w:val="lrTb"/>
-      </w:pPr>
-      <w:r>
-        <w:rPr>
-          <w:rFonts w:ascii="Calibri" w:hAnsi="Calibri"/>
-          <w:b/>
-          <w:color w:val="333333"/>
-          <w:sz w:val="22"/>
-          <w:rtl w:val="1"/>
-          <w:rFonts w:cs="Calibri"/>
-          <w:szCs w:val="22"/>
-        </w:rPr>
-        <w:t>تمرين 4: Paste as Cue ‏(5 دقائق)‏</w:t>
-      </w:r>
-    </w:p>
-    <w:p>
-      <w:pPr>
-        <w:bidi w:val="1"/>
-        <w:jc w:val="right"/>
-        <w:textDirection w:val="lrTb"/>
-      </w:pPr>
-      <w:r>
-        <w:rPr>
-          <w:rFonts w:ascii="Calibri" w:hAnsi="Calibri"/>
-          <w:sz w:val="22"/>
-          <w:rtl w:val="1"/>
-          <w:rFonts w:cs="Calibri"/>
-          <w:szCs w:val="22"/>
-        </w:rPr>
-        <w:t>اكتب لحناً قصيراً ‏(4 مازورات)‏</w:t>
-      </w:r>
-    </w:p>
-    <w:p>
-      <w:pPr>
-        <w:bidi w:val="1"/>
-        <w:jc w:val="right"/>
-        <w:textDirection w:val="lrTb"/>
-      </w:pPr>
-      <w:r>
-        <w:rPr>
-          <w:rFonts w:ascii="Calibri" w:hAnsi="Calibri"/>
-          <w:sz w:val="22"/>
-          <w:rtl w:val="1"/>
-          <w:rFonts w:cs="Calibri"/>
-          <w:szCs w:val="22"/>
-        </w:rPr>
-        <w:t>حدد اللحن بالكامل</w:t>
-      </w:r>
-    </w:p>
-    <w:p>
-      <w:pPr>
-        <w:bidi w:val="1"/>
-        <w:jc w:val="right"/>
-        <w:textDirection w:val="lrTb"/>
-      </w:pPr>
-      <w:r>
-        <w:rPr>
-          <w:rFonts w:ascii="Calibri" w:hAnsi="Calibri"/>
-          <w:sz w:val="22"/>
-          <w:rtl w:val="1"/>
-          <w:rFonts w:cs="Calibri"/>
-          <w:szCs w:val="22"/>
-        </w:rPr>
-        <w:t>Ctrl+C</w:t>
-      </w:r>
-    </w:p>
-    <w:p>
-      <w:pPr>
-        <w:bidi w:val="1"/>
-        <w:jc w:val="right"/>
-        <w:textDirection w:val="lrTb"/>
-      </w:pPr>
-      <w:r>
-        <w:rPr>
-          <w:rFonts w:ascii="Calibri" w:hAnsi="Calibri"/>
-          <w:sz w:val="22"/>
-          <w:rtl w:val="1"/>
-          <w:rFonts w:cs="Calibri"/>
-          <w:szCs w:val="22"/>
-        </w:rPr>
-        <w:t>انقر على المازورة التالية</w:t>
-      </w:r>
-    </w:p>
-    <w:p>
-      <w:pPr>
-        <w:bidi w:val="1"/>
-        <w:jc w:val="right"/>
-        <w:textDirection w:val="lrTb"/>
-      </w:pPr>
-      <w:r>
-        <w:rPr>
-          <w:rFonts w:ascii="Calibri" w:hAnsi="Calibri"/>
-          <w:sz w:val="22"/>
-          <w:rtl w:val="1"/>
-          <w:rFonts w:cs="Calibri"/>
-          <w:szCs w:val="22"/>
-        </w:rPr>
-        <w:t>Ctrl+Alt+V → اختر Paste as Cue</w:t>
+        <w:br/>
+        <w:t>```</w:t>
+        <w:br/>
+        <w:t>3. حدد المازورتين ‏(من المازورة 1 للمازورة 2)‏</w:t>
+        <w:br/>
+        <w:t>4. Ctrl+C ← Ctrl+V ثلاث مرات ‏(للوصول للمازورة 8)‏</w:t>
+        <w:br/>
+        <w:t>5. الآن لديك 8 مازورات من اللحن</w:t>
       </w:r>
     </w:p>
     <w:p>
@@ -17545,6 +15776,18 @@
           <w:rFonts w:cs="Calibri"/>
           <w:szCs w:val="22"/>
         </w:rPr>
+        <w:t>تمرين 4: Paste as Cue ‏(5 دقائق)‏</w:t>
+        <w:br/>
+        <w:t>1. اكتب لحناً قصيراً ‏(4 مازورات)‏</w:t>
+        <w:br/>
+        <w:t>2. حدد اللحن بالكامل</w:t>
+        <w:br/>
+        <w:t>3. Ctrl+C</w:t>
+        <w:br/>
+        <w:t>4. انقر على المازورة التالية</w:t>
+        <w:br/>
+        <w:t>5. Ctrl+Alt+V → اختر Paste as Cue</w:t>
+        <w:br/>
         <w:t xml:space="preserve">   ‏(Cue Notes أصغر حجماً، تُستخدم للإشارات)‏</w:t>
       </w:r>
     </w:p>
@@ -18200,14 +16443,19 @@
       <w:r>
         <w:rPr>
           <w:rFonts w:ascii="Calibri" w:hAnsi="Calibri"/>
-          <w:b/>
-          <w:color w:val="333333"/>
+          <w:b w:val="0"/>
           <w:sz w:val="22"/>
           <w:rtl w:val="1"/>
           <w:rFonts w:cs="Calibri"/>
           <w:szCs w:val="22"/>
         </w:rPr>
         <w:t>أسئلة المراجعة</w:t>
+        <w:br/>
+        <w:t>1. كيف تختار مازورة كاملة؟</w:t>
+        <w:br/>
+        <w:t>2. ما الفرق بين Ctrl+V و Ctrl+Alt+V؟</w:t>
+        <w:br/>
+        <w:t>3. كم دقة في ميزان 2/4؟</w:t>
       </w:r>
     </w:p>
     <w:p>
@@ -18219,184 +16467,27 @@
       <w:r>
         <w:rPr>
           <w:rFonts w:ascii="Calibri" w:hAnsi="Calibri"/>
-          <w:sz w:val="22"/>
-          <w:rtl w:val="1"/>
-          <w:rFonts w:cs="Calibri"/>
-          <w:szCs w:val="22"/>
-        </w:rPr>
-        <w:t>كيف تختار مازورة كاملة؟</w:t>
-      </w:r>
-    </w:p>
-    <w:p>
-      <w:pPr>
-        <w:bidi w:val="1"/>
-        <w:jc w:val="right"/>
-        <w:textDirection w:val="lrTb"/>
-      </w:pPr>
-      <w:r>
-        <w:rPr>
-          <w:rFonts w:ascii="Calibri" w:hAnsi="Calibri"/>
-          <w:sz w:val="22"/>
-          <w:rtl w:val="1"/>
-          <w:rFonts w:cs="Calibri"/>
-          <w:szCs w:val="22"/>
-        </w:rPr>
-        <w:t>ما الفرق بين Ctrl+V و Ctrl+Alt+V؟</w:t>
-      </w:r>
-    </w:p>
-    <w:p>
-      <w:pPr>
-        <w:bidi w:val="1"/>
-        <w:jc w:val="right"/>
-        <w:textDirection w:val="lrTb"/>
-      </w:pPr>
-      <w:r>
-        <w:rPr>
-          <w:rFonts w:ascii="Calibri" w:hAnsi="Calibri"/>
-          <w:sz w:val="22"/>
-          <w:rtl w:val="1"/>
-          <w:rFonts w:cs="Calibri"/>
-          <w:szCs w:val="22"/>
-        </w:rPr>
-        <w:t>كم دقة في ميزان 2/4؟</w:t>
-      </w:r>
-    </w:p>
-    <w:p>
-      <w:pPr>
-        <w:bidi w:val="1"/>
-        <w:jc w:val="right"/>
-        <w:textDirection w:val="lrTb"/>
-      </w:pPr>
-      <w:r>
-        <w:rPr>
-          <w:rFonts w:ascii="Calibri" w:hAnsi="Calibri"/>
-          <w:b/>
-          <w:color w:val="333333"/>
+          <w:b w:val="0"/>
           <w:sz w:val="22"/>
           <w:rtl w:val="1"/>
           <w:rFonts w:cs="Calibri"/>
           <w:szCs w:val="22"/>
         </w:rPr>
         <w:t>الواجب المنزلي</w:t>
-      </w:r>
-    </w:p>
-    <w:p>
-      <w:pPr>
-        <w:bidi w:val="1"/>
-        <w:jc w:val="right"/>
-        <w:textDirection w:val="lrTb"/>
-      </w:pPr>
-      <w:r>
-        <w:rPr>
-          <w:rFonts w:ascii="Calibri" w:hAnsi="Calibri"/>
-          <w:sz w:val="22"/>
-          <w:rtl w:val="1"/>
-          <w:rFonts w:cs="Calibri"/>
-          <w:szCs w:val="22"/>
-        </w:rPr>
-        <w:t>أنشئ نوتة جديدة في 2/4 ‏(Treble Clef)‏</w:t>
-      </w:r>
-    </w:p>
-    <w:p>
-      <w:pPr>
-        <w:bidi w:val="1"/>
-        <w:jc w:val="right"/>
-        <w:textDirection w:val="lrTb"/>
-      </w:pPr>
-      <w:r>
-        <w:rPr>
-          <w:rFonts w:ascii="Calibri" w:hAnsi="Calibri"/>
-          <w:sz w:val="22"/>
-          <w:rtl w:val="1"/>
-          <w:rFonts w:cs="Calibri"/>
-          <w:szCs w:val="22"/>
-        </w:rPr>
-        <w:t>اكتب نمطاً في أول مازورتين:</w:t>
-      </w:r>
-    </w:p>
-    <w:p>
-      <w:pPr>
-        <w:bidi w:val="1"/>
-        <w:jc w:val="right"/>
-        <w:textDirection w:val="lrTb"/>
-      </w:pPr>
-      <w:r>
-        <w:rPr>
-          <w:rFonts w:ascii="Calibri" w:hAnsi="Calibri"/>
-          <w:sz w:val="22"/>
-          <w:rtl w:val="1"/>
-          <w:rFonts w:cs="Calibri"/>
-          <w:szCs w:val="22"/>
-        </w:rPr>
-        <w:t>• مازورة 1: C ‏(Noire)‏ - E ‏(Noire)‏</w:t>
-      </w:r>
-    </w:p>
-    <w:p>
-      <w:pPr>
-        <w:bidi w:val="1"/>
-        <w:jc w:val="right"/>
-        <w:textDirection w:val="lrTb"/>
-      </w:pPr>
-      <w:r>
-        <w:rPr>
-          <w:rFonts w:ascii="Calibri" w:hAnsi="Calibri"/>
-          <w:sz w:val="22"/>
-          <w:rtl w:val="1"/>
-          <w:rFonts w:cs="Calibri"/>
-          <w:szCs w:val="22"/>
-        </w:rPr>
-        <w:t>• مازورة 2: G ‏(Noire)‏ - B ‏(Noire)‏</w:t>
-      </w:r>
-    </w:p>
-    <w:p>
-      <w:pPr>
-        <w:bidi w:val="1"/>
-        <w:jc w:val="right"/>
-        <w:textDirection w:val="lrTb"/>
-      </w:pPr>
-      <w:r>
-        <w:rPr>
-          <w:rFonts w:ascii="Calibri" w:hAnsi="Calibri"/>
-          <w:sz w:val="22"/>
-          <w:rtl w:val="1"/>
-          <w:rFonts w:cs="Calibri"/>
-          <w:szCs w:val="22"/>
-        </w:rPr>
-        <w:t>استخدم النسخ واللصق لملء 16 مازورة</w:t>
-      </w:r>
-    </w:p>
-    <w:p>
-      <w:pPr>
-        <w:bidi w:val="1"/>
-        <w:jc w:val="right"/>
-        <w:textDirection w:val="lrTb"/>
-      </w:pPr>
-      <w:r>
-        <w:rPr>
-          <w:rFonts w:ascii="Calibri" w:hAnsi="Calibri"/>
-          <w:sz w:val="22"/>
-          <w:rtl w:val="1"/>
-          <w:rFonts w:cs="Calibri"/>
-          <w:szCs w:val="22"/>
-        </w:rPr>
-        <w:t>عدّل المازورات 9-12 لتكون تنازلياً ‏(C B A G...)‏</w:t>
-      </w:r>
-    </w:p>
-    <w:p>
-      <w:pPr>
-        <w:bidi w:val="1"/>
-        <w:jc w:val="right"/>
-        <w:textDirection w:val="lrTb"/>
-      </w:pPr>
-      <w:r>
-        <w:rPr>
-          <w:rFonts w:ascii="Calibri" w:hAnsi="Calibri"/>
-          <w:sz w:val="22"/>
-          <w:rtl w:val="1"/>
-          <w:rFonts w:cs="Calibri"/>
-          <w:szCs w:val="22"/>
-        </w:rPr>
-        <w:t>احفظ باسم `Lesson7_CopyPaste.sib`</w:t>
+        <w:br/>
+        <w:t>1. أنشئ نوتة جديدة في 2/4 ‏(Treble Clef)‏</w:t>
+        <w:br/>
+        <w:t>2. اكتب نمطاً في أول مازورتين:</w:t>
+        <w:br/>
+        <w:t xml:space="preserve">   - مازورة 1: C ‏(Noire)‏ - E ‏(Noire)‏</w:t>
+        <w:br/>
+        <w:t xml:space="preserve">   - مازورة 2: G ‏(Noire)‏ - B ‏(Noire)‏</w:t>
+        <w:br/>
+        <w:t>3. استخدم النسخ واللصق لملء 16 مازورة</w:t>
+        <w:br/>
+        <w:t>4. عدّل المازورات 9-12 لتكون تنازلياً ‏(C B A G...)‏</w:t>
+        <w:br/>
+        <w:t>5. احفظ باسم `Lesson7_CopyPaste.sib`</w:t>
       </w:r>
     </w:p>
     <w:p>
@@ -19906,31 +17997,14 @@
       <w:r>
         <w:rPr>
           <w:rFonts w:ascii="Calibri" w:hAnsi="Calibri"/>
-          <w:b/>
-          <w:color w:val="333333"/>
+          <w:b w:val="0"/>
           <w:sz w:val="22"/>
           <w:rtl w:val="1"/>
           <w:rFonts w:cs="Calibri"/>
           <w:szCs w:val="22"/>
         </w:rPr>
         <w:t>الديناميكيات ‏(Dynamics)‏</w:t>
-      </w:r>
-    </w:p>
-    <w:p>
-      <w:pPr>
-        <w:bidi w:val="1"/>
-        <w:jc w:val="right"/>
-        <w:textDirection w:val="lrTb"/>
-      </w:pPr>
-      <w:r>
-        <w:rPr>
-          <w:rFonts w:ascii="Calibri" w:hAnsi="Calibri"/>
-          <w:b w:val="0"/>
-          <w:sz w:val="22"/>
-          <w:rtl w:val="1"/>
-          <w:rFonts w:cs="Calibri"/>
-          <w:szCs w:val="22"/>
-        </w:rPr>
+        <w:br/>
         <w:t>الديناميكيات هي مستوى علو الصوت في الموسيقى:</w:t>
       </w:r>
     </w:p>
@@ -20479,7 +18553,6 @@
         <w:rPr>
           <w:rFonts w:ascii="Calibri" w:hAnsi="Calibri"/>
           <w:b/>
-          <w:color w:val="333333"/>
           <w:sz w:val="22"/>
           <w:rtl w:val="1"/>
           <w:rFonts w:cs="Calibri"/>
@@ -20743,7 +18816,6 @@
         <w:rPr>
           <w:rFonts w:ascii="Calibri" w:hAnsi="Calibri"/>
           <w:b/>
-          <w:color w:val="333333"/>
           <w:sz w:val="22"/>
           <w:rtl w:val="1"/>
           <w:rFonts w:cs="Calibri"/>
@@ -21241,133 +19313,27 @@
       <w:r>
         <w:rPr>
           <w:rFonts w:ascii="Calibri" w:hAnsi="Calibri"/>
-          <w:b/>
-          <w:color w:val="333333"/>
+          <w:b w:val="0"/>
           <w:sz w:val="22"/>
           <w:rtl w:val="1"/>
           <w:rFonts w:cs="Calibri"/>
           <w:szCs w:val="22"/>
         </w:rPr>
         <w:t>تمرين 1: إضافة ديناميكيات ‏(10 دقائق)‏</w:t>
-      </w:r>
-    </w:p>
-    <w:p>
-      <w:pPr>
-        <w:bidi w:val="1"/>
-        <w:jc w:val="right"/>
-        <w:textDirection w:val="lrTb"/>
-      </w:pPr>
-      <w:r>
-        <w:rPr>
-          <w:rFonts w:ascii="Calibri" w:hAnsi="Calibri"/>
-          <w:sz w:val="22"/>
-          <w:rtl w:val="1"/>
-          <w:rFonts w:cs="Calibri"/>
-          <w:szCs w:val="22"/>
-        </w:rPr>
-        <w:t>افتح Sibelius → Treble Clef → 4/4</w:t>
-      </w:r>
-    </w:p>
-    <w:p>
-      <w:pPr>
-        <w:bidi w:val="1"/>
-        <w:jc w:val="right"/>
-        <w:textDirection w:val="lrTb"/>
-      </w:pPr>
-      <w:r>
-        <w:rPr>
-          <w:rFonts w:ascii="Calibri" w:hAnsi="Calibri"/>
-          <w:sz w:val="22"/>
-          <w:rtl w:val="1"/>
-          <w:rFonts w:cs="Calibri"/>
-          <w:szCs w:val="22"/>
-        </w:rPr>
-        <w:t>اكتب سلم Do كبير ‏(C D E F G A B C)‏ مع Noire</w:t>
-      </w:r>
-    </w:p>
-    <w:p>
-      <w:pPr>
-        <w:bidi w:val="1"/>
-        <w:jc w:val="right"/>
-        <w:textDirection w:val="lrTb"/>
-      </w:pPr>
-      <w:r>
-        <w:rPr>
-          <w:rFonts w:ascii="Calibri" w:hAnsi="Calibri"/>
-          <w:sz w:val="22"/>
-          <w:rtl w:val="1"/>
-          <w:rFonts w:cs="Calibri"/>
-          <w:szCs w:val="22"/>
-        </w:rPr>
-        <w:t>أضف ديناميكيات:</w:t>
-      </w:r>
-    </w:p>
-    <w:p>
-      <w:pPr>
-        <w:bidi w:val="1"/>
-        <w:jc w:val="right"/>
-        <w:textDirection w:val="lrTb"/>
-      </w:pPr>
-      <w:r>
-        <w:rPr>
-          <w:rFonts w:ascii="Calibri" w:hAnsi="Calibri"/>
-          <w:sz w:val="22"/>
-          <w:rtl w:val="1"/>
-          <w:rFonts w:cs="Calibri"/>
-          <w:szCs w:val="22"/>
-        </w:rPr>
-        <w:t>• اختر Tab: Notations → Dynamics</w:t>
-      </w:r>
-    </w:p>
-    <w:p>
-      <w:pPr>
-        <w:bidi w:val="1"/>
-        <w:jc w:val="right"/>
-        <w:textDirection w:val="lrTb"/>
-      </w:pPr>
-      <w:r>
-        <w:rPr>
-          <w:rFonts w:ascii="Calibri" w:hAnsi="Calibri"/>
-          <w:sz w:val="22"/>
-          <w:rtl w:val="1"/>
-          <w:rFonts w:cs="Calibri"/>
-          <w:szCs w:val="22"/>
-        </w:rPr>
-        <w:t>• اختر p وضع تحت أول نوتة ‏(C)‏</w:t>
-      </w:r>
-    </w:p>
-    <w:p>
-      <w:pPr>
-        <w:bidi w:val="1"/>
-        <w:jc w:val="right"/>
-        <w:textDirection w:val="lrTb"/>
-      </w:pPr>
-      <w:r>
-        <w:rPr>
-          <w:rFonts w:ascii="Calibri" w:hAnsi="Calibri"/>
-          <w:sz w:val="22"/>
-          <w:rtl w:val="1"/>
-          <w:rFonts w:cs="Calibri"/>
-          <w:szCs w:val="22"/>
-        </w:rPr>
-        <w:t>• اختر mf وضع تحت النوتة الخامسة ‏(G)‏</w:t>
-      </w:r>
-    </w:p>
-    <w:p>
-      <w:pPr>
-        <w:bidi w:val="1"/>
-        <w:jc w:val="right"/>
-        <w:textDirection w:val="lrTb"/>
-      </w:pPr>
-      <w:r>
-        <w:rPr>
-          <w:rFonts w:ascii="Calibri" w:hAnsi="Calibri"/>
-          <w:sz w:val="22"/>
-          <w:rtl w:val="1"/>
-          <w:rFonts w:cs="Calibri"/>
-          <w:szCs w:val="22"/>
-        </w:rPr>
-        <w:t>• اختر f وضع تحت النوتة الأخيرة ‏(C)‏</w:t>
+        <w:br/>
+        <w:t>1. افتح Sibelius → Treble Clef → 4/4</w:t>
+        <w:br/>
+        <w:t>2. اكتب سلم Do كبير ‏(C D E F G A B C)‏ مع Noire</w:t>
+        <w:br/>
+        <w:t>3. أضف ديناميكيات:</w:t>
+        <w:br/>
+        <w:t xml:space="preserve">   - اختر Tab: Notations → Dynamics</w:t>
+        <w:br/>
+        <w:t xml:space="preserve">   - اختر p وضع تحت أول نوتة ‏(C)‏</w:t>
+        <w:br/>
+        <w:t xml:space="preserve">   - اختر mf وضع تحت النوتة الخامسة ‏(G)‏</w:t>
+        <w:br/>
+        <w:t xml:space="preserve">   - اختر f وضع تحت النوتة الأخيرة ‏(C)‏</w:t>
       </w:r>
     </w:p>
     <w:p>
@@ -21403,52 +19369,23 @@
       <w:r>
         <w:rPr>
           <w:rFonts w:ascii="Calibri" w:hAnsi="Calibri"/>
-          <w:b/>
-          <w:color w:val="333333"/>
+          <w:b w:val="0"/>
           <w:sz w:val="22"/>
           <w:rtl w:val="1"/>
           <w:rFonts w:cs="Calibri"/>
           <w:szCs w:val="22"/>
         </w:rPr>
         <w:t>تمرين 2: Crescendo و Decrescendo ‏(10 دقائق)‏</w:t>
-      </w:r>
-    </w:p>
-    <w:p>
-      <w:pPr>
-        <w:bidi w:val="1"/>
-        <w:jc w:val="right"/>
-        <w:textDirection w:val="lrTb"/>
-      </w:pPr>
-      <w:r>
-        <w:rPr>
-          <w:rFonts w:ascii="Calibri" w:hAnsi="Calibri"/>
-          <w:sz w:val="22"/>
-          <w:rtl w:val="1"/>
-          <w:rFonts w:cs="Calibri"/>
-          <w:szCs w:val="22"/>
-        </w:rPr>
-        <w:t>اكتب:</w:t>
-      </w:r>
-    </w:p>
-    <w:p>
-      <w:pPr>
-        <w:bidi w:val="1"/>
-        <w:jc w:val="right"/>
-        <w:textDirection w:val="lrTb"/>
-        <w:shd w:fill="F5F5F5" w:val="clear"/>
-      </w:pPr>
-      <w:r>
-        <w:rPr>
-          <w:rFonts w:ascii="Courier New" w:hAnsi="Courier New"/>
-          <w:color w:val="333333"/>
-          <w:sz w:val="18"/>
-          <w:rtl w:val="1"/>
-          <w:rFonts w:cs="Calibri"/>
-          <w:szCs w:val="18"/>
-        </w:rPr>
+        <w:br/>
+        <w:t>1. اكتب:</w:t>
+        <w:br/>
+        <w:t>```</w:t>
+        <w:br/>
         <w:t>مازورة 1-2: C D E F | G A B C ‏(Noire)‏</w:t>
         <w:br/>
         <w:t>مازورة 3-4: C B A G | F E D C ‏(Noire)‏</w:t>
+        <w:br/>
+        <w:t>```</w:t>
       </w:r>
     </w:p>
     <w:p>
@@ -21596,54 +19533,25 @@
       <w:r>
         <w:rPr>
           <w:rFonts w:ascii="Calibri" w:hAnsi="Calibri"/>
-          <w:b/>
-          <w:color w:val="333333"/>
+          <w:b w:val="0"/>
           <w:sz w:val="22"/>
           <w:rtl w:val="1"/>
           <w:rFonts w:cs="Calibri"/>
           <w:szCs w:val="22"/>
         </w:rPr>
         <w:t>تمرين 3: علامات التعبير ‏(5 دقائق)‏</w:t>
-      </w:r>
-    </w:p>
-    <w:p>
-      <w:pPr>
-        <w:bidi w:val="1"/>
-        <w:jc w:val="right"/>
-        <w:textDirection w:val="lrTb"/>
-      </w:pPr>
-      <w:r>
-        <w:rPr>
-          <w:rFonts w:ascii="Calibri" w:hAnsi="Calibri"/>
-          <w:sz w:val="22"/>
-          <w:rtl w:val="1"/>
-          <w:rFonts w:cs="Calibri"/>
-          <w:szCs w:val="22"/>
-        </w:rPr>
-        <w:t>اكتب:</w:t>
-      </w:r>
-    </w:p>
-    <w:p>
-      <w:pPr>
-        <w:bidi w:val="1"/>
-        <w:jc w:val="right"/>
-        <w:textDirection w:val="lrTb"/>
-        <w:shd w:fill="F5F5F5" w:val="clear"/>
-      </w:pPr>
-      <w:r>
-        <w:rPr>
-          <w:rFonts w:ascii="Courier New" w:hAnsi="Courier New"/>
-          <w:color w:val="333333"/>
-          <w:sz w:val="18"/>
-          <w:rtl w:val="1"/>
-          <w:rFonts w:cs="Calibri"/>
-          <w:szCs w:val="18"/>
-        </w:rPr>
+        <w:br/>
+        <w:t>1. اكتب:</w:t>
+        <w:br/>
+        <w:t>```</w:t>
+        <w:br/>
         <w:t>مازورة 1: C D E F ‏(Noire)‏</w:t>
         <w:br/>
         <w:t>مازورة 2: G G G G ‏(Croche)‏</w:t>
         <w:br/>
         <w:t>مازورة 3: A B C - ‏(Noire)‏</w:t>
+        <w:br/>
+        <w:t>```</w:t>
       </w:r>
     </w:p>
     <w:p>
@@ -21757,31 +19665,14 @@
       <w:r>
         <w:rPr>
           <w:rFonts w:ascii="Calibri" w:hAnsi="Calibri"/>
-          <w:b/>
-          <w:color w:val="333333"/>
+          <w:b w:val="0"/>
           <w:sz w:val="22"/>
           <w:rtl w:val="1"/>
           <w:rFonts w:cs="Calibri"/>
           <w:szCs w:val="22"/>
         </w:rPr>
         <w:t>تمرين 4: مقطوعة ديناميكية ‏(5 دقائق)‏</w:t>
-      </w:r>
-    </w:p>
-    <w:p>
-      <w:pPr>
-        <w:bidi w:val="1"/>
-        <w:jc w:val="right"/>
-        <w:textDirection w:val="lrTb"/>
-      </w:pPr>
-      <w:r>
-        <w:rPr>
-          <w:rFonts w:ascii="Calibri" w:hAnsi="Calibri"/>
-          <w:b w:val="0"/>
-          <w:sz w:val="22"/>
-          <w:rtl w:val="1"/>
-          <w:rFonts w:cs="Calibri"/>
-          <w:szCs w:val="22"/>
-        </w:rPr>
+        <w:br/>
         <w:t>اجمع كل العناصر:</w:t>
         <w:br/>
         <w:t>```</w:t>
@@ -22449,14 +20340,19 @@
       <w:r>
         <w:rPr>
           <w:rFonts w:ascii="Calibri" w:hAnsi="Calibri"/>
-          <w:b/>
-          <w:color w:val="333333"/>
+          <w:b w:val="0"/>
           <w:sz w:val="22"/>
           <w:rtl w:val="1"/>
           <w:rFonts w:cs="Calibri"/>
           <w:szCs w:val="22"/>
         </w:rPr>
         <w:t>أسئلة المراجعة</w:t>
+        <w:br/>
+        <w:t>1. ما الفرق بين p و f في الديناميكيات؟</w:t>
+        <w:br/>
+        <w:t>2. كيف تضيف Crescendo بين مازورتين؟</w:t>
+        <w:br/>
+        <w:t>3. ما معنى Staccato؟</w:t>
       </w:r>
     </w:p>
     <w:p>
@@ -22468,218 +20364,31 @@
       <w:r>
         <w:rPr>
           <w:rFonts w:ascii="Calibri" w:hAnsi="Calibri"/>
-          <w:sz w:val="22"/>
-          <w:rtl w:val="1"/>
-          <w:rFonts w:cs="Calibri"/>
-          <w:szCs w:val="22"/>
-        </w:rPr>
-        <w:t>ما الفرق بين p و f في الديناميكيات؟</w:t>
-      </w:r>
-    </w:p>
-    <w:p>
-      <w:pPr>
-        <w:bidi w:val="1"/>
-        <w:jc w:val="right"/>
-        <w:textDirection w:val="lrTb"/>
-      </w:pPr>
-      <w:r>
-        <w:rPr>
-          <w:rFonts w:ascii="Calibri" w:hAnsi="Calibri"/>
-          <w:sz w:val="22"/>
-          <w:rtl w:val="1"/>
-          <w:rFonts w:cs="Calibri"/>
-          <w:szCs w:val="22"/>
-        </w:rPr>
-        <w:t>كيف تضيف Crescendo بين مازورتين؟</w:t>
-      </w:r>
-    </w:p>
-    <w:p>
-      <w:pPr>
-        <w:bidi w:val="1"/>
-        <w:jc w:val="right"/>
-        <w:textDirection w:val="lrTb"/>
-      </w:pPr>
-      <w:r>
-        <w:rPr>
-          <w:rFonts w:ascii="Calibri" w:hAnsi="Calibri"/>
-          <w:sz w:val="22"/>
-          <w:rtl w:val="1"/>
-          <w:rFonts w:cs="Calibri"/>
-          <w:szCs w:val="22"/>
-        </w:rPr>
-        <w:t>ما معنى Staccato؟</w:t>
-      </w:r>
-    </w:p>
-    <w:p>
-      <w:pPr>
-        <w:bidi w:val="1"/>
-        <w:jc w:val="right"/>
-        <w:textDirection w:val="lrTb"/>
-      </w:pPr>
-      <w:r>
-        <w:rPr>
-          <w:rFonts w:ascii="Calibri" w:hAnsi="Calibri"/>
-          <w:b/>
-          <w:color w:val="333333"/>
+          <w:b w:val="0"/>
           <w:sz w:val="22"/>
           <w:rtl w:val="1"/>
           <w:rFonts w:cs="Calibri"/>
           <w:szCs w:val="22"/>
         </w:rPr>
         <w:t>الواجب المنزلي</w:t>
-      </w:r>
-    </w:p>
-    <w:p>
-      <w:pPr>
-        <w:bidi w:val="1"/>
-        <w:jc w:val="right"/>
-        <w:textDirection w:val="lrTb"/>
-      </w:pPr>
-      <w:r>
-        <w:rPr>
-          <w:rFonts w:ascii="Calibri" w:hAnsi="Calibri"/>
-          <w:sz w:val="22"/>
-          <w:rtl w:val="1"/>
-          <w:rFonts w:cs="Calibri"/>
-          <w:szCs w:val="22"/>
-        </w:rPr>
-        <w:t>أنشئ نوتة جديدة ‏(Treble Clef, 4/4)‏</w:t>
-      </w:r>
-    </w:p>
-    <w:p>
-      <w:pPr>
-        <w:bidi w:val="1"/>
-        <w:jc w:val="right"/>
-        <w:textDirection w:val="lrTb"/>
-      </w:pPr>
-      <w:r>
-        <w:rPr>
-          <w:rFonts w:ascii="Calibri" w:hAnsi="Calibri"/>
-          <w:sz w:val="22"/>
-          <w:rtl w:val="1"/>
-          <w:rFonts w:cs="Calibri"/>
-          <w:szCs w:val="22"/>
-        </w:rPr>
-        <w:t>اكتب 8 مازورات:</w:t>
-      </w:r>
-    </w:p>
-    <w:p>
-      <w:pPr>
-        <w:bidi w:val="1"/>
-        <w:jc w:val="right"/>
-        <w:textDirection w:val="lrTb"/>
-      </w:pPr>
-      <w:r>
-        <w:rPr>
-          <w:rFonts w:ascii="Calibri" w:hAnsi="Calibri"/>
-          <w:sz w:val="22"/>
-          <w:rtl w:val="1"/>
-          <w:rFonts w:cs="Calibri"/>
-          <w:szCs w:val="22"/>
-        </w:rPr>
-        <w:t>• مازورة 1-2: لحن هادئ مع p</w:t>
-      </w:r>
-    </w:p>
-    <w:p>
-      <w:pPr>
-        <w:bidi w:val="1"/>
-        <w:jc w:val="right"/>
-        <w:textDirection w:val="lrTb"/>
-      </w:pPr>
-      <w:r>
-        <w:rPr>
-          <w:rFonts w:ascii="Calibri" w:hAnsi="Calibri"/>
-          <w:sz w:val="22"/>
-          <w:rtl w:val="1"/>
-          <w:rFonts w:cs="Calibri"/>
-          <w:szCs w:val="22"/>
-        </w:rPr>
-        <w:t>• مازورة 3-4: Crescendo + f</w:t>
-      </w:r>
-    </w:p>
-    <w:p>
-      <w:pPr>
-        <w:bidi w:val="1"/>
-        <w:jc w:val="right"/>
-        <w:textDirection w:val="lrTb"/>
-      </w:pPr>
-      <w:r>
-        <w:rPr>
-          <w:rFonts w:ascii="Calibri" w:hAnsi="Calibri"/>
-          <w:sz w:val="22"/>
-          <w:rtl w:val="1"/>
-          <w:rFonts w:cs="Calibri"/>
-          <w:szCs w:val="22"/>
-        </w:rPr>
-        <w:t>• مازورة 5-6: لحن قوي مع ff</w:t>
-      </w:r>
-    </w:p>
-    <w:p>
-      <w:pPr>
-        <w:bidi w:val="1"/>
-        <w:jc w:val="right"/>
-        <w:textDirection w:val="lrTb"/>
-      </w:pPr>
-      <w:r>
-        <w:rPr>
-          <w:rFonts w:ascii="Calibri" w:hAnsi="Calibri"/>
-          <w:sz w:val="22"/>
-          <w:rtl w:val="1"/>
-          <w:rFonts w:cs="Calibri"/>
-          <w:szCs w:val="22"/>
-        </w:rPr>
-        <w:t>• مازورة 7-8: Decrescendo + p ‏(نهاية هادئة)‏</w:t>
-      </w:r>
-    </w:p>
-    <w:p>
-      <w:pPr>
-        <w:bidi w:val="1"/>
-        <w:jc w:val="right"/>
-        <w:textDirection w:val="lrTb"/>
-      </w:pPr>
-      <w:r>
-        <w:rPr>
-          <w:rFonts w:ascii="Calibri" w:hAnsi="Calibri"/>
-          <w:sz w:val="22"/>
-          <w:rtl w:val="1"/>
-          <w:rFonts w:cs="Calibri"/>
-          <w:szCs w:val="22"/>
-        </w:rPr>
-        <w:t>أضف بعض علامات Staccato و Tenuto</w:t>
-      </w:r>
-    </w:p>
-    <w:p>
-      <w:pPr>
-        <w:bidi w:val="1"/>
-        <w:jc w:val="right"/>
-        <w:textDirection w:val="lrTb"/>
-      </w:pPr>
-      <w:r>
-        <w:rPr>
-          <w:rFonts w:ascii="Calibri" w:hAnsi="Calibri"/>
-          <w:sz w:val="22"/>
-          <w:rtl w:val="1"/>
-          <w:rFonts w:cs="Calibri"/>
-          <w:szCs w:val="22"/>
-        </w:rPr>
-        <w:t>احفظ باسم `Lesson8_Dynamics.sib`</w:t>
-      </w:r>
-    </w:p>
-    <w:p>
-      <w:pPr>
-        <w:bidi w:val="1"/>
-        <w:jc w:val="right"/>
-        <w:textDirection w:val="lrTb"/>
-      </w:pPr>
-      <w:r>
-        <w:rPr>
-          <w:rFonts w:ascii="Calibri" w:hAnsi="Calibri"/>
-          <w:sz w:val="22"/>
-          <w:rtl w:val="1"/>
-          <w:rFonts w:cs="Calibri"/>
-          <w:szCs w:val="22"/>
-        </w:rPr>
-        <w:t>استمع ولاحظ كيف تؤثر الديناميكيات على المشاعر</w:t>
+        <w:br/>
+        <w:t>1. أنشئ نوتة جديدة ‏(Treble Clef, 4/4)‏</w:t>
+        <w:br/>
+        <w:t>2. اكتب 8 مازورات:</w:t>
+        <w:br/>
+        <w:t xml:space="preserve">   - مازورة 1-2: لحن هادئ مع p</w:t>
+        <w:br/>
+        <w:t xml:space="preserve">   - مازورة 3-4: Crescendo + f</w:t>
+        <w:br/>
+        <w:t xml:space="preserve">   - مازورة 5-6: لحن قوي مع ff</w:t>
+        <w:br/>
+        <w:t xml:space="preserve">   - مازورة 7-8: Decrescendo + p ‏(نهاية هادئة)‏</w:t>
+        <w:br/>
+        <w:t>3. أضف بعض علامات Staccato و Tenuto</w:t>
+        <w:br/>
+        <w:t>4. احفظ باسم `Lesson8_Dynamics.sib`</w:t>
+        <w:br/>
+        <w:t>5. استمع ولاحظ كيف تؤثر الديناميكيات على المشاعر</w:t>
       </w:r>
     </w:p>
     <w:p>

</xml_diff>

<commit_message>
v3.3: Replace 'تطبيق العود/Oud Application' with 'تطبيق عملي/Practical Application' throughout all lessons + regenerate DOCX
</commit_message>
<xml_diff>
--- a/docx_output_v2/Sibelius-Semester1-Part1-Lessons-1-8.docx
+++ b/docx_output_v2/Sibelius-Semester1-Part1-Lessons-1-8.docx
@@ -1844,7 +1844,7 @@
           <w:rFonts w:cs="Calibri"/>
           <w:szCs w:val="28"/>
         </w:rPr>
-        <w:t>5. تطبيق العود | Oud Application</w:t>
+        <w:t>5. تطبيق عملي | Practical Application</w:t>
       </w:r>
     </w:p>
     <w:p>
@@ -1861,7 +1861,7 @@
           <w:rFonts w:cs="Calibri"/>
           <w:szCs w:val="22"/>
         </w:rPr>
-        <w:t>• لا يوجد تمرين عود محدد في هذا الدرس</w:t>
+        <w:t>• لا يوجد تمرين تطبيقي محدد في هذا الدرس</w:t>
       </w:r>
     </w:p>
     <w:p>
@@ -1878,7 +1878,7 @@
           <w:rFonts w:cs="Calibri"/>
           <w:szCs w:val="22"/>
         </w:rPr>
-        <w:t>• جرب عزف النوتات Do-Re-Mi-Fa-Sol على العود ببطء للتآلف مع الأصوات</w:t>
+        <w:t>• جرب عزف النوتات Do-Re-Mi-Fa-Sol ببطء للتآلف مع الأصوات</w:t>
       </w:r>
     </w:p>
     <w:p>
@@ -4537,7 +4537,7 @@
         <w:t>---</w:t>
         <w:br/>
         <w:br/>
-        <w:t>### 5. تطبيق العود | Oud Application</w:t>
+        <w:t>### 5. تطبيق عملي | Practical Application</w:t>
         <w:br/>
         <w:t>- تمرين: اعزف سلم Do الكبير باستخدام Blanche ‏(كل نوتة مدتها دقتان)‏:</w:t>
         <w:br/>
@@ -6922,9 +6922,9 @@
         <w:t>---</w:t>
         <w:br/>
         <w:br/>
-        <w:t>### 5. تطبيق العود | Oud Application</w:t>
-        <w:br/>
-        <w:t>- تمرين: اعزف النمط التالي على العود:</w:t>
+        <w:t>### 5. تطبيق عملي | Practical Application</w:t>
+        <w:br/>
+        <w:t>- تمرين: اعزف النمط التالي على آلتك الموسيقية:</w:t>
         <w:br/>
         <w:t xml:space="preserve">  - Do ‏(نقر)‏ – سكتة – Re ‏(نقر)‏ – سكتة – Mi ‏(نقر)‏ – سكتة</w:t>
         <w:br/>
@@ -8491,7 +8491,7 @@
         <w:t>---</w:t>
         <w:br/>
         <w:br/>
-        <w:t>### 5. تطبيق العود | Oud Application</w:t>
+        <w:t>### 5. تطبيق عملي | Practical Application</w:t>
         <w:br/>
         <w:t>- تمرين: اعزف سلم Do كبير ‏(Do-Re-Mi-Fa-Sol-La-Si-Do)‏ ثم:</w:t>
         <w:br/>
@@ -8499,7 +8499,7 @@
         <w:br/>
         <w:t xml:space="preserve">  - Re - Re♯</w:t>
         <w:br/>
-        <w:t>- لاحظ كيف يختلف الصوت على العود بسبب أنصاف الدرجات</w:t>
+        <w:t>- لاحظ كيف يختلف الصوت على آلتك الموسيقية بسبب أنصاف الدرجات</w:t>
         <w:br/>
         <w:br/>
         <w:t>---</w:t>
@@ -11321,7 +11321,7 @@
           <w:rFonts w:cs="Calibri"/>
           <w:szCs w:val="28"/>
         </w:rPr>
-        <w:t>5. تطبيق العود | Oud Application</w:t>
+        <w:t>5. تطبيق عملي | Practical Application</w:t>
       </w:r>
     </w:p>
     <w:p>
@@ -14002,9 +14002,9 @@
         <w:t>---</w:t>
         <w:br/>
         <w:br/>
-        <w:t>### 5. تطبيق العود | Oud Application</w:t>
-        <w:br/>
-        <w:t>- تمرين: اعزف سلم Do كبير على العود، وركز على أسماء النوتات بالإنجليزية:</w:t>
+        <w:t>### 5. تطبيق عملي | Practical Application</w:t>
+        <w:br/>
+        <w:t>- تمرين: اعزف سلم Do كبير على آلتك الموسيقية، وركز على أسماء النوتات بالإنجليزية:</w:t>
         <w:br/>
         <w:t xml:space="preserve">  - C ‏(Do)‏ – D ‏(Re)‏ – E ‏(Mi)‏ – F ‏(Fa)‏ – G ‏(Sol)‏ – A ‏(La)‏ – B ‏(Si)‏ – C ‏(Do)‏</w:t>
         <w:br/>
@@ -16506,7 +16506,7 @@
           <w:rFonts w:cs="Calibri"/>
           <w:szCs w:val="28"/>
         </w:rPr>
-        <w:t>5. تطبيق العود | Oud Application</w:t>
+        <w:t>5. تطبيق عملي | Practical Application</w:t>
       </w:r>
     </w:p>
     <w:p>
@@ -16523,7 +16523,7 @@
           <w:rFonts w:cs="Calibri"/>
           <w:szCs w:val="22"/>
         </w:rPr>
-        <w:t>• تمرين: اعزف النمط التالي على العود في 2/4:</w:t>
+        <w:t>• تمرين: اعزف النمط التالي على آلتك الموسيقية في 2/4:</w:t>
       </w:r>
     </w:p>
     <w:p>
@@ -20407,7 +20407,7 @@
           <w:rFonts w:cs="Calibri"/>
           <w:szCs w:val="28"/>
         </w:rPr>
-        <w:t>5. تطبيق العود | Oud Application</w:t>
+        <w:t>5. تطبيق عملي | Practical Application</w:t>
       </w:r>
     </w:p>
     <w:p>

</xml_diff>

<commit_message>
v3.4: Remove all markdown symbols (### and ---) from DOCX output + convert_to_docx_v2.py fix
</commit_message>
<xml_diff>
--- a/docx_output_v2/Sibelius-Semester1-Part1-Lessons-1-8.docx
+++ b/docx_output_v2/Sibelius-Semester1-Part1-Lessons-1-8.docx
@@ -4476,10 +4476,9 @@
         <w:t>4. استمع وشاهد كيف تختلف عن Noire</w:t>
         <w:br/>
         <w:br/>
-        <w:t>---</w:t>
-        <w:br/>
-        <w:br/>
-        <w:t>### 3. اختصارات Sibelius ‏(5 min)‏</w:t>
+        <w:br/>
+        <w:br/>
+        <w:t>3. اختصارات Sibelius ‏(5 min)‏</w:t>
         <w:br/>
         <w:br/>
         <w:t>| # | الاختصار | الوظيفة | Function |</w:t>
@@ -4500,10 +4499,9 @@
         <w:t>ملاحظة: في Keypad: 1=Ronde, 2=Blanche, 3=Noire, 4=Croche</w:t>
         <w:br/>
         <w:br/>
-        <w:t>---</w:t>
-        <w:br/>
-        <w:br/>
-        <w:t>### 4. مراجعة وواجب | Review &amp; HW ‏(5 min)‏</w:t>
+        <w:br/>
+        <w:br/>
+        <w:t>4. مراجعة وواجب | Review &amp; HW ‏(5 min)‏</w:t>
         <w:br/>
         <w:br/>
         <w:t>أسئلة المراجعة</w:t>
@@ -4534,10 +4532,9 @@
         <w:t>4. استمع للملف وأخبرني إذا كان الإيقاع صحيحاً</w:t>
         <w:br/>
         <w:br/>
-        <w:t>---</w:t>
-        <w:br/>
-        <w:br/>
-        <w:t>### 5. تطبيق عملي | Practical Application</w:t>
+        <w:br/>
+        <w:br/>
+        <w:t>5. تطبيق عملي | Practical Application</w:t>
         <w:br/>
         <w:t>- تمرين: اعزف سلم Do الكبير باستخدام Blanche ‏(كل نوتة مدتها دقتان)‏:</w:t>
         <w:br/>
@@ -4546,10 +4543,9 @@
         <w:t>- ركز على تساوي مدة كل نوتة</w:t>
         <w:br/>
         <w:br/>
-        <w:t>---</w:t>
-        <w:br/>
-        <w:br/>
-        <w:t>### 6. التقييم | Assessment</w:t>
+        <w:br/>
+        <w:br/>
+        <w:t>6. التقييم | Assessment</w:t>
         <w:br/>
         <w:t>| المعيار | الدرجة |</w:t>
         <w:br/>
@@ -4566,10 +4562,9 @@
         <w:t>| المجموع | /15 |</w:t>
         <w:br/>
         <w:br/>
-        <w:t>---</w:t>
-        <w:br/>
-        <w:br/>
-        <w:t>### 7. مفردات الدرس | Vocabulary</w:t>
+        <w:br/>
+        <w:br/>
+        <w:t>7. مفردات الدرس | Vocabulary</w:t>
         <w:br/>
         <w:br/>
         <w:t>| العربية | English |</w:t>
@@ -4593,10 +4588,9 @@
         <w:t>| قيمة النوتة | Note Value |</w:t>
         <w:br/>
         <w:br/>
-        <w:t>---</w:t>
-        <w:br/>
-        <w:br/>
-        <w:t>### 8. ملاحظات المدرس | Teacher Notes</w:t>
+        <w:br/>
+        <w:br/>
+        <w:t>8. ملاحظات المدرس | Teacher Notes</w:t>
         <w:br/>
         <w:t>- استخدم التشبيه بالكعكة: Ronde = كعكة كاملة، Blanche = نصف، Noire = ربع</w:t>
         <w:br/>
@@ -6864,10 +6858,9 @@
         <w:t>2. ضع خط تكرار في النهاية</w:t>
         <w:br/>
         <w:br/>
-        <w:t>---</w:t>
-        <w:br/>
-        <w:br/>
-        <w:t>### 3. اختصارات Sibelius ‏(5 min)‏</w:t>
+        <w:br/>
+        <w:br/>
+        <w:t>3. اختصارات Sibelius ‏(5 min)‏</w:t>
         <w:br/>
         <w:br/>
         <w:t>| # | الاختصار | الوظيفة | Function |</w:t>
@@ -6885,10 +6878,9 @@
         <w:t>| 5 | Ctrl+B | إضافة مازورة جديدة في النهاية | Add Bar at End |</w:t>
         <w:br/>
         <w:br/>
-        <w:t>---</w:t>
-        <w:br/>
-        <w:br/>
-        <w:t>### 4. مراجعة وواجب | Review &amp; HW ‏(5 min)‏</w:t>
+        <w:br/>
+        <w:br/>
+        <w:t>4. مراجعة وواجب | Review &amp; HW ‏(5 min)‏</w:t>
         <w:br/>
         <w:br/>
         <w:t>أسئلة المراجعة</w:t>
@@ -6919,10 +6911,9 @@
         <w:t>4. احفظ باسم `Lesson3_Rests.sib`</w:t>
         <w:br/>
         <w:br/>
-        <w:t>---</w:t>
-        <w:br/>
-        <w:br/>
-        <w:t>### 5. تطبيق عملي | Practical Application</w:t>
+        <w:br/>
+        <w:br/>
+        <w:t>5. تطبيق عملي | Practical Application</w:t>
         <w:br/>
         <w:t>- تمرين: اعزف النمط التالي على آلتك الموسيقية:</w:t>
         <w:br/>
@@ -6933,10 +6924,9 @@
         <w:t>- ركز على توقيت السكتات بدقة</w:t>
         <w:br/>
         <w:br/>
-        <w:t>---</w:t>
-        <w:br/>
-        <w:br/>
-        <w:t>### 6. التقييم | Assessment</w:t>
+        <w:br/>
+        <w:br/>
+        <w:t>6. التقييم | Assessment</w:t>
         <w:br/>
         <w:t>| المعيار | الدرجة |</w:t>
         <w:br/>
@@ -6953,10 +6943,9 @@
         <w:t>| المجموع | /15 |</w:t>
         <w:br/>
         <w:br/>
-        <w:t>---</w:t>
-        <w:br/>
-        <w:br/>
-        <w:t>### 7. مفردات الدرس | Vocabulary</w:t>
+        <w:br/>
+        <w:br/>
+        <w:t>7. مفردات الدرس | Vocabulary</w:t>
         <w:br/>
         <w:br/>
         <w:t>| العربية | English |</w:t>
@@ -6982,10 +6971,9 @@
         <w:t>| 3/4 ‏(ثلاثي)‏ | Triple Meter |</w:t>
         <w:br/>
         <w:br/>
-        <w:t>---</w:t>
-        <w:br/>
-        <w:br/>
-        <w:t>### 8. ملاحظات المدرس | Teacher Notes</w:t>
+        <w:br/>
+        <w:br/>
+        <w:t>8. ملاحظات المدرس | Teacher Notes</w:t>
         <w:br/>
         <w:t>- تأكد من أن الطالب يميز بين Ronde Rest ‏(معلقة تحت السطر الرابع)‏ و Blanche Rest ‏(جالسة فوق السطر الثالث)‏</w:t>
         <w:br/>
@@ -8433,10 +8421,9 @@
         <w:t>- هذا هو السلم الكروماتيكي ‏(Chromatic Scale)‏</w:t>
         <w:br/>
         <w:br/>
-        <w:t>---</w:t>
-        <w:br/>
-        <w:br/>
-        <w:t>### 3. اختصارات Sibelius ‏(5 min)‏</w:t>
+        <w:br/>
+        <w:br/>
+        <w:t>3. اختصارات Sibelius ‏(5 min)‏</w:t>
         <w:br/>
         <w:br/>
         <w:t>| # | الاختصار | الوظيفة | Function |</w:t>
@@ -8454,10 +8441,9 @@
         <w:t>| 5 | ↓ ‏(سهم تحت)‏ | خفض النوتة درجة في الوضع | Move Note Down |</w:t>
         <w:br/>
         <w:br/>
-        <w:t>---</w:t>
-        <w:br/>
-        <w:br/>
-        <w:t>### 4. مراجعة وواجب | Review &amp; HW ‏(5 min)‏</w:t>
+        <w:br/>
+        <w:br/>
+        <w:t>4. مراجعة وواجب | Review &amp; HW ‏(5 min)‏</w:t>
         <w:br/>
         <w:br/>
         <w:t>أسئلة المراجعة</w:t>
@@ -8488,10 +8474,9 @@
         <w:t>4. استمع وشاهد كيف تغير العلامات العرضية صوت النوتات</w:t>
         <w:br/>
         <w:br/>
-        <w:t>---</w:t>
-        <w:br/>
-        <w:br/>
-        <w:t>### 5. تطبيق عملي | Practical Application</w:t>
+        <w:br/>
+        <w:br/>
+        <w:t>5. تطبيق عملي | Practical Application</w:t>
         <w:br/>
         <w:t>- تمرين: اعزف سلم Do كبير ‏(Do-Re-Mi-Fa-Sol-La-Si-Do)‏ ثم:</w:t>
         <w:br/>
@@ -8502,10 +8487,9 @@
         <w:t>- لاحظ كيف يختلف الصوت على آلتك الموسيقية بسبب أنصاف الدرجات</w:t>
         <w:br/>
         <w:br/>
-        <w:t>---</w:t>
-        <w:br/>
-        <w:br/>
-        <w:t>### 6. التقييم | Assessment</w:t>
+        <w:br/>
+        <w:br/>
+        <w:t>6. التقييم | Assessment</w:t>
         <w:br/>
         <w:t>| المعيار | الدرجة |</w:t>
         <w:br/>
@@ -8522,10 +8506,9 @@
         <w:t>| المجموع | /15 |</w:t>
         <w:br/>
         <w:br/>
-        <w:t>---</w:t>
-        <w:br/>
-        <w:br/>
-        <w:t>### 7. مفردات الدرس | Vocabulary</w:t>
+        <w:br/>
+        <w:br/>
+        <w:t>7. مفردات الدرس | Vocabulary</w:t>
         <w:br/>
         <w:br/>
         <w:t>| العربية | English |</w:t>
@@ -8549,10 +8532,9 @@
         <w:t>| سلم كروماتيكي | Chromatic Scale |</w:t>
         <w:br/>
         <w:br/>
-        <w:t>---</w:t>
-        <w:br/>
-        <w:br/>
-        <w:t>### 8. ملاحظات المدرس | Teacher Notes</w:t>
+        <w:br/>
+        <w:br/>
+        <w:t>8. ملاحظات المدرس | Teacher Notes</w:t>
         <w:br/>
         <w:t>- اشرح مفهوم نصف الدرجة باستخدام البيانو: لا يوجد مفتاح أسود بين Mi-Fa و Si-Do</w:t>
         <w:br/>
@@ -13944,10 +13926,9 @@
         <w:t>5. جرب: اكتب C ثم اضغط ↑ حتى تصل إلى G</w:t>
         <w:br/>
         <w:br/>
-        <w:t>---</w:t>
-        <w:br/>
-        <w:br/>
-        <w:t>### 3. اختصارات Sibelius ‏(5 min)‏</w:t>
+        <w:br/>
+        <w:br/>
+        <w:t>3. اختصارات Sibelius ‏(5 min)‏</w:t>
         <w:br/>
         <w:br/>
         <w:t>| # | الاختصار | الوظيفة | Function |</w:t>
@@ -13965,10 +13946,9 @@
         <w:t>| 5 | Ctrl+↑ / Ctrl+↓ | تغيير ارتفاع النوتة أوكتاف | Octave Up/Down |</w:t>
         <w:br/>
         <w:br/>
-        <w:t>---</w:t>
-        <w:br/>
-        <w:br/>
-        <w:t>### 4. مراجعة وواجب | Review &amp; HW ‏(5 min)‏</w:t>
+        <w:br/>
+        <w:br/>
+        <w:t>4. مراجعة وواجب | Review &amp; HW ‏(5 min)‏</w:t>
         <w:br/>
         <w:br/>
         <w:t>أسئلة المراجعة</w:t>
@@ -13999,10 +13979,9 @@
         <w:t>4. التحدي: حاول كتابة كل شيء بدون لمس الماوس!</w:t>
         <w:br/>
         <w:br/>
-        <w:t>---</w:t>
-        <w:br/>
-        <w:br/>
-        <w:t>### 5. تطبيق عملي | Practical Application</w:t>
+        <w:br/>
+        <w:br/>
+        <w:t>5. تطبيق عملي | Practical Application</w:t>
         <w:br/>
         <w:t>- تمرين: اعزف سلم Do كبير على آلتك الموسيقية، وركز على أسماء النوتات بالإنجليزية:</w:t>
         <w:br/>
@@ -14011,10 +13990,9 @@
         <w:t>- تعلم ربط اسم الحرف بالصوت</w:t>
         <w:br/>
         <w:br/>
-        <w:t>---</w:t>
-        <w:br/>
-        <w:br/>
-        <w:t>### 6. التقييم | Assessment</w:t>
+        <w:br/>
+        <w:br/>
+        <w:t>6. التقييم | Assessment</w:t>
         <w:br/>
         <w:t>| المعيار | الدرجة |</w:t>
         <w:br/>
@@ -14031,10 +14009,9 @@
         <w:t>| المجموع | /15 |</w:t>
         <w:br/>
         <w:br/>
-        <w:t>---</w:t>
-        <w:br/>
-        <w:br/>
-        <w:t>### 7. مفردات الدرس | Vocabulary</w:t>
+        <w:br/>
+        <w:br/>
+        <w:t>7. مفردات الدرس | Vocabulary</w:t>
         <w:br/>
         <w:br/>
         <w:t>| العربية | English |</w:t>
@@ -14052,10 +14029,9 @@
         <w:t>| علامة إدخال | Input Cursor |</w:t>
         <w:br/>
         <w:br/>
-        <w:t>---</w:t>
-        <w:br/>
-        <w:br/>
-        <w:t>### 8. ملاحظات المدرس | Teacher Notes</w:t>
+        <w:br/>
+        <w:br/>
+        <w:t>8. ملاحظات المدرس | Teacher Notes</w:t>
         <w:br/>
         <w:t>- هذا الدرس مهم جداً لزيادة سرعة الطالب</w:t>
         <w:br/>

</xml_diff>

<commit_message>
v4.1: Remove specific instrument references (عود -> آلتك الموسيقية) in all lessons except L53 + regenerate DOCX
</commit_message>
<xml_diff>
--- a/docx_output_v2/Sibelius-Semester1-Part1-Lessons-1-8.docx
+++ b/docx_output_v2/Sibelius-Semester1-Part1-Lessons-1-8.docx
@@ -1242,7 +1242,7 @@
                 <w:rFonts w:cs="Calibri"/>
                 <w:szCs w:val="18"/>
               </w:rPr>
-              <w:t>العودة إلى أداة الاختيار ‏(Selection Tool)‏</w:t>
+              <w:t>آلتك الموسيقية إلى أداة الاختيار ‏(Selection Tool)‏</w:t>
             </w:r>
           </w:p>
         </w:tc>
@@ -1492,7 +1492,7 @@
           <w:rFonts w:cs="Calibri"/>
           <w:szCs w:val="22"/>
         </w:rPr>
-        <w:t>• اختر آلتك الموسيقية ‏(عود، قانون، بيانو، كمان...)‏ واعزف سلم ‏(Scale)‏ واحداً تعرفه ببطء، محاولاً قراءة اسم كل نغمة كتابةً في ذهنك كما لو كنت تدوّنها على النوتة.</w:t>
+        <w:t>• اختر آلتك الموسيقية ‏(آلة، قانون، بيانو، كمان...)‏ واعزف سلم ‏(Scale)‏ واحداً تعرفه ببطء، محاولاً قراءة اسم كل نغمة كتابةً في ذهنك كما لو كنت تدوّنها على النوتة.</w:t>
       </w:r>
     </w:p>
     <w:p>
@@ -7452,7 +7452,7 @@
           <w:rFonts w:cs="Calibri"/>
           <w:szCs w:val="22"/>
         </w:rPr>
-        <w:t>اختيار الآلات ‏(Instruments)‏: تختار الآلات الموسيقية التي تريدها في النوتة. يمكن إضافة آلات متعددة مثل بيانو، كمان، عود، قانون... إلخ.</w:t>
+        <w:t>اختيار الآلات ‏(Instruments)‏: تختار الآلات الموسيقية التي تريدها في النوتة. يمكن إضافة آلات متعددة مثل بيانو، كمان، آلة، قانون... إلخ.</w:t>
       </w:r>
     </w:p>
     <w:p>
@@ -8333,7 +8333,7 @@
         <w:br/>
         <w:t>1. اكتب تمرين رقم ‏(4)‏ في كتاب الصولفيج المقرر</w:t>
         <w:br/>
-        <w:t>2. أنشئ نوتة جديدة في Sibelius بالإعدادات التالية: آلة عود ‏(Oud)‏ — مفتاح C Major — ميزان 3/4 — عنوان "تمرين عود". احفظ الملف باسم `Oud_Exercise.sib`.</w:t>
+        <w:t>2. أنشئ نوتة جديدة في Sibelius بالإعدادات التالية: آلة آلة ‏(Oud)‏ — مفتاح C Major — ميزان 3/4 — عنوان "تمرين آلة". احفظ الملف باسم `Oud_Exercise.sib`.</w:t>
         <w:br/>
         <w:t>3. ارجع إلى الدرس السابق ‏(رقم 3)‏ وأجب: ما اسم إصدار Sibelius الذي تستخدمه حاليّاً؟</w:t>
       </w:r>
@@ -9345,7 +9345,7 @@
           <w:rFonts w:cs="Calibri"/>
           <w:szCs w:val="22"/>
         </w:rPr>
-        <w:t>• تذكير: اشرح للطلاب أن Sibelius يدعم آلة العود ‏(Oud)‏ ضمن قائمة الآلات الشرقية ‏(Arabic / Oriental Instruments)‏. قد تحتاج إلى تفعيلها من File &gt; Preferences &gt; Instruments.</w:t>
+        <w:t>• تذكير: اشرح للطلاب أن Sibelius يدعم آلة آلتك الموسيقية ‏(Oud)‏ ضمن قائمة الآلات الشرقية ‏(Arabic / Oriental Instruments)‏. قد تحتاج إلى تفعيلها من File &gt; Preferences &gt; Instruments.</w:t>
       </w:r>
     </w:p>
     <w:p>
@@ -11197,7 +11197,7 @@
           <w:rFonts w:cs="Calibri"/>
           <w:szCs w:val="22"/>
         </w:rPr>
-        <w:t>• إذا كنت تعزف على آلة لحنية ‏(عود، كمان، ناي...)‏، حاول عزف الجملة نفسها بدءاً من نغمة مختلفة ‏(مثلاً G4 بدلاً من E4)‏. لاحظ كيف يتغيّر اللحن!</w:t>
+        <w:t>• إذا كنت تعزف على آلة لحنية ‏(آلة، كمان، ناي...)‏، حاول عزف الجملة نفسها بدءاً من نغمة مختلفة ‏(مثلاً G4 بدلاً من E4)‏. لاحظ كيف يتغيّر اللحن!</w:t>
       </w:r>
     </w:p>
     <w:p>
@@ -12751,7 +12751,7 @@
           <w:rFonts w:cs="Calibri"/>
           <w:szCs w:val="22"/>
         </w:rPr>
-        <w:t>• يمكن جعل صوت العود في اليمين والكمان في اليسار ‏(Pan)‏.</w:t>
+        <w:t>• يمكن جعل صوت آلتك الموسيقية في اليمين والكمان في اليسار ‏(Pan)‏.</w:t>
       </w:r>
     </w:p>
     <w:p>

</xml_diff>